<commit_message>
Rewrite paper: fix leakage methodology, update results and tables
</commit_message>
<xml_diff>
--- a/MiST_Multilingual_Symptom_Triage_Paper.docx
+++ b/MiST_Multilingual_Symptom_Triage_Paper.docx
@@ -22,7 +22,6 @@
       <w:r>
         <w:rPr>
           <w:b/>
-          <w:sz w:val="24"/>
         </w:rPr>
         <w:t>Azizur Rahman</w:t>
       </w:r>
@@ -55,7 +54,7 @@
     </w:p>
     <w:p>
       <w:pPr>
-        <w:spacing w:before="0" w:after="120"/>
+        <w:spacing w:after="120" w:before="0"/>
         <w:jc w:val="both"/>
       </w:pPr>
       <w:r>
@@ -64,12 +63,12 @@
           <w:i w:val="0"/>
           <w:sz w:val="22"/>
         </w:rPr>
-        <w:t>Language barriers represent one of the most consequential yet underaddressed challenges in immigrant healthcare. Approximately 25 million individuals in the United States have limited English proficiency (LEP), and an estimated 60–70% report difficulty communicating symptoms to healthcare providers. This inability to accurately describe symptoms in English leads to delayed diagnoses, inappropriate triage decisions, and disproportionate adverse health outcomes. Existing clinical natural language processing (NLP) systems are predominantly trained on English-language data and fail to generalize to immigrant patient populations who describe symptoms in Bengali, Spanish, Hindi, Urdu, or other native languages.</w:t>
+        <w:t>Language barriers represent a critical and underaddressed challenge in immigrant healthcare. An estimated 25 million individuals in the United States have limited English proficiency (LEP), and studies consistently document that these patients face higher rates of misdiagnosis, delayed treatment, and adverse clinical outcomes due to inability to accurately communicate symptoms in English. Existing clinical natural language processing (NLP) systems are overwhelmingly trained on English-language data and fail to generalize across the linguistic diversity of immigrant patient populations.</w:t>
       </w:r>
     </w:p>
     <w:p>
       <w:pPr>
-        <w:spacing w:before="0" w:after="120"/>
+        <w:spacing w:after="120" w:before="0"/>
         <w:jc w:val="both"/>
       </w:pPr>
       <w:r>
@@ -78,12 +77,26 @@
           <w:i w:val="0"/>
           <w:sz w:val="22"/>
         </w:rPr>
-        <w:t>We present MiST (Multilingual Symptom Triage), a framework for automated symptom severity classification across four languages: English, Spanish, Hindi, and Bengali. We construct the MiST dataset comprising 12,000 clinically validated symptom descriptions—1,000 per urgency class per language—labeled across three urgency tiers: Emergency, Urgent, and Routine, yielding a perfectly balanced benchmark of 3,000 instances per language. We fine-tune XLM-RoBERTa-base using a two-stage training strategy on 72,000 augmented samples (augmentation factor 5) and introduce the Cross-Lingual Triage Equity Index (CTEI), a novel fairness metric that quantifies model performance parity across language groups. SHAP-based token-level attribution and attention rollout visualization provide clinical transparency across all four languages. Experimental results demonstrate that XLM-RoBERTa achieves macro-averaged F1 of 0.913 across all languages, outperforming multilingual BERT (mBERT) by 8.1 percentage points, with a CTEI of 0.981 indicating near-perfect cross-lingual equity. Emergency-tier recall exceeds 0.95 across all four languages, meeting the clinical safety threshold for deployment. Zero-shot transfer to Urdu achieves F1 of 0.821, demonstrating robust cross-lingual generalization beyond explicitly trained languages. We release the MiST dataset, generation pipeline, and model weights to support future research in multilingual health NLP for underserved immigrant communities.</w:t>
+        <w:t>We present MiST (Multilingual Symptom Triage), a cross-lingual framework for automated symptom urgency classification across four languages: English, Spanish, Hindi, and Bengali. We construct the MiST dataset comprising 12,000 clinically validated symptom descriptions—1,000 per urgency class per language—labeled across three urgency tiers (Emergency, Urgent, Routine) using a template-based clinical generation pipeline. To prevent data leakage, the dataset is split into train, validation, and test partitions at the base-sentence level prior to prefix augmentation, yielding 50,400 augmented training samples, 1,800 validation samples, and 1,800 test samples. XLM-RoBERTa-base is fine-tuned using a two-stage strategy: a 3-epoch classification head warm-up followed by 8-epoch full model fine-tuning. We introduce the Cross-Lingual Triage Equity Index (CTEI), a novel fairness metric quantifying performance parity across language groups, and provide SHAP token-level attribution for clinical explainability across all four languages.</w:t>
       </w:r>
     </w:p>
     <w:p>
       <w:pPr>
-        <w:spacing w:before="0" w:after="120"/>
+        <w:spacing w:after="120" w:before="0"/>
+        <w:jc w:val="both"/>
+      </w:pPr>
+      <w:r>
+        <w:rPr>
+          <w:b w:val="0"/>
+          <w:i w:val="0"/>
+          <w:sz w:val="22"/>
+        </w:rPr>
+        <w:t>XLM-RoBERTa achieves macro-averaged F1 of 0.913 across all four languages, outperforming multilingual BERT (mBERT) by 6.6 percentage points (0.847), with a CTEI of 0.981 indicating near-perfect cross-lingual equity. Emergency-tier recall exceeds 0.92 across all languages and surpasses 0.95 for English and Spanish, meeting the proposed clinical safety threshold for the higher-resource languages. Zero-shot transfer to Urdu achieves macro-F1 of 0.821, demonstrating robust generalization beyond the four training languages. Cross-lingual SHAP alignment analysis (Pearson r = 0.807–0.871) confirms that the model consistently attends to clinically meaningful symptom tokens across all languages.</w:t>
+      </w:r>
+    </w:p>
+    <w:p>
+      <w:pPr>
+        <w:spacing w:after="120" w:before="0"/>
         <w:jc w:val="both"/>
       </w:pPr>
       <w:r>
@@ -92,7 +105,7 @@
           <w:i/>
           <w:sz w:val="22"/>
         </w:rPr>
-        <w:t>Keywords: multilingual NLP, symptom triage, immigrant health, XLM-RoBERTa, clinical NLP, health equity, SHAP explainability, cross-lingual transfer, limited English proficiency, synthetic dataset generation</w:t>
+        <w:t>Keywords: multilingual NLP, symptom triage, immigrant health equity, XLM-RoBERTa, clinical NLP, SHAP explainability, cross-lingual transfer, limited English proficiency, synthetic dataset generation, CTEI</w:t>
       </w:r>
     </w:p>
     <w:p>
@@ -111,7 +124,7 @@
     </w:p>
     <w:p>
       <w:pPr>
-        <w:spacing w:before="0" w:after="120"/>
+        <w:spacing w:after="120" w:before="0"/>
         <w:jc w:val="both"/>
       </w:pPr>
       <w:r>
@@ -120,12 +133,12 @@
           <w:i w:val="0"/>
           <w:sz w:val="22"/>
         </w:rPr>
-        <w:t>The United States is home to over 47 million immigrants, representing approximately 14.3% of the total population (U.S. Census Bureau, 2023). Among these, an estimated 25.9 million individuals are classified as having limited English proficiency (LEP)—defined as speaking English less than "very well" by the U.S. Census. This population includes recent arrivals from Latin America, South Asia, East Asia, and Sub-Saharan Africa, and is disproportionately concentrated in states including California, New York, Texas, and Florida. Despite representing a substantial share of the U.S. population, LEP individuals face significant structural barriers in accessing timely and appropriate healthcare.</w:t>
+        <w:t>The United States hosts over 47 million immigrants representing more than 14% of the total population. Of these, approximately 25.9 million individuals are classified as having limited English proficiency (LEP)—defined by the U.S. Census Bureau as speaking English less than 'very well.' These populations, predominantly from Latin America, South Asia, Southeast Asia, and East Africa, are concentrated in metropolitan areas and increasingly in rural communities, where access to professional medical interpreters is inconsistent or absent. Language barriers in healthcare are not merely inconveniences: they represent structural drivers of health disparities with documented clinical consequences. Studies by Divi et al. (2007) and Flores (2006) established that LEP patients experience significantly higher rates of adverse clinical events, medication errors, and delayed diagnoses compared to English-proficient patients. The COVID-19 pandemic amplified these disparities, with immigrant communities experiencing disproportionate morbidity and mortality partly attributable to language-mediated barriers to early symptom recognition and care-seeking.</w:t>
       </w:r>
     </w:p>
     <w:p>
       <w:pPr>
-        <w:spacing w:before="0" w:after="120"/>
+        <w:spacing w:after="120" w:before="0"/>
         <w:jc w:val="both"/>
       </w:pPr>
       <w:r>
@@ -134,12 +147,12 @@
           <w:i w:val="0"/>
           <w:sz w:val="22"/>
         </w:rPr>
-        <w:t>Among the most consequential of these barriers is the inability to accurately describe symptoms in English during clinical encounters. When patients cannot communicate their chief complaint clearly, triage nurses and emergency department physicians must make urgency assessments with incomplete or misunderstood information. Studies have consistently documented that language barriers are associated with increased rates of adverse events, longer emergency department wait times, higher rates of misdiagnosis, and greater patient dissatisfaction (Divi et al., 2007; Flores, 2006). The COVID-19 pandemic further exposed these vulnerabilities, as immigrant communities with limited English proficiency experienced disproportionately high rates of severe illness, in part due to delayed help-seeking and inability to navigate symptom screening tools available only in English.</w:t>
+        <w:t>A foundational challenge in this context is the inability of LEP patients to describe their symptoms clearly during clinical encounters. Triage decisions in emergency departments and urgent care settings rely critically on the chief complaint—a brief verbal or written description of the patient's primary symptom. When this description is unavailable or misunderstood due to language barriers, triage nurses and physicians must assign urgency levels with incomplete information, increasing the risk of both under-triage (missing emergencies) and over-triage (wasting resources). Automated multilingual symptom triage could serve as a first-line decision support layer, helping patients articulate symptoms in their native language while flagging urgency for clinical review.</w:t>
       </w:r>
     </w:p>
     <w:p>
       <w:pPr>
-        <w:spacing w:before="0" w:after="120"/>
+        <w:spacing w:after="120" w:before="0"/>
         <w:jc w:val="both"/>
       </w:pPr>
       <w:r>
@@ -148,12 +161,12 @@
           <w:i w:val="0"/>
           <w:sz w:val="22"/>
         </w:rPr>
-        <w:t>Clinical natural language processing has emerged as a promising tool for automating symptom triage, patient routing, and disease risk stratification. Systems such as BERT-based clinical classifiers and large language model-powered chatbots have demonstrated strong performance on English-language symptom datasets. However, the overwhelming majority of clinical NLP research focuses exclusively on English, creating a significant gap for LEP patient populations. Multilingual pre-trained language models such as mBERT (Devlin et al., 2019) and XLM-RoBERTa (Conneau et al., 2020) offer a potential pathway to cross-lingual clinical NLP, but their application to symptom triage—particularly for low-resource languages such as Bengali—remains largely unexplored.</w:t>
+        <w:t>Clinical natural language processing has advanced substantially in English, with BERT-based models demonstrating strong performance on symptom classification, diagnosis prediction, and clinical note summarization. However, this progress has not extended meaningfully to low-resource clinical languages. Multilingual pre-trained language models—most notably multilingual BERT (mBERT; Devlin et al., 2019) and XLM-RoBERTa (Conneau et al., 2020)—offer a path toward cross-lingual clinical NLP, but their application to symptom urgency triage across South Asian languages has not been systematically studied. Bengali, in particular, is spoken by approximately 230 million people globally and has a significant diaspora in the United States, yet it remains severely underrepresented in clinical NLP research.</w:t>
       </w:r>
     </w:p>
     <w:p>
       <w:pPr>
-        <w:spacing w:before="0" w:after="120"/>
+        <w:spacing w:after="120" w:before="0"/>
         <w:jc w:val="both"/>
       </w:pPr>
       <w:r>
@@ -162,12 +175,12 @@
           <w:i w:val="0"/>
           <w:sz w:val="22"/>
         </w:rPr>
-        <w:t>This paper addresses this gap with four core contributions. First, we construct and release the MiST dataset: a perfectly balanced multilingual symptom triage benchmark comprising 12,000 unique symptom descriptions across English, Spanish, Hindi, and Bengali, with 1,000 instances per urgency class per language. The dataset is constructed using a clinically-grounded template generation pipeline that ensures medical accuracy, linguistic diversity, and label consistency across all four languages. Bengali is specifically prioritized as a low-resource language spoken by approximately 230 million people globally, with a significant diaspora population in the United States that is systematically underrepresented in clinical NLP research. Second, we fine-tune XLM-RoBERTa-base for symptom urgency classification using a two-stage training strategy on 72,000 augmented samples and benchmark against mBERT and fastText-multilingual baselines. Third, we introduce the Cross-Lingual Triage Equity Index (CTEI), a fairness metric designed to quantify equitable performance across language groups. Fourth, we integrate SHAP token-level attribution to provide clinical explainability for triage decisions across all four target languages, enabling clinicians to audit model reasoning in the patient's native language.</w:t>
+        <w:t>This paper presents MiST (Multilingual Symptom Triage) with four principal contributions. First, we construct and release the MiST dataset: 12,000 clinically validated symptom descriptions across English, Spanish, Hindi, and Bengali, perfectly balanced at 1,000 instances per urgency class per language, generated via a structured clinical template pipeline with inter-rater validated labels. The dataset is split at the base-sentence level prior to augmentation to prevent data leakage, a methodological discipline absent from several prior works in synthetic clinical NLP. Second, we fine-tune XLM-RoBERTa using a two-stage strategy that first warms up the classification head before full model fine-tuning, and benchmark against mBERT across all four languages. Third, we introduce the Cross-Lingual Triage Equity Index (CTEI), a fairness metric specifically designed for multilingual clinical deployment evaluation. Fourth, we provide SHAP token-level attribution across all four languages and validate cross-lingual explanation alignment by measuring whether semantically equivalent symptom tokens receive similar attribution scores across languages.</w:t>
       </w:r>
     </w:p>
     <w:p>
       <w:pPr>
-        <w:spacing w:before="0" w:after="120"/>
+        <w:spacing w:after="120" w:before="0"/>
         <w:jc w:val="both"/>
       </w:pPr>
       <w:r>
@@ -176,7 +189,7 @@
           <w:i w:val="0"/>
           <w:sz w:val="22"/>
         </w:rPr>
-        <w:t>Our work is motivated not only by academic interest but by direct deployment considerations. The MiST framework is designed for integration into symptiZ, a multilingual health navigation application targeting immigrant communities in the United States. By embedding clinically explainable triage into a patient-facing mobile application, we aim to reduce preventable emergency department overcrowding, improve early detection of serious conditions among LEP populations, and advance health equity for one of the most medically underserved demographic groups in the United States.</w:t>
+        <w:t>The MiST framework is designed for integration into symptiZ, a multilingual health navigation application targeting LEP immigrant communities in the United States. By embedding transparent, explainable triage into a patient-facing application, we aim to reduce preventable emergency department crowding, support earlier recognition of high-acuity presentations, and advance health equity for a medically underserved population.</w:t>
       </w:r>
     </w:p>
     <w:p>
@@ -194,12 +207,12 @@
         <w:jc w:val="left"/>
       </w:pPr>
       <w:r>
-        <w:t>2.1 Multilingual Pre-trained Language Models</w:t>
+        <w:t>2.1 Multilingual Pre-trained Language Models in NLP</w:t>
       </w:r>
     </w:p>
     <w:p>
       <w:pPr>
-        <w:spacing w:before="0" w:after="120"/>
+        <w:spacing w:after="120" w:before="0"/>
         <w:jc w:val="both"/>
       </w:pPr>
       <w:r>
@@ -208,7 +221,7 @@
           <w:i w:val="0"/>
           <w:sz w:val="22"/>
         </w:rPr>
-        <w:t>The development of multilingual transformer models has significantly expanded the scope of cross-lingual NLP. mBERT (Devlin et al., 2019) introduced a single transformer pre-trained on 104 languages using Wikipedia corpora, demonstrating surprising zero-shot cross-lingual transfer on named entity recognition and natural language inference tasks. XLM-RoBERTa (Conneau et al., 2020) extended this work by pre-training RoBERTa on CommonCrawl data spanning 100 languages, yielding substantial improvements on the XTREME benchmark. Subsequent work by Hu et al. (2020) showed that XLM-RoBERTa outperforms mBERT on 40 out of 40 cross-lingual transfer tasks, making it the current state-of-the-art baseline for multilingual classification. However, performance on low-resource languages such as Bengali and Swahili remains substantially below that on high-resource languages, motivating targeted fine-tuning and domain adaptation strategies.</w:t>
+        <w:t>The emergence of multilingual pre-trained transformers has fundamentally expanded the scope of cross-lingual NLP. mBERT (Devlin et al., 2019) demonstrated that a single model pre-trained on 104 languages via masked language modeling on Wikipedia corpora exhibits surprising zero-shot cross-lingual transfer, particularly for morphologically similar language pairs. XLM-RoBERTa (Conneau et al., 2020) substantially improved upon mBERT by pre-training on 2.5 TB of filtered CommonCrawl text across 100 languages using an optimized training regimen, achieving state-of-the-art performance on the XTREME multilingual benchmark across 40 tasks. Subsequent analysis by Hu et al. (2020) found XLM-RoBERTa superior to mBERT on every XTREME task, with particularly large gains on low-resource languages including Swahili, Urdu, and Tamil—languages with limited Wikipedia representation but substantial CommonCrawl presence. These findings motivate our choice of XLM-RoBERTa as the primary model, with mBERT serving as a strong multilingual baseline.</w:t>
       </w:r>
     </w:p>
     <w:p>
@@ -222,7 +235,7 @@
     </w:p>
     <w:p>
       <w:pPr>
-        <w:spacing w:before="0" w:after="120"/>
+        <w:spacing w:after="120" w:before="0"/>
         <w:jc w:val="both"/>
       </w:pPr>
       <w:r>
@@ -231,7 +244,7 @@
           <w:i w:val="0"/>
           <w:sz w:val="22"/>
         </w:rPr>
-        <w:t>Clinical NLP has seen rapid advances in symptom extraction, disease classification, and triage automation. ClinicalBERT (Alsentzer et al., 2019) and Bio_ClinicalBERT demonstrated that domain-specific pre-training on clinical notes improves performance on named entity recognition and relation extraction from MIMIC-III records. Symptom-disease classification has been approached as a text classification task using discharge summaries (Johnson et al., 2016) and patient-reported outcome measures. Recent work has explored conversational AI for symptom checking (Razzaki et al., 2019), though these systems remain primarily English-only. A notable gap exists in multilingual clinical symptom NLP: to our knowledge, no prior work has benchmarked cross-lingual symptom triage across South Asian languages, particularly Bengali, using large-scale balanced training data.</w:t>
+        <w:t>Domain-specific pre-training has proven critical for clinical NLP tasks. ClinicalBERT (Alsentzer et al., 2019) and BioBERT (Lee et al., 2020) demonstrated that continued pre-training on clinical notes and biomedical literature substantially improves downstream performance on named entity recognition, relation extraction, and clinical event detection from MIMIC-III records. Symptom-based urgency classification has been explored in English using chief complaint text from electronic health records (Levin et al., 2018; Zheng et al., 2021), but these systems do not generalize to non-English input. Conversational AI symptom checkers (Razzaki et al., 2019; Nateqi et al., 2020) offer preliminary multilingual capability but lack the formal evaluation of cross-lingual fairness and explainability required for clinical trust and regulatory compliance. To our knowledge, MiST is the first study to formally evaluate balanced multilingual symptom triage across English, Spanish, Hindi, and Bengali with per-language fairness quantification.</w:t>
       </w:r>
     </w:p>
     <w:p>
@@ -240,12 +253,12 @@
         <w:jc w:val="left"/>
       </w:pPr>
       <w:r>
-        <w:t>2.3 Health Equity and Language Barriers in AI</w:t>
+        <w:t>2.3 Synthetic Data Generation for Clinical NLP</w:t>
       </w:r>
     </w:p>
     <w:p>
       <w:pPr>
-        <w:spacing w:before="0" w:after="120"/>
+        <w:spacing w:after="120" w:before="0"/>
         <w:jc w:val="both"/>
       </w:pPr>
       <w:r>
@@ -254,7 +267,7 @@
           <w:i w:val="0"/>
           <w:sz w:val="22"/>
         </w:rPr>
-        <w:t>The intersection of AI fairness and language equity in healthcare has received increasing scholarly attention. Chen et al. (2021) demonstrated that commercial clinical NLP tools perform significantly worse on notes from non-white and non-English-speaking patients. Obermeyer et al. (2019) documented algorithmic bias in a widely-used healthcare risk scoring system, spurring broader interest in fairness-constrained clinical AI. Zhang et al. (2022) proposed demographic parity constraints for clinical risk stratification models. However, fairness metrics in clinical NLP have predominantly focused on racial and gender equity, with language-group equity receiving limited attention. Our CTEI metric addresses this gap by providing a quantitative measure of cross-lingual fairness specifically designed for multilingual symptom classification systems.</w:t>
+        <w:t>The scarcity of annotated multilingual clinical data has motivated substantial work on synthetic data generation. Template-based generation (Feng et al., 2021) provides high precision in vocabulary and label control while avoiding privacy concerns associated with real patient data. Augmentation via large language models (Meng et al., 2022; Møller et al., 2023) has shown promise for expanding training corpora, but carries risks of hallucinated clinical content that may introduce label noise. Studies comparing template-generated and real clinical text have found that models trained on high-quality synthetic data can approximate performance on real-world clinical benchmarks when the templates capture sufficient domain-specific vocabulary diversity (Lee et al., 2023). A critical methodological requirement—frequently overlooked—is to perform train/test splits at the base-template level rather than after augmentation; failing to do so allows near-duplicate sentences to appear in both train and test sets, producing inflated evaluation metrics that do not reflect real generalization. MiST enforces this constraint explicitly.</w:t>
       </w:r>
     </w:p>
     <w:p>
@@ -263,12 +276,12 @@
         <w:jc w:val="left"/>
       </w:pPr>
       <w:r>
-        <w:t>2.4 Synthetic Dataset Generation for Clinical NLP</w:t>
+        <w:t>2.4 Fairness and Equity in Clinical AI</w:t>
       </w:r>
     </w:p>
     <w:p>
       <w:pPr>
-        <w:spacing w:before="0" w:after="120"/>
+        <w:spacing w:after="120" w:before="0"/>
         <w:jc w:val="both"/>
       </w:pPr>
       <w:r>
@@ -277,7 +290,7 @@
           <w:i w:val="0"/>
           <w:sz w:val="22"/>
         </w:rPr>
-        <w:t>The scarcity of annotated multilingual clinical data has motivated a growing body of work on synthetic data generation for healthcare NLP. Template-based generation (Feng et al., 2021) and large language model-driven augmentation (Meng et al., 2022) have been applied to create training corpora for low-resource medical NLP tasks. Studies have shown that models trained on high-quality synthetic clinical data can achieve performance comparable to models trained on real clinical notes, provided the synthetic data captures the linguistic and clinical diversity of the target domain (Lee et al., 2023). Our MiST dataset construction approach draws on these findings, using a structured template generation pipeline with clinically validated vocabulary to produce diverse, medically accurate symptom descriptions across four languages.</w:t>
+        <w:t>Algorithmic fairness in clinical AI has emerged as a major research priority following high-profile demonstrations of demographic bias in commercial healthcare algorithms (Obermeyer et al., 2019). The majority of fairness interventions in clinical ML address racial and gender disparities (Chen et al., 2021; Zhang et al., 2022), with language-group equity receiving comparatively little attention. Existing multilingual NLP fairness metrics—such as performance gap across languages on benchmark datasets—do not account for the clinical consequences of inter-language performance disparities. A model that achieves F1=0.95 on English but F1=0.72 on Bengali does not merely 'perform worse' on Bengali—it systematically under-triages Bengali-speaking patients, with potentially life-threatening consequences for Emergency-tier misclassifications. We introduce CTEI to provide a single, interpretable summary statistic for cross-lingual clinical equity that maps directly to deployment threshold decisions.</w:t>
       </w:r>
     </w:p>
     <w:p>
@@ -291,7 +304,7 @@
     </w:p>
     <w:p>
       <w:pPr>
-        <w:spacing w:before="0" w:after="120"/>
+        <w:spacing w:after="120" w:before="0"/>
         <w:jc w:val="both"/>
       </w:pPr>
       <w:r>
@@ -300,7 +313,7 @@
           <w:i w:val="0"/>
           <w:sz w:val="22"/>
         </w:rPr>
-        <w:t>Clinical adoption of NLP systems requires not only strong predictive performance but also interpretable explanations that clinicians can audit and trust. SHAP (SHapley Additive exPlanations; Lundberg and Lee, 2017) has been applied to tabular clinical risk models (Lundberg et al., 2018) and, more recently, to transformer-based text classifiers via the transformers-interpret library. Attention-based explanations have been proposed for BERT models (Jain and Wallace, 2019), though their faithfulness as explanations has been debated (Wiegreffe and Pinter, 2019). We adopt a combined approach: SHAP token attribution for rigorous feature importance quantification, supplemented by attention rollout (Abnar and Zuidema, 2020) for visualization, and validate cross-lingual explanation alignment by examining whether equivalent symptom concepts in different languages receive similar attribution patterns.</w:t>
+        <w:t>Clinical adoption of NLP systems requires explanations that clinicians can audit. SHAP (Lundberg and Lee, 2017) has been applied to transformer text classifiers via token-level attribution (Lundberg et al., 2018; Pierse, 2021), providing model-agnostic feature importance scores with theoretical grounding in cooperative game theory. Attention-based explanations offer complementary visualization but have been critiqued for inconsistent faithfulness (Jain and Wallace, 2019; Wiegreffe and Pinter, 2019). We adopt SHAP as the primary explanation mechanism and supplement it with attention rollout (Abnar and Zuidema, 2020) for visualization, validating cross-lingual alignment by computing Pearson correlation between SHAP scores for semantically equivalent symptom terms across languages.</w:t>
       </w:r>
     </w:p>
     <w:p>
@@ -318,12 +331,12 @@
         <w:jc w:val="left"/>
       </w:pPr>
       <w:r>
-        <w:t>3.1 Dataset Overview</w:t>
+        <w:t>3.1 Overview and Design Principles</w:t>
       </w:r>
     </w:p>
     <w:p>
       <w:pPr>
-        <w:spacing w:before="0" w:after="120"/>
+        <w:spacing w:after="120" w:before="0"/>
         <w:jc w:val="both"/>
       </w:pPr>
       <w:r>
@@ -332,7 +345,7 @@
           <w:i w:val="0"/>
           <w:sz w:val="22"/>
         </w:rPr>
-        <w:t>We construct the MiST (Multilingual Symptom Triage) dataset comprising 12,000 unique symptom description instances perfectly balanced across four languages—English, Spanish, Hindi, and Bengali—with 3,000 instances per language and exactly 1,000 instances per urgency class per language. This balanced design eliminates class imbalance as a confounding factor in cross-lingual evaluation and enables direct comparison of model performance across language-class combinations. Each instance consists of a free-text symptom description of 8–120 words capturing realistic clinical presentations. Following base dataset construction, we apply a prefix augmentation strategy (augmentation factor 5) that prepends one of five clinically plausible chief-complaint prefixes (e.g., "Patient reports:", "Chief complaint:", "Presenting with:") to each base description, yielding 72,000 total training instances. The augmentation replicates the variability in how clinical intake personnel document chief complaints across different healthcare settings.</w:t>
+        <w:t>The MiST dataset comprises 12,000 unique symptom descriptions distributed across four languages and three urgency tiers. The dataset is designed according to three core principles. First, perfect balance: exactly 1,000 instances per urgency class per language ensures that no class-language combination is underrepresented during training or evaluation, and that per-language F1 differences reflect genuine cross-lingual capability rather than training data imbalance. Second, clinical validity: all instances are grounded in clinical template structures reviewed by healthcare professionals and align with the Emergency Severity Index (ESI) urgency tier definitions used in U.S. emergency departments. Third, leakage prevention: train/validation/test splits are performed at the base-sentence level before any augmentation, ensuring that augmented variants of a given base sentence appear exclusively in the training partition.</w:t>
       </w:r>
     </w:p>
     <w:p>
@@ -346,7 +359,7 @@
     </w:p>
     <w:p>
       <w:pPr>
-        <w:spacing w:before="0" w:after="120"/>
+        <w:spacing w:after="120" w:before="0"/>
         <w:jc w:val="both"/>
       </w:pPr>
       <w:r>
@@ -355,7 +368,7 @@
           <w:i w:val="0"/>
           <w:sz w:val="22"/>
         </w:rPr>
-        <w:t>We adopt a three-tier urgency classification scheme consistent with the Emergency Severity Index (ESI) used in U.S. emergency departments. Emergency-tier instances describe symptoms requiring immediate life-saving intervention (e.g., chest pain with diaphoresis, acute stroke symptoms, severe anaphylaxis, uncontrolled hemorrhage). Urgent-tier instances describe symptoms requiring evaluation within 2–4 hours but not immediately life-threatening (e.g., high fever with localized infection, suspected fracture, persistent vomiting with dehydration, moderate abdominal pain). Routine-tier instances describe symptoms appropriate for same-day or next-day primary care evaluation (e.g., mild cough, rash without systemic symptoms, minor headache responding to OTC medication, insomnia). The three-class balanced distribution (1,000 per class per language) departs from the natural clinical encounter distribution but ensures equal representation for model evaluation; class weights are applied during training to correct for this.</w:t>
+        <w:t>Emergency-tier (label 2) instances describe life-threatening presentations requiring immediate intervention: acute myocardial infarction symptoms (chest pain with diaphoresis, jaw pain, dyspnea), stroke symptoms (sudden unilateral weakness, facial droop, aphasia), severe anaphylaxis, status epilepticus, and respiratory failure. Urgent-tier (label 1) instances describe serious but non-immediately-life-threatening conditions requiring evaluation within 2–4 hours: high fever with focal infection signs, suspected fractures, persistent vomiting with dehydration risk, moderate abdominal pain without peritoneal signs, and hypertensive urgency. Routine-tier (label 0) instances describe conditions appropriate for same-day or next-day primary care: mild upper respiratory symptoms, minor dermatological complaints, low-grade headache responding to over-the-counter analgesia, mild insomnia, and uncomplicated seasonal allergy exacerbations.</w:t>
       </w:r>
     </w:p>
     <w:p>
@@ -364,12 +377,12 @@
         <w:jc w:val="left"/>
       </w:pPr>
       <w:r>
-        <w:t>3.3 Dataset Construction Pipeline</w:t>
+        <w:t>3.3 Template Generation Pipeline</w:t>
       </w:r>
     </w:p>
     <w:p>
       <w:pPr>
-        <w:spacing w:before="0" w:after="120"/>
+        <w:spacing w:after="120" w:before="0"/>
         <w:jc w:val="both"/>
       </w:pPr>
       <w:r>
@@ -378,12 +391,12 @@
           <w:i w:val="0"/>
           <w:sz w:val="22"/>
         </w:rPr>
-        <w:t>The MiST dataset is constructed using a structured clinical template generation pipeline developed in collaboration with clinical subject matter experts. The pipeline consists of three stages:</w:t>
+        <w:t>Dataset construction proceeds through three stages. In Stage 1, clinical subject matter experts designed 15–20 symptom description templates per urgency class per language, organized across eight clinical categories: cardiac, neurological, respiratory, gastrointestinal, musculoskeletal, dermatological, genitourinary, and pediatric presentations. Each template contains 3–5 variable slots (e.g., {severity}, {location}, {duration}, {associated_symptom}) populated from curated medical vocabulary lists. Stage 2 generates instances by randomly sampling slot values for each template until 1,000 unique instances per class per language are obtained; a duplicate-detection mechanism using exact-match string comparison prevents repetition across the 1,000-instance target per cell. All generation runs use a fixed random seed (42) for full reproducibility. Stage 3 applies clinical validation: two independent annotators reviewed a stratified 10% sample (n=1,200) for urgency tier accuracy, achieving Cohen's κ=0.863. All disputed instances were adjudicated by a third reviewer and replaced through additional generation cycles.</w:t>
       </w:r>
     </w:p>
     <w:p>
       <w:pPr>
-        <w:spacing w:before="0" w:after="120"/>
+        <w:spacing w:after="120" w:before="0"/>
         <w:jc w:val="both"/>
       </w:pPr>
       <w:r>
@@ -392,12 +405,21 @@
           <w:i w:val="0"/>
           <w:sz w:val="22"/>
         </w:rPr>
-        <w:t>Stage 1 — Template Design. For each language-class combination, clinical experts designed 15–20 symptom description templates organized by clinical category (cardiac, neurological, respiratory, gastrointestinal, musculoskeletal, dermatological, genitourinary, and pediatric presentations). Each template contains between 3 and 5 variable slots (e.g., {severity}, {location}, {associated_symptom}, {duration}) populated from curated medical vocabulary lists validated against standard clinical terminology. Template categories and vocabulary were reviewed by a registered nurse and a physician assistant to ensure clinical accuracy and appropriate urgency assignment.</w:t>
+        <w:t>Hindi and Bengali instances use Romanized transliteration (Latin script) to maximize accessibility for diaspora populations in the United States who are more likely to type in Latin script on mobile devices than in Devanagari or Bengali native scripts. Urdu is reserved as a zero-shot evaluation language (n=10 held-out instances) and is excluded from all training and validation partitions.</w:t>
       </w:r>
     </w:p>
     <w:p>
       <w:pPr>
-        <w:spacing w:before="0" w:after="120"/>
+        <w:pStyle w:val="Heading2"/>
+        <w:jc w:val="left"/>
+      </w:pPr>
+      <w:r>
+        <w:t>3.4 Data Splitting and Augmentation</w:t>
+      </w:r>
+    </w:p>
+    <w:p>
+      <w:pPr>
+        <w:spacing w:after="120" w:before="0"/>
         <w:jc w:val="both"/>
       </w:pPr>
       <w:r>
@@ -406,21 +428,7 @@
           <w:i w:val="0"/>
           <w:sz w:val="22"/>
         </w:rPr>
-        <w:t>Stage 2 — Instance Generation. For each template, the generation algorithm randomly samples values from each slot vocabulary and combines them to produce a unique symptom description. A duplicate-detection mechanism ensures that all 1,000 instances per class per language are lexically distinct. The generation process uses a fixed random seed (42) to ensure full reproducibility. Across 12 language-class combinations, the pipeline generates over 14,000 candidate instances from which the final 12,000 are selected after deduplication.</w:t>
-      </w:r>
-    </w:p>
-    <w:p>
-      <w:pPr>
-        <w:spacing w:before="0" w:after="120"/>
-        <w:jc w:val="both"/>
-      </w:pPr>
-      <w:r>
-        <w:rPr>
-          <w:b w:val="0"/>
-          <w:i w:val="0"/>
-          <w:sz w:val="22"/>
-        </w:rPr>
-        <w:t>Stage 3 — Clinical Validation. A stratified random sample of 10% of instances (n=1,200) was reviewed by two independent clinical annotators for urgency tier accuracy. Inter-rater agreement yielded Cohen's κ = 0.863, indicating near-perfect agreement. All disagreements were adjudicated by a third clinical reviewer. Instances flagged as clinically ambiguous or incorrectly labeled were removed and replaced through additional generation cycles, maintaining the 1,000-per-class-per-language target.</w:t>
+        <w:t>The 12,000 base instances are partitioned into train (70%), validation (15%), and test (15%) sets using stratified sampling by language-class combination, yielding 8,400 train, 1,800 validation, and 1,800 test base instances. Augmentation is applied exclusively to the training partition. Each training instance is augmented with five additional variants by prepending one of fourteen clinical chief-complaint prefixes: 'Patient reports:', 'Chief complaint:', 'Patient states:', 'Presenting with:', 'Complaints of:', 'Reports experiencing:', 'Describes:', 'Presenting symptom:', 'States:', 'Notes:', 'Experiencing:', 'Feels:', 'Currently:', and 'Suffering from:'. This yields 50,400 augmented training samples (8,400 × 6 = 50,400). Validation and test sets retain only the original base sentences (1,800 each), ensuring that evaluation is performed on unseen sentence structures without augmentation artifacts. The augmented training set is randomly shuffled with seed 42 before training.</w:t>
       </w:r>
     </w:p>
     <w:p>
@@ -429,30 +437,7 @@
         <w:jc w:val="left"/>
       </w:pPr>
       <w:r>
-        <w:t>3.4 Language Coverage</w:t>
-      </w:r>
-    </w:p>
-    <w:p>
-      <w:pPr>
-        <w:spacing w:before="0" w:after="120"/>
-        <w:jc w:val="both"/>
-      </w:pPr>
-      <w:r>
-        <w:rPr>
-          <w:b w:val="0"/>
-          <w:i w:val="0"/>
-          <w:sz w:val="22"/>
-        </w:rPr>
-        <w:t>English descriptions target standard American clinical chief complaint documentation style and cover the full range of emergency, urgent, and routine presentations encountered in U.S. emergency departments and urgent care settings. Spanish descriptions reflect standard medical Spanish as spoken in the United States and Latin America, covering regional vocabulary for common symptom presentations. Hindi descriptions are provided in Romanized transliteration (Latin script) to maximize accessibility for the Hindustani-speaking diaspora in the United States, using vocabulary consistent with colloquial symptom descriptions used in clinical settings. Bengali descriptions similarly use Romanized transliteration of standard Bengali medical terminology, validated by native-speaking clinical volunteers with healthcare familiarity. Urdu is reserved as a zero-shot evaluation language (n=10 held-out instances), not included in training data.</w:t>
-      </w:r>
-    </w:p>
-    <w:p>
-      <w:pPr>
-        <w:pStyle w:val="Heading2"/>
-        <w:jc w:val="left"/>
-      </w:pPr>
-      <w:r>
-        <w:t>Table 1. MiST Dataset Statistics by Language and Urgency Tier</w:t>
+        <w:t>Table 1. MiST Dataset Statistics</w:t>
       </w:r>
     </w:p>
     <w:tbl>
@@ -462,40 +447,47 @@
         <w:tblLook w:firstColumn="1" w:firstRow="1" w:lastColumn="0" w:lastRow="0" w:noHBand="0" w:noVBand="1" w:val="04A0"/>
       </w:tblPr>
       <w:tblGrid>
-        <w:gridCol w:w="1728"/>
-        <w:gridCol w:w="1728"/>
-        <w:gridCol w:w="1728"/>
-        <w:gridCol w:w="1728"/>
-        <w:gridCol w:w="1728"/>
+        <w:gridCol w:w="1440"/>
+        <w:gridCol w:w="1440"/>
+        <w:gridCol w:w="1440"/>
+        <w:gridCol w:w="1440"/>
+        <w:gridCol w:w="1440"/>
+        <w:gridCol w:w="1440"/>
       </w:tblGrid>
       <w:tr>
         <w:tc>
           <w:tcPr>
-            <w:tcW w:type="dxa" w:w="1728"/>
+            <w:tcW w:type="dxa" w:w="1440"/>
           </w:tcPr>
           <w:p/>
         </w:tc>
         <w:tc>
           <w:tcPr>
-            <w:tcW w:type="dxa" w:w="1728"/>
+            <w:tcW w:type="dxa" w:w="1440"/>
           </w:tcPr>
           <w:p/>
         </w:tc>
         <w:tc>
           <w:tcPr>
-            <w:tcW w:type="dxa" w:w="1728"/>
+            <w:tcW w:type="dxa" w:w="1440"/>
           </w:tcPr>
           <w:p/>
         </w:tc>
         <w:tc>
           <w:tcPr>
-            <w:tcW w:type="dxa" w:w="1728"/>
+            <w:tcW w:type="dxa" w:w="1440"/>
           </w:tcPr>
           <w:p/>
         </w:tc>
         <w:tc>
           <w:tcPr>
-            <w:tcW w:type="dxa" w:w="1728"/>
+            <w:tcW w:type="dxa" w:w="1440"/>
+          </w:tcPr>
+          <w:p/>
+        </w:tc>
+        <w:tc>
+          <w:tcPr>
+            <w:tcW w:type="dxa" w:w="1440"/>
           </w:tcPr>
           <w:p/>
         </w:tc>
@@ -503,7 +495,7 @@
       <w:tr>
         <w:tc>
           <w:tcPr>
-            <w:tcW w:type="dxa" w:w="1728"/>
+            <w:tcW w:type="dxa" w:w="1440"/>
           </w:tcPr>
           <w:p>
             <w:r/>
@@ -518,7 +510,7 @@
         </w:tc>
         <w:tc>
           <w:tcPr>
-            <w:tcW w:type="dxa" w:w="1728"/>
+            <w:tcW w:type="dxa" w:w="1440"/>
           </w:tcPr>
           <w:p>
             <w:r/>
@@ -533,7 +525,7 @@
         </w:tc>
         <w:tc>
           <w:tcPr>
-            <w:tcW w:type="dxa" w:w="1728"/>
+            <w:tcW w:type="dxa" w:w="1440"/>
           </w:tcPr>
           <w:p>
             <w:r/>
@@ -548,7 +540,7 @@
         </w:tc>
         <w:tc>
           <w:tcPr>
-            <w:tcW w:type="dxa" w:w="1728"/>
+            <w:tcW w:type="dxa" w:w="1440"/>
           </w:tcPr>
           <w:p>
             <w:r/>
@@ -563,7 +555,7 @@
         </w:tc>
         <w:tc>
           <w:tcPr>
-            <w:tcW w:type="dxa" w:w="1728"/>
+            <w:tcW w:type="dxa" w:w="1440"/>
           </w:tcPr>
           <w:p>
             <w:r/>
@@ -572,7 +564,22 @@
                 <w:b/>
                 <w:sz w:val="20"/>
               </w:rPr>
-              <w:t>Total</w:t>
+              <w:t>Total (base)</w:t>
+            </w:r>
+          </w:p>
+        </w:tc>
+        <w:tc>
+          <w:tcPr>
+            <w:tcW w:type="dxa" w:w="1440"/>
+          </w:tcPr>
+          <w:p>
+            <w:r/>
+            <w:r>
+              <w:rPr>
+                <w:b/>
+                <w:sz w:val="20"/>
+              </w:rPr>
+              <w:t>Train aug.</w:t>
             </w:r>
           </w:p>
         </w:tc>
@@ -580,7 +587,7 @@
       <w:tr>
         <w:tc>
           <w:tcPr>
-            <w:tcW w:type="dxa" w:w="1728"/>
+            <w:tcW w:type="dxa" w:w="1440"/>
           </w:tcPr>
           <w:p>
             <w:r/>
@@ -595,7 +602,7 @@
         </w:tc>
         <w:tc>
           <w:tcPr>
-            <w:tcW w:type="dxa" w:w="1728"/>
+            <w:tcW w:type="dxa" w:w="1440"/>
           </w:tcPr>
           <w:p>
             <w:r/>
@@ -610,7 +617,7 @@
         </w:tc>
         <w:tc>
           <w:tcPr>
-            <w:tcW w:type="dxa" w:w="1728"/>
+            <w:tcW w:type="dxa" w:w="1440"/>
           </w:tcPr>
           <w:p>
             <w:r/>
@@ -625,7 +632,7 @@
         </w:tc>
         <w:tc>
           <w:tcPr>
-            <w:tcW w:type="dxa" w:w="1728"/>
+            <w:tcW w:type="dxa" w:w="1440"/>
           </w:tcPr>
           <w:p>
             <w:r/>
@@ -640,7 +647,7 @@
         </w:tc>
         <w:tc>
           <w:tcPr>
-            <w:tcW w:type="dxa" w:w="1728"/>
+            <w:tcW w:type="dxa" w:w="1440"/>
           </w:tcPr>
           <w:p>
             <w:r/>
@@ -653,11 +660,26 @@
             </w:r>
           </w:p>
         </w:tc>
+        <w:tc>
+          <w:tcPr>
+            <w:tcW w:type="dxa" w:w="1440"/>
+          </w:tcPr>
+          <w:p>
+            <w:r/>
+            <w:r>
+              <w:rPr>
+                <w:b w:val="0"/>
+                <w:sz w:val="20"/>
+              </w:rPr>
+              <w:t>12,600</w:t>
+            </w:r>
+          </w:p>
+        </w:tc>
       </w:tr>
       <w:tr>
         <w:tc>
           <w:tcPr>
-            <w:tcW w:type="dxa" w:w="1728"/>
+            <w:tcW w:type="dxa" w:w="1440"/>
           </w:tcPr>
           <w:p>
             <w:r/>
@@ -672,7 +694,7 @@
         </w:tc>
         <w:tc>
           <w:tcPr>
-            <w:tcW w:type="dxa" w:w="1728"/>
+            <w:tcW w:type="dxa" w:w="1440"/>
           </w:tcPr>
           <w:p>
             <w:r/>
@@ -687,7 +709,7 @@
         </w:tc>
         <w:tc>
           <w:tcPr>
-            <w:tcW w:type="dxa" w:w="1728"/>
+            <w:tcW w:type="dxa" w:w="1440"/>
           </w:tcPr>
           <w:p>
             <w:r/>
@@ -702,7 +724,7 @@
         </w:tc>
         <w:tc>
           <w:tcPr>
-            <w:tcW w:type="dxa" w:w="1728"/>
+            <w:tcW w:type="dxa" w:w="1440"/>
           </w:tcPr>
           <w:p>
             <w:r/>
@@ -717,7 +739,7 @@
         </w:tc>
         <w:tc>
           <w:tcPr>
-            <w:tcW w:type="dxa" w:w="1728"/>
+            <w:tcW w:type="dxa" w:w="1440"/>
           </w:tcPr>
           <w:p>
             <w:r/>
@@ -730,11 +752,26 @@
             </w:r>
           </w:p>
         </w:tc>
+        <w:tc>
+          <w:tcPr>
+            <w:tcW w:type="dxa" w:w="1440"/>
+          </w:tcPr>
+          <w:p>
+            <w:r/>
+            <w:r>
+              <w:rPr>
+                <w:b w:val="0"/>
+                <w:sz w:val="20"/>
+              </w:rPr>
+              <w:t>12,600</w:t>
+            </w:r>
+          </w:p>
+        </w:tc>
       </w:tr>
       <w:tr>
         <w:tc>
           <w:tcPr>
-            <w:tcW w:type="dxa" w:w="1728"/>
+            <w:tcW w:type="dxa" w:w="1440"/>
           </w:tcPr>
           <w:p>
             <w:r/>
@@ -749,7 +786,7 @@
         </w:tc>
         <w:tc>
           <w:tcPr>
-            <w:tcW w:type="dxa" w:w="1728"/>
+            <w:tcW w:type="dxa" w:w="1440"/>
           </w:tcPr>
           <w:p>
             <w:r/>
@@ -764,7 +801,7 @@
         </w:tc>
         <w:tc>
           <w:tcPr>
-            <w:tcW w:type="dxa" w:w="1728"/>
+            <w:tcW w:type="dxa" w:w="1440"/>
           </w:tcPr>
           <w:p>
             <w:r/>
@@ -779,7 +816,7 @@
         </w:tc>
         <w:tc>
           <w:tcPr>
-            <w:tcW w:type="dxa" w:w="1728"/>
+            <w:tcW w:type="dxa" w:w="1440"/>
           </w:tcPr>
           <w:p>
             <w:r/>
@@ -794,7 +831,7 @@
         </w:tc>
         <w:tc>
           <w:tcPr>
-            <w:tcW w:type="dxa" w:w="1728"/>
+            <w:tcW w:type="dxa" w:w="1440"/>
           </w:tcPr>
           <w:p>
             <w:r/>
@@ -807,11 +844,26 @@
             </w:r>
           </w:p>
         </w:tc>
+        <w:tc>
+          <w:tcPr>
+            <w:tcW w:type="dxa" w:w="1440"/>
+          </w:tcPr>
+          <w:p>
+            <w:r/>
+            <w:r>
+              <w:rPr>
+                <w:b w:val="0"/>
+                <w:sz w:val="20"/>
+              </w:rPr>
+              <w:t>12,600</w:t>
+            </w:r>
+          </w:p>
+        </w:tc>
       </w:tr>
       <w:tr>
         <w:tc>
           <w:tcPr>
-            <w:tcW w:type="dxa" w:w="1728"/>
+            <w:tcW w:type="dxa" w:w="1440"/>
           </w:tcPr>
           <w:p>
             <w:r/>
@@ -826,7 +878,7 @@
         </w:tc>
         <w:tc>
           <w:tcPr>
-            <w:tcW w:type="dxa" w:w="1728"/>
+            <w:tcW w:type="dxa" w:w="1440"/>
           </w:tcPr>
           <w:p>
             <w:r/>
@@ -841,7 +893,7 @@
         </w:tc>
         <w:tc>
           <w:tcPr>
-            <w:tcW w:type="dxa" w:w="1728"/>
+            <w:tcW w:type="dxa" w:w="1440"/>
           </w:tcPr>
           <w:p>
             <w:r/>
@@ -856,7 +908,7 @@
         </w:tc>
         <w:tc>
           <w:tcPr>
-            <w:tcW w:type="dxa" w:w="1728"/>
+            <w:tcW w:type="dxa" w:w="1440"/>
           </w:tcPr>
           <w:p>
             <w:r/>
@@ -871,7 +923,7 @@
         </w:tc>
         <w:tc>
           <w:tcPr>
-            <w:tcW w:type="dxa" w:w="1728"/>
+            <w:tcW w:type="dxa" w:w="1440"/>
           </w:tcPr>
           <w:p>
             <w:r/>
@@ -884,11 +936,26 @@
             </w:r>
           </w:p>
         </w:tc>
+        <w:tc>
+          <w:tcPr>
+            <w:tcW w:type="dxa" w:w="1440"/>
+          </w:tcPr>
+          <w:p>
+            <w:r/>
+            <w:r>
+              <w:rPr>
+                <w:b w:val="0"/>
+                <w:sz w:val="20"/>
+              </w:rPr>
+              <w:t>12,600</w:t>
+            </w:r>
+          </w:p>
+        </w:tc>
       </w:tr>
       <w:tr>
         <w:tc>
           <w:tcPr>
-            <w:tcW w:type="dxa" w:w="1728"/>
+            <w:tcW w:type="dxa" w:w="1440"/>
           </w:tcPr>
           <w:p>
             <w:r/>
@@ -903,7 +970,7 @@
         </w:tc>
         <w:tc>
           <w:tcPr>
-            <w:tcW w:type="dxa" w:w="1728"/>
+            <w:tcW w:type="dxa" w:w="1440"/>
           </w:tcPr>
           <w:p>
             <w:r/>
@@ -918,7 +985,7 @@
         </w:tc>
         <w:tc>
           <w:tcPr>
-            <w:tcW w:type="dxa" w:w="1728"/>
+            <w:tcW w:type="dxa" w:w="1440"/>
           </w:tcPr>
           <w:p>
             <w:r/>
@@ -933,7 +1000,7 @@
         </w:tc>
         <w:tc>
           <w:tcPr>
-            <w:tcW w:type="dxa" w:w="1728"/>
+            <w:tcW w:type="dxa" w:w="1440"/>
           </w:tcPr>
           <w:p>
             <w:r/>
@@ -948,7 +1015,7 @@
         </w:tc>
         <w:tc>
           <w:tcPr>
-            <w:tcW w:type="dxa" w:w="1728"/>
+            <w:tcW w:type="dxa" w:w="1440"/>
           </w:tcPr>
           <w:p>
             <w:r/>
@@ -961,12 +1028,27 @@
             </w:r>
           </w:p>
         </w:tc>
+        <w:tc>
+          <w:tcPr>
+            <w:tcW w:type="dxa" w:w="1440"/>
+          </w:tcPr>
+          <w:p>
+            <w:r/>
+            <w:r>
+              <w:rPr>
+                <w:b/>
+                <w:sz w:val="20"/>
+              </w:rPr>
+              <w:t>50,400</w:t>
+            </w:r>
+          </w:p>
+        </w:tc>
       </w:tr>
     </w:tbl>
     <w:p/>
     <w:p>
       <w:pPr>
-        <w:spacing w:before="0" w:after="120"/>
+        <w:spacing w:after="120" w:before="0"/>
         <w:jc w:val="both"/>
       </w:pPr>
       <w:r>
@@ -975,7 +1057,7 @@
           <w:i/>
           <w:sz w:val="22"/>
         </w:rPr>
-        <w:t>After prefix augmentation (factor 5): 72,000 total training instances. Train/Val/Test split: 70% / 15% / 15%, stratified by language and urgency tier, yielding approximately 50,400 training, 10,800 validation, and 10,800 test instances.</w:t>
+        <w:t>Split: 8,400 base train (50,400 augmented) / 1,800 base val / 1,800 base test. Urdu: 10 held-out instances for zero-shot evaluation.</w:t>
       </w:r>
     </w:p>
     <w:p>
@@ -998,7 +1080,7 @@
     </w:p>
     <w:p>
       <w:pPr>
-        <w:spacing w:before="0" w:after="120"/>
+        <w:spacing w:after="120" w:before="0"/>
         <w:jc w:val="both"/>
       </w:pPr>
       <w:r>
@@ -1007,12 +1089,21 @@
           <w:i w:val="0"/>
           <w:sz w:val="22"/>
         </w:rPr>
-        <w:t>We adopt XLM-RoBERTa-base (Conneau et al., 2020) as our primary model. XLM-RoBERTa is a transformer encoder pre-trained on 2.5 TB of filtered CommonCrawl data spanning 100 languages using masked language modeling. The base variant contains 278 million parameters with 12 transformer layers, 768-dimensional hidden states, and 12 attention heads. We append a three-way classification head consisting of a dropout layer (p=0.1), a linear projection from 768 to 256 dimensions with ReLU activation, and a final linear layer mapping to three output logits corresponding to urgency tiers (Emergency=2, Urgent=1, Routine=0). The classification head is initialized with Xavier uniform initialization.</w:t>
+        <w:t>Our primary model is XLM-RoBERTa-base (Conneau et al., 2020), a 12-layer transformer encoder with 768 hidden dimensions, 12 attention heads, and 278 million parameters, pre-trained on 2.5 TB of multilingual CommonCrawl text spanning 100 languages. We append a sequence classification head comprising a dropout layer (p=0.1) followed by a linear projection to 3 output logits corresponding to urgency tiers (Routine=0, Urgent=1, Emergency=2). The classification head uses Xavier uniform initialization. As a baseline, we fine-tune multilingual BERT (mBERT; bert-base-multilingual-cased), a 12-layer transformer with 178 million parameters pre-trained on 104 languages via Wikipedia masked language modeling. Each model uses its own tokenizer throughout training and evaluation to prevent vocabulary mismatch errors: XLM-RoBERTa uses a SentencePiece tokenizer with a 250,000-token vocabulary, while mBERT uses a WordPiece tokenizer with a 119,547-token vocabulary. Using XLM-RoBERTa token IDs with mBERT's embedding table would produce out-of-range index errors and is explicitly avoided.</w:t>
       </w:r>
     </w:p>
     <w:p>
       <w:pPr>
-        <w:spacing w:before="0" w:after="120"/>
+        <w:pStyle w:val="Heading2"/>
+        <w:jc w:val="left"/>
+      </w:pPr>
+      <w:r>
+        <w:t>4.2 Two-Stage Fine-Tuning</w:t>
+      </w:r>
+    </w:p>
+    <w:p>
+      <w:pPr>
+        <w:spacing w:after="120" w:before="0"/>
         <w:jc w:val="both"/>
       </w:pPr>
       <w:r>
@@ -1021,7 +1112,7 @@
           <w:i w:val="0"/>
           <w:sz w:val="22"/>
         </w:rPr>
-        <w:t>We implement two fine-tuning strategies to address potential catastrophic forgetting of multilingual representations during task-specific fine-tuning. In Stage 1 (warm-up), we freeze all 12 transformer layers and fine-tune only the classification head for 3 epochs using a learning rate of 5×10⁻⁴ and a linear warmup over 10% of total steps. In Stage 2 (full fine-tuning), we unfreeze all layers and continue training for 8 epochs using a learning rate of 2×10⁻⁵ with linear decay and the same warmup ratio. Stage 1 trains approximately 592,899 parameters (0.2% of total), while Stage 2 trains all 278 million parameters.</w:t>
+        <w:t>We employ a two-stage fine-tuning strategy to mitigate catastrophic forgetting of multilingual representations. Stage 1 (warm-up) freezes all 12 transformer encoder layers and trains only the 592,899-parameter classification head for 3 epochs using a learning rate of 5×10⁻⁴, allowing the head to develop a stable initial mapping from XLM-RoBERTa's [CLS] representations to urgency categories before any transformer weights are disturbed. Stage 2 (full fine-tuning) unfreezes all 278 million parameters and continues training for 8 epochs at a reduced learning rate of 2×10⁻⁵ with linear decay and 10% warmup steps, allowing the transformer to adapt its representations to the clinical symptom domain while the classification head guides the optimization. Both stages use AdamW optimization with weight decay of 0.01 and gradient clipping at norm 1.0. The best checkpoint across all epochs is selected by macro-averaged F1 on the validation set and saved for evaluation.</w:t>
       </w:r>
     </w:p>
     <w:p>
@@ -1030,12 +1121,12 @@
         <w:jc w:val="left"/>
       </w:pPr>
       <w:r>
-        <w:t>4.2 Prefix Augmentation Strategy</w:t>
+        <w:t>4.3 Training Configuration</w:t>
       </w:r>
     </w:p>
     <w:p>
       <w:pPr>
-        <w:spacing w:before="0" w:after="120"/>
+        <w:spacing w:after="120" w:before="0"/>
         <w:jc w:val="both"/>
       </w:pPr>
       <w:r>
@@ -1044,30 +1135,7 @@
           <w:i w:val="0"/>
           <w:sz w:val="22"/>
         </w:rPr>
-        <w:t>To replicate the variability in clinical documentation styles across healthcare settings, we apply a prefix augmentation strategy to each base symptom description. Each base instance is augmented with five additional variants, each prepended with one of fourteen clinically realistic chief-complaint prefixes: "Patient reports:", "Chief complaint:", "Patient states:", "Presenting with:", "Complaints of:", "Reports experiencing:", "Describes:", "Presenting symptom:", "States:", "Notes:", "Experiencing:", "Feels:", "Currently:", and "Suffering from:". The augmentation factor of 5 (1 original + 5 augmented variants per base instance) was selected to balance training data diversity with the risk of over-representing identical symptom content. Higher augmentation factors (tested at 10 and 14) produced inflated validation metrics due to near-duplicate train-test overlap, justifying our conservative choice of factor 5.</w:t>
-      </w:r>
-    </w:p>
-    <w:p>
-      <w:pPr>
-        <w:pStyle w:val="Heading2"/>
-        <w:jc w:val="left"/>
-      </w:pPr>
-      <w:r>
-        <w:t>4.3 Baselines</w:t>
-      </w:r>
-    </w:p>
-    <w:p>
-      <w:pPr>
-        <w:spacing w:before="0" w:after="120"/>
-        <w:jc w:val="both"/>
-      </w:pPr>
-      <w:r>
-        <w:rPr>
-          <w:b w:val="0"/>
-          <w:i w:val="0"/>
-          <w:sz w:val="22"/>
-        </w:rPr>
-        <w:t>We compare MiST against three baselines: (1) fastText-multilingual, a fast n-gram-based multilingual classifier serving as a non-neural baseline; (2) mBERT (multilingual BERT), the original 104-language BERT model fine-tuned identically to XLM-RoBERTa but with its own vocabulary and tokenizer; and (3) a zero-shot XLM-RoBERTa variant trained only on English data and evaluated on all four language test sets to isolate the contribution of multilingual training data. The mBERT baseline is particularly important as it represents the standard multilingual alternative to XLM-RoBERTa, allowing us to quantify the benefit of the larger XLM-R pre-training corpus.</w:t>
+        <w:t>All experiments use PyTorch 2.x and the HuggingFace Transformers library. Batch size is 32 for both training and evaluation. Input sequences are tokenized with a maximum length of 128 tokens; sequences exceeding this limit are truncated. Shorter sequences are padded to 128 tokens. Given the perfectly balanced dataset design (equal class counts), class weights are set to uniform (1.0 per class). The train/validation/test split is stratified by language-class combination to maintain balance across all partitions. All random operations use seed 42.</w:t>
       </w:r>
     </w:p>
     <w:p>
@@ -1081,7 +1149,7 @@
     </w:p>
     <w:p>
       <w:pPr>
-        <w:spacing w:before="0" w:after="120"/>
+        <w:spacing w:after="120" w:before="0"/>
         <w:jc w:val="both"/>
       </w:pPr>
       <w:r>
@@ -1090,12 +1158,12 @@
           <w:i w:val="0"/>
           <w:sz w:val="22"/>
         </w:rPr>
-        <w:t>We introduce the Cross-Lingual Triage Equity Index (CTEI) to quantify the degree to which a triage model treats all language groups equitably. CTEI is defined as:</w:t>
+        <w:t>We introduce the Cross-Lingual Triage Equity Index to provide a single scalar measure of performance fairness across language groups:</w:t>
       </w:r>
     </w:p>
     <w:p>
       <w:pPr>
-        <w:spacing w:before="0" w:after="120"/>
+        <w:spacing w:after="120" w:before="0"/>
         <w:jc w:val="both"/>
       </w:pPr>
       <w:r>
@@ -1104,12 +1172,12 @@
           <w:i w:val="0"/>
           <w:sz w:val="22"/>
         </w:rPr>
-        <w:t>CTEI = 1 − σ(F1₁, F1₂, …, F1ₙ) / μ(F1₁, F1₂, …, F1ₙ)</w:t>
+        <w:t xml:space="preserve">    CTEI = 1 − σ(F1₁, F1₂, …, F1ₙ) / μ(F1₁, F1₂, …, F1ₙ)</w:t>
       </w:r>
     </w:p>
     <w:p>
       <w:pPr>
-        <w:spacing w:before="0" w:after="120"/>
+        <w:spacing w:after="120" w:before="0"/>
         <w:jc w:val="both"/>
       </w:pPr>
       <w:r>
@@ -1118,7 +1186,7 @@
           <w:i w:val="0"/>
           <w:sz w:val="22"/>
         </w:rPr>
-        <w:t>where F1ᵢ denotes the macro-averaged F1 score on language group i, σ denotes the standard deviation across language groups, and μ denotes the mean. CTEI ranges from 0 (maximally inequitable) to 1 (perfectly equitable, identical F1 across all languages). We propose CTEI ≥ 0.95 as the minimum threshold for clinical deployment, reflecting a coefficient of variation below 5% in per-language F1 scores. A CTEI below 0.95 implies that at least one language group receives meaningfully lower-quality triage decisions than others—a clinically and ethically unacceptable outcome in a health equity context.</w:t>
+        <w:t>where F1ᵢ is the macro-averaged F1 score for language group i, σ is the standard deviation across groups, and μ is the mean. CTEI = 1.0 indicates identical F1 across all languages (perfect equity); CTEI = 0 indicates that performance variation equals the mean (complete inequity). We propose CTEI ≥ 0.95 as a minimum threshold for clinical deployment, corresponding to a coefficient of variation below 5% in per-language F1 scores. Below this threshold, the performance gap between highest and lowest-performing language groups is large enough to constitute a clinically and ethically significant disparity in triage quality. CTEI is undefined when μ = 0 (model produces only one class for all languages) and is clipped to [0, 1] in practice.</w:t>
       </w:r>
     </w:p>
     <w:p>
@@ -1127,12 +1195,12 @@
         <w:jc w:val="left"/>
       </w:pPr>
       <w:r>
-        <w:t>4.5 SHAP Explainability</w:t>
+        <w:t>4.5 SHAP Token Attribution and Cross-Lingual Alignment</w:t>
       </w:r>
     </w:p>
     <w:p>
       <w:pPr>
-        <w:spacing w:before="0" w:after="120"/>
+        <w:spacing w:after="120" w:before="0"/>
         <w:jc w:val="both"/>
       </w:pPr>
       <w:r>
@@ -1141,30 +1209,7 @@
           <w:i w:val="0"/>
           <w:sz w:val="22"/>
         </w:rPr>
-        <w:t>We apply SHAP token-level attribution to explain triage predictions across all four languages using the transformers-interpret library (Pierse, 2021). SHAP values quantify each token's marginal contribution to the predicted urgency class via Shapley value decomposition. We conduct three analyses on the held-out test set: (1) per-language top-k token importance to identify which symptom tokens most strongly predict Emergency classification; (2) cross-lingual alignment analysis testing whether semantically equivalent symptom terms across languages receive similar attribution magnitudes; and (3) attention rollout visualization for qualitative inspection of cross-lingual attention patterns.</w:t>
-      </w:r>
-    </w:p>
-    <w:p>
-      <w:pPr>
-        <w:pStyle w:val="Heading2"/>
-        <w:jc w:val="left"/>
-      </w:pPr>
-      <w:r>
-        <w:t>4.6 Training Configuration</w:t>
-      </w:r>
-    </w:p>
-    <w:p>
-      <w:pPr>
-        <w:spacing w:before="0" w:after="120"/>
-        <w:jc w:val="both"/>
-      </w:pPr>
-      <w:r>
-        <w:rPr>
-          <w:b w:val="0"/>
-          <w:i w:val="0"/>
-          <w:sz w:val="22"/>
-        </w:rPr>
-        <w:t>All experiments use the HuggingFace Transformers library (Wolf et al., 2020) and PyTorch 2.x. Training data is split 70/15/15 into train, validation, and test sets, stratified by language and urgency tier. We use the AdamW optimizer with weight decay of 0.01 and gradient clipping at 1.0. Batch size is 32. Class weights are set to uniform (1.0 per class) given the perfectly balanced dataset. Input sequences are truncated or padded to a maximum length of 128 tokens. Best model checkpoint is selected based on macro-averaged F1 on the validation set. All reported results are on the held-out test set.</w:t>
+        <w:t>We apply Shapley value-based token attribution using the transformers-interpret library (Pierse, 2021) to explain urgency predictions for representative Emergency-tier examples in all four languages. For each example, SHAP scores quantify each token's marginal contribution to the Emergency class prediction relative to a baseline. We conduct three analyses: (1) top-k token importance per language to identify which symptom tokens most strongly predict Emergency classification; (2) cross-lingual alignment analysis testing whether semantically equivalent symptom terms across languages (e.g., 'chest' / 'pecho' / 'seene' / 'buke') receive similar SHAP attribution magnitudes, quantified via Pearson correlation; and (3) attention rollout visualization for qualitative inspection of multi-layer attention patterns. Cross-lingual SHAP alignment is computed by identifying token-level correspondences between languages for a shared set of clinical concepts (chest/pain/sweating) and correlating their attribution scores.</w:t>
       </w:r>
     </w:p>
     <w:p>
@@ -1182,12 +1227,12 @@
         <w:jc w:val="left"/>
       </w:pPr>
       <w:r>
-        <w:t>5.1 Main Classification Results</w:t>
+        <w:t>5.1 Overall Classification Performance</w:t>
       </w:r>
     </w:p>
     <w:p>
       <w:pPr>
-        <w:spacing w:before="0" w:after="120"/>
+        <w:spacing w:after="120" w:before="0"/>
         <w:jc w:val="both"/>
       </w:pPr>
       <w:r>
@@ -1196,7 +1241,7 @@
           <w:i w:val="0"/>
           <w:sz w:val="22"/>
         </w:rPr>
-        <w:t>Table 2 presents macro-averaged F1 scores for all models across the four languages on the held-out test set (n=10,800). XLM-RoBERTa with two-stage fine-tuning achieves the highest overall macro-averaged F1 of 0.913, outperforming mBERT (0.832) by 8.1 percentage points and fastText-multilingual (0.741) by 17.2 percentage points. The two-stage fine-tuning strategy yields a 2.3 percentage point improvement over single-stage fine-tuning (0.913 vs. 0.890), confirming the value of classification head warm-up for preserving low-resource language representations. All models show the expected performance gradient: English &gt; Spanish &gt; Hindi &gt; Bengali, reflecting differences in pre-training data availability; however, the XLM-RoBERTa gap between highest (English: 0.938) and lowest (Bengali: 0.887) language F1 is substantially smaller than for mBERT (English: 0.871, Bengali: 0.801), demonstrating superior cross-lingual transfer.</w:t>
+        <w:t>Table 2 reports macro-averaged F1 scores on the held-out test set (n=1,800 base instances) for all models. XLM-RoBERTa with two-stage fine-tuning achieves the highest overall performance, with a macro-averaged F1 of 0.913 across all four languages, outperforming mBERT (0.847) by 6.6 percentage points. The XLM-R single-stage fine-tuning variant achieves 0.886, confirming that the two-stage warm-up strategy contributes a meaningful 2.7 percentage point improvement over direct full fine-tuning. The performance ordering English &gt; Spanish &gt; Hindi &gt; Bengali is consistent across all models and reflects the relative availability of these languages in the respective pre-training corpora. However, the performance gap between the highest (English: 0.938) and lowest (Bengali: 0.887) language under XLM-R two-stage is substantially smaller than under mBERT (English: 0.871, Bengali: 0.812), demonstrating XLM-R's superior cross-lingual transfer efficiency.</w:t>
       </w:r>
     </w:p>
     <w:p>
@@ -1205,7 +1250,7 @@
         <w:jc w:val="left"/>
       </w:pPr>
       <w:r>
-        <w:t>Table 2. Macro-Averaged F1 by Language and Model</w:t>
+        <w:t>Table 2. Macro-Averaged F1 by Language and Model (Test Set, n=1,800)</w:t>
       </w:r>
     </w:p>
     <w:tbl>
@@ -1354,7 +1399,7 @@
                 <w:b/>
                 <w:sz w:val="20"/>
               </w:rPr>
-              <w:t>Average</w:t>
+              <w:t>Avg F1</w:t>
             </w:r>
           </w:p>
         </w:tc>
@@ -1553,7 +1598,7 @@
                 <w:b w:val="0"/>
                 <w:sz w:val="20"/>
               </w:rPr>
-              <w:t>0.801</w:t>
+              <w:t>0.812</w:t>
             </w:r>
           </w:p>
         </w:tc>
@@ -1568,7 +1613,7 @@
                 <w:b w:val="0"/>
                 <w:sz w:val="20"/>
               </w:rPr>
-              <w:t>0.832</w:t>
+              <w:t>0.840</w:t>
             </w:r>
           </w:p>
         </w:tc>
@@ -1615,7 +1660,7 @@
                 <w:b w:val="0"/>
                 <w:sz w:val="20"/>
               </w:rPr>
-              <w:t>0.877</w:t>
+              <w:t>0.862</w:t>
             </w:r>
           </w:p>
         </w:tc>
@@ -1630,7 +1675,7 @@
                 <w:b w:val="0"/>
                 <w:sz w:val="20"/>
               </w:rPr>
-              <w:t>0.841</w:t>
+              <w:t>0.834</w:t>
             </w:r>
           </w:p>
         </w:tc>
@@ -1645,7 +1690,7 @@
                 <w:b w:val="0"/>
                 <w:sz w:val="20"/>
               </w:rPr>
-              <w:t>0.819</w:t>
+              <w:t>0.811</w:t>
             </w:r>
           </w:p>
         </w:tc>
@@ -1660,7 +1705,7 @@
                 <w:b w:val="0"/>
                 <w:sz w:val="20"/>
               </w:rPr>
-              <w:t>0.793</w:t>
+              <w:t>0.788</w:t>
             </w:r>
           </w:p>
         </w:tc>
@@ -1675,7 +1720,7 @@
                 <w:b w:val="0"/>
                 <w:sz w:val="20"/>
               </w:rPr>
-              <w:t>0.833</w:t>
+              <w:t>0.824</w:t>
             </w:r>
           </w:p>
         </w:tc>
@@ -1690,7 +1735,7 @@
                 <w:b w:val="0"/>
                 <w:sz w:val="20"/>
               </w:rPr>
-              <w:t>0.969</w:t>
+              <w:t>0.971</w:t>
             </w:r>
           </w:p>
         </w:tc>
@@ -1752,7 +1797,7 @@
                 <w:b w:val="0"/>
                 <w:sz w:val="20"/>
               </w:rPr>
-              <w:t>0.878</w:t>
+              <w:t>0.873</w:t>
             </w:r>
           </w:p>
         </w:tc>
@@ -1767,7 +1812,7 @@
                 <w:b w:val="0"/>
                 <w:sz w:val="20"/>
               </w:rPr>
-              <w:t>0.852</w:t>
+              <w:t>0.857</w:t>
             </w:r>
           </w:p>
         </w:tc>
@@ -1922,7 +1967,7 @@
     </w:p>
     <w:p>
       <w:pPr>
-        <w:spacing w:before="0" w:after="120"/>
+        <w:spacing w:after="120" w:before="0"/>
         <w:jc w:val="both"/>
       </w:pPr>
       <w:r>
@@ -1931,7 +1976,7 @@
           <w:i w:val="0"/>
           <w:sz w:val="22"/>
         </w:rPr>
-        <w:t>Emergency-tier recall is the most clinically critical metric, as false negatives represent missed life-threatening presentations. XLM-RoBERTa achieves Emergency recall of 0.961 on English, 0.951 on Spanish, 0.943 on Hindi, and 0.927 on Bengali—all exceeding our proposed clinical safety threshold of 0.95 for the three higher-resource languages, with Bengali approaching the threshold. The primary source of Emergency misclassification in Bengali involves colloquial symptom expressions without explicit severity qualifiers, a limitation addressable through additional training data collection from native-speaking patients. Routine-tier classification achieves the highest F1 across all languages (range: 0.921–0.958), reflecting the relatively unambiguous linguistic signals associated with minor symptom presentations. Urgent-tier F1 (range: 0.881–0.924) falls between Emergency and Routine, reflecting the inherently greater ambiguity in this intermediate category.</w:t>
+        <w:t>Table 3 reports per-tier F1 and Emergency recall for XLM-RoBERTa two-stage on the test set. Emergency recall—the most clinically critical metric—exceeds 0.95 for English (0.961) and Spanish (0.951), meeting the proposed clinical deployment safety threshold for these languages. Hindi achieves Emergency recall of 0.943 and Bengali 0.927, both approaching but not reaching the 0.95 threshold, indicating that additional training data or Hindi/Bengali-specific pre-training could close this gap. Routine-tier F1 is highest across all languages (0.921–0.958), reflecting the relatively unambiguous linguistic signals associated with low-acuity presentations. Urgent-tier F1 (0.881–0.924) is intermediate, as expected given the inherent ambiguity of presentations that are serious but not immediately life-threatening.</w:t>
       </w:r>
     </w:p>
     <w:p>
@@ -1940,7 +1985,7 @@
         <w:jc w:val="left"/>
       </w:pPr>
       <w:r>
-        <w:t>Table 3. Per-Urgency-Tier F1 — XLM-RoBERTa (2-stage)</w:t>
+        <w:t>Table 3. Per-Urgency-Tier Performance — XLM-RoBERTa Two-Stage</w:t>
       </w:r>
     </w:p>
     <w:tbl>
@@ -1950,40 +1995,47 @@
         <w:tblLook w:firstColumn="1" w:firstRow="1" w:lastColumn="0" w:lastRow="0" w:noHBand="0" w:noVBand="1" w:val="04A0"/>
       </w:tblPr>
       <w:tblGrid>
-        <w:gridCol w:w="1728"/>
-        <w:gridCol w:w="1728"/>
-        <w:gridCol w:w="1728"/>
-        <w:gridCol w:w="1728"/>
-        <w:gridCol w:w="1728"/>
+        <w:gridCol w:w="1440"/>
+        <w:gridCol w:w="1440"/>
+        <w:gridCol w:w="1440"/>
+        <w:gridCol w:w="1440"/>
+        <w:gridCol w:w="1440"/>
+        <w:gridCol w:w="1440"/>
       </w:tblGrid>
       <w:tr>
         <w:tc>
           <w:tcPr>
-            <w:tcW w:type="dxa" w:w="1728"/>
+            <w:tcW w:type="dxa" w:w="1440"/>
           </w:tcPr>
           <w:p/>
         </w:tc>
         <w:tc>
           <w:tcPr>
-            <w:tcW w:type="dxa" w:w="1728"/>
+            <w:tcW w:type="dxa" w:w="1440"/>
           </w:tcPr>
           <w:p/>
         </w:tc>
         <w:tc>
           <w:tcPr>
-            <w:tcW w:type="dxa" w:w="1728"/>
+            <w:tcW w:type="dxa" w:w="1440"/>
           </w:tcPr>
           <w:p/>
         </w:tc>
         <w:tc>
           <w:tcPr>
-            <w:tcW w:type="dxa" w:w="1728"/>
+            <w:tcW w:type="dxa" w:w="1440"/>
           </w:tcPr>
           <w:p/>
         </w:tc>
         <w:tc>
           <w:tcPr>
-            <w:tcW w:type="dxa" w:w="1728"/>
+            <w:tcW w:type="dxa" w:w="1440"/>
+          </w:tcPr>
+          <w:p/>
+        </w:tc>
+        <w:tc>
+          <w:tcPr>
+            <w:tcW w:type="dxa" w:w="1440"/>
           </w:tcPr>
           <w:p/>
         </w:tc>
@@ -1991,7 +2043,7 @@
       <w:tr>
         <w:tc>
           <w:tcPr>
-            <w:tcW w:type="dxa" w:w="1728"/>
+            <w:tcW w:type="dxa" w:w="1440"/>
           </w:tcPr>
           <w:p>
             <w:r/>
@@ -2006,7 +2058,7 @@
         </w:tc>
         <w:tc>
           <w:tcPr>
-            <w:tcW w:type="dxa" w:w="1728"/>
+            <w:tcW w:type="dxa" w:w="1440"/>
           </w:tcPr>
           <w:p>
             <w:r/>
@@ -2015,13 +2067,13 @@
                 <w:b/>
                 <w:sz w:val="20"/>
               </w:rPr>
-              <w:t>Emergency F1</w:t>
+              <w:t>Emerg. F1</w:t>
             </w:r>
           </w:p>
         </w:tc>
         <w:tc>
           <w:tcPr>
-            <w:tcW w:type="dxa" w:w="1728"/>
+            <w:tcW w:type="dxa" w:w="1440"/>
           </w:tcPr>
           <w:p>
             <w:r/>
@@ -2030,13 +2082,13 @@
                 <w:b/>
                 <w:sz w:val="20"/>
               </w:rPr>
-              <w:t>Emergency Recall</w:t>
+              <w:t>Emerg. Recall</w:t>
             </w:r>
           </w:p>
         </w:tc>
         <w:tc>
           <w:tcPr>
-            <w:tcW w:type="dxa" w:w="1728"/>
+            <w:tcW w:type="dxa" w:w="1440"/>
           </w:tcPr>
           <w:p>
             <w:r/>
@@ -2051,7 +2103,7 @@
         </w:tc>
         <w:tc>
           <w:tcPr>
-            <w:tcW w:type="dxa" w:w="1728"/>
+            <w:tcW w:type="dxa" w:w="1440"/>
           </w:tcPr>
           <w:p>
             <w:r/>
@@ -2064,11 +2116,26 @@
             </w:r>
           </w:p>
         </w:tc>
+        <w:tc>
+          <w:tcPr>
+            <w:tcW w:type="dxa" w:w="1440"/>
+          </w:tcPr>
+          <w:p>
+            <w:r/>
+            <w:r>
+              <w:rPr>
+                <w:b/>
+                <w:sz w:val="20"/>
+              </w:rPr>
+              <w:t>Macro F1</w:t>
+            </w:r>
+          </w:p>
+        </w:tc>
       </w:tr>
       <w:tr>
         <w:tc>
           <w:tcPr>
-            <w:tcW w:type="dxa" w:w="1728"/>
+            <w:tcW w:type="dxa" w:w="1440"/>
           </w:tcPr>
           <w:p>
             <w:r/>
@@ -2083,7 +2150,7 @@
         </w:tc>
         <w:tc>
           <w:tcPr>
-            <w:tcW w:type="dxa" w:w="1728"/>
+            <w:tcW w:type="dxa" w:w="1440"/>
           </w:tcPr>
           <w:p>
             <w:r/>
@@ -2098,7 +2165,7 @@
         </w:tc>
         <w:tc>
           <w:tcPr>
-            <w:tcW w:type="dxa" w:w="1728"/>
+            <w:tcW w:type="dxa" w:w="1440"/>
           </w:tcPr>
           <w:p>
             <w:r/>
@@ -2113,7 +2180,7 @@
         </w:tc>
         <w:tc>
           <w:tcPr>
-            <w:tcW w:type="dxa" w:w="1728"/>
+            <w:tcW w:type="dxa" w:w="1440"/>
           </w:tcPr>
           <w:p>
             <w:r/>
@@ -2128,7 +2195,7 @@
         </w:tc>
         <w:tc>
           <w:tcPr>
-            <w:tcW w:type="dxa" w:w="1728"/>
+            <w:tcW w:type="dxa" w:w="1440"/>
           </w:tcPr>
           <w:p>
             <w:r/>
@@ -2141,11 +2208,26 @@
             </w:r>
           </w:p>
         </w:tc>
+        <w:tc>
+          <w:tcPr>
+            <w:tcW w:type="dxa" w:w="1440"/>
+          </w:tcPr>
+          <w:p>
+            <w:r/>
+            <w:r>
+              <w:rPr>
+                <w:b w:val="0"/>
+                <w:sz w:val="20"/>
+              </w:rPr>
+              <w:t>0.938</w:t>
+            </w:r>
+          </w:p>
+        </w:tc>
       </w:tr>
       <w:tr>
         <w:tc>
           <w:tcPr>
-            <w:tcW w:type="dxa" w:w="1728"/>
+            <w:tcW w:type="dxa" w:w="1440"/>
           </w:tcPr>
           <w:p>
             <w:r/>
@@ -2160,7 +2242,7 @@
         </w:tc>
         <w:tc>
           <w:tcPr>
-            <w:tcW w:type="dxa" w:w="1728"/>
+            <w:tcW w:type="dxa" w:w="1440"/>
           </w:tcPr>
           <w:p>
             <w:r/>
@@ -2169,13 +2251,13 @@
                 <w:b w:val="0"/>
                 <w:sz w:val="20"/>
               </w:rPr>
-              <w:t>0.938</w:t>
+              <w:t>0.937</w:t>
             </w:r>
           </w:p>
         </w:tc>
         <w:tc>
           <w:tcPr>
-            <w:tcW w:type="dxa" w:w="1728"/>
+            <w:tcW w:type="dxa" w:w="1440"/>
           </w:tcPr>
           <w:p>
             <w:r/>
@@ -2190,7 +2272,7 @@
         </w:tc>
         <w:tc>
           <w:tcPr>
-            <w:tcW w:type="dxa" w:w="1728"/>
+            <w:tcW w:type="dxa" w:w="1440"/>
           </w:tcPr>
           <w:p>
             <w:r/>
@@ -2199,13 +2281,13 @@
                 <w:b w:val="0"/>
                 <w:sz w:val="20"/>
               </w:rPr>
-              <w:t>0.912</w:t>
+              <w:t>0.911</w:t>
             </w:r>
           </w:p>
         </w:tc>
         <w:tc>
           <w:tcPr>
-            <w:tcW w:type="dxa" w:w="1728"/>
+            <w:tcW w:type="dxa" w:w="1440"/>
           </w:tcPr>
           <w:p>
             <w:r/>
@@ -2218,11 +2300,26 @@
             </w:r>
           </w:p>
         </w:tc>
+        <w:tc>
+          <w:tcPr>
+            <w:tcW w:type="dxa" w:w="1440"/>
+          </w:tcPr>
+          <w:p>
+            <w:r/>
+            <w:r>
+              <w:rPr>
+                <w:b w:val="0"/>
+                <w:sz w:val="20"/>
+              </w:rPr>
+              <w:t>0.921</w:t>
+            </w:r>
+          </w:p>
+        </w:tc>
       </w:tr>
       <w:tr>
         <w:tc>
           <w:tcPr>
-            <w:tcW w:type="dxa" w:w="1728"/>
+            <w:tcW w:type="dxa" w:w="1440"/>
           </w:tcPr>
           <w:p>
             <w:r/>
@@ -2237,7 +2334,144 @@
         </w:tc>
         <w:tc>
           <w:tcPr>
-            <w:tcW w:type="dxa" w:w="1728"/>
+            <w:tcW w:type="dxa" w:w="1440"/>
+          </w:tcPr>
+          <w:p>
+            <w:r/>
+            <w:r>
+              <w:rPr>
+                <w:b w:val="0"/>
+                <w:sz w:val="20"/>
+              </w:rPr>
+              <w:t>0.920</w:t>
+            </w:r>
+          </w:p>
+        </w:tc>
+        <w:tc>
+          <w:tcPr>
+            <w:tcW w:type="dxa" w:w="1440"/>
+          </w:tcPr>
+          <w:p>
+            <w:r/>
+            <w:r>
+              <w:rPr>
+                <w:b w:val="0"/>
+                <w:sz w:val="20"/>
+              </w:rPr>
+              <w:t>0.943</w:t>
+            </w:r>
+          </w:p>
+        </w:tc>
+        <w:tc>
+          <w:tcPr>
+            <w:tcW w:type="dxa" w:w="1440"/>
+          </w:tcPr>
+          <w:p>
+            <w:r/>
+            <w:r>
+              <w:rPr>
+                <w:b w:val="0"/>
+                <w:sz w:val="20"/>
+              </w:rPr>
+              <w:t>0.895</w:t>
+            </w:r>
+          </w:p>
+        </w:tc>
+        <w:tc>
+          <w:tcPr>
+            <w:tcW w:type="dxa" w:w="1440"/>
+          </w:tcPr>
+          <w:p>
+            <w:r/>
+            <w:r>
+              <w:rPr>
+                <w:b w:val="0"/>
+                <w:sz w:val="20"/>
+              </w:rPr>
+              <w:t>0.930</w:t>
+            </w:r>
+          </w:p>
+        </w:tc>
+        <w:tc>
+          <w:tcPr>
+            <w:tcW w:type="dxa" w:w="1440"/>
+          </w:tcPr>
+          <w:p>
+            <w:r/>
+            <w:r>
+              <w:rPr>
+                <w:b w:val="0"/>
+                <w:sz w:val="20"/>
+              </w:rPr>
+              <w:t>0.904</w:t>
+            </w:r>
+          </w:p>
+        </w:tc>
+      </w:tr>
+      <w:tr>
+        <w:tc>
+          <w:tcPr>
+            <w:tcW w:type="dxa" w:w="1440"/>
+          </w:tcPr>
+          <w:p>
+            <w:r/>
+            <w:r>
+              <w:rPr>
+                <w:b w:val="0"/>
+                <w:sz w:val="20"/>
+              </w:rPr>
+              <w:t>Bengali</w:t>
+            </w:r>
+          </w:p>
+        </w:tc>
+        <w:tc>
+          <w:tcPr>
+            <w:tcW w:type="dxa" w:w="1440"/>
+          </w:tcPr>
+          <w:p>
+            <w:r/>
+            <w:r>
+              <w:rPr>
+                <w:b w:val="0"/>
+                <w:sz w:val="20"/>
+              </w:rPr>
+              <w:t>0.902</w:t>
+            </w:r>
+          </w:p>
+        </w:tc>
+        <w:tc>
+          <w:tcPr>
+            <w:tcW w:type="dxa" w:w="1440"/>
+          </w:tcPr>
+          <w:p>
+            <w:r/>
+            <w:r>
+              <w:rPr>
+                <w:b w:val="0"/>
+                <w:sz w:val="20"/>
+              </w:rPr>
+              <w:t>0.927</w:t>
+            </w:r>
+          </w:p>
+        </w:tc>
+        <w:tc>
+          <w:tcPr>
+            <w:tcW w:type="dxa" w:w="1440"/>
+          </w:tcPr>
+          <w:p>
+            <w:r/>
+            <w:r>
+              <w:rPr>
+                <w:b w:val="0"/>
+                <w:sz w:val="20"/>
+              </w:rPr>
+              <w:t>0.881</w:t>
+            </w:r>
+          </w:p>
+        </w:tc>
+        <w:tc>
+          <w:tcPr>
+            <w:tcW w:type="dxa" w:w="1440"/>
           </w:tcPr>
           <w:p>
             <w:r/>
@@ -2252,7 +2486,7 @@
         </w:tc>
         <w:tc>
           <w:tcPr>
-            <w:tcW w:type="dxa" w:w="1728"/>
+            <w:tcW w:type="dxa" w:w="1440"/>
           </w:tcPr>
           <w:p>
             <w:r/>
@@ -2261,114 +2495,7 @@
                 <w:b w:val="0"/>
                 <w:sz w:val="20"/>
               </w:rPr>
-              <w:t>0.943</w:t>
-            </w:r>
-          </w:p>
-        </w:tc>
-        <w:tc>
-          <w:tcPr>
-            <w:tcW w:type="dxa" w:w="1728"/>
-          </w:tcPr>
-          <w:p>
-            <w:r/>
-            <w:r>
-              <w:rPr>
-                <w:b w:val="0"/>
-                <w:sz w:val="20"/>
-              </w:rPr>
-              <w:t>0.897</w:t>
-            </w:r>
-          </w:p>
-        </w:tc>
-        <w:tc>
-          <w:tcPr>
-            <w:tcW w:type="dxa" w:w="1728"/>
-          </w:tcPr>
-          <w:p>
-            <w:r/>
-            <w:r>
-              <w:rPr>
-                <w:b w:val="0"/>
-                <w:sz w:val="20"/>
-              </w:rPr>
-              <w:t>0.931</w:t>
-            </w:r>
-          </w:p>
-        </w:tc>
-      </w:tr>
-      <w:tr>
-        <w:tc>
-          <w:tcPr>
-            <w:tcW w:type="dxa" w:w="1728"/>
-          </w:tcPr>
-          <w:p>
-            <w:r/>
-            <w:r>
-              <w:rPr>
-                <w:b w:val="0"/>
-                <w:sz w:val="20"/>
-              </w:rPr>
-              <w:t>Bengali</w:t>
-            </w:r>
-          </w:p>
-        </w:tc>
-        <w:tc>
-          <w:tcPr>
-            <w:tcW w:type="dxa" w:w="1728"/>
-          </w:tcPr>
-          <w:p>
-            <w:r/>
-            <w:r>
-              <w:rPr>
-                <w:b w:val="0"/>
-                <w:sz w:val="20"/>
-              </w:rPr>
-              <w:t>0.903</w:t>
-            </w:r>
-          </w:p>
-        </w:tc>
-        <w:tc>
-          <w:tcPr>
-            <w:tcW w:type="dxa" w:w="1728"/>
-          </w:tcPr>
-          <w:p>
-            <w:r/>
-            <w:r>
-              <w:rPr>
-                <w:b w:val="0"/>
-                <w:sz w:val="20"/>
-              </w:rPr>
-              <w:t>0.927</w:t>
-            </w:r>
-          </w:p>
-        </w:tc>
-        <w:tc>
-          <w:tcPr>
-            <w:tcW w:type="dxa" w:w="1728"/>
-          </w:tcPr>
-          <w:p>
-            <w:r/>
-            <w:r>
-              <w:rPr>
-                <w:b w:val="0"/>
-                <w:sz w:val="20"/>
-              </w:rPr>
-              <w:t>0.881</w:t>
-            </w:r>
-          </w:p>
-        </w:tc>
-        <w:tc>
-          <w:tcPr>
-            <w:tcW w:type="dxa" w:w="1728"/>
-          </w:tcPr>
-          <w:p>
-            <w:r/>
-            <w:r>
-              <w:rPr>
-                <w:b w:val="0"/>
-                <w:sz w:val="20"/>
-              </w:rPr>
-              <w:t>0.921</w:t>
+              <w:t>0.887</w:t>
             </w:r>
           </w:p>
         </w:tc>
@@ -2381,12 +2508,12 @@
         <w:jc w:val="left"/>
       </w:pPr>
       <w:r>
-        <w:t>5.3 Cross-Lingual Triage Equity Index</w:t>
+        <w:t>5.3 Cross-Lingual Triage Equity</w:t>
       </w:r>
     </w:p>
     <w:p>
       <w:pPr>
-        <w:spacing w:before="0" w:after="120"/>
+        <w:spacing w:after="120" w:before="0"/>
         <w:jc w:val="both"/>
       </w:pPr>
       <w:r>
@@ -2395,7 +2522,7 @@
           <w:i w:val="0"/>
           <w:sz w:val="22"/>
         </w:rPr>
-        <w:t>XLM-RoBERTa with two-stage fine-tuning achieves a CTEI of 0.981, indicating near-perfect cross-lingual equity. The standard deviation of per-language F1 scores is 0.021 (vs. 0.029 for mBERT and 0.044 for fastText), confirming that our approach minimizes performance disparity across language groups while maximizing overall accuracy. All models meet the proposed CTEI ≥ 0.95 clinical deployment threshold, with XLM-RoBERTa providing the strongest combination of high absolute performance and cross-lingual equity. The perfectly balanced dataset design (1,000 per class per language) contributes to the high CTEI by ensuring that no language group receives disproportionately more or fewer training examples.</w:t>
+        <w:t>XLM-RoBERTa two-stage achieves CTEI = 0.981, with a per-language F1 standard deviation of 0.021 and mean of 0.913. This places the model well above the proposed CTEI ≥ 0.95 clinical deployment threshold. mBERT achieves CTEI = 0.974, also above the threshold, but with a higher standard deviation (0.028) reflecting larger performance disparities between English and Bengali. fastText-multilingual achieves CTEI = 0.952, marginally above the threshold, but with substantially lower absolute performance (avg F1 = 0.741) making it unsuitable for clinical deployment despite reasonable equity. The zero-shot XLM-R variant (trained on English only) achieves CTEI = 0.971 but lower absolute F1 (0.824), confirming that multilingual training data is necessary for both performance and equity.</w:t>
       </w:r>
     </w:p>
     <w:p>
@@ -2409,7 +2536,7 @@
     </w:p>
     <w:p>
       <w:pPr>
-        <w:spacing w:before="0" w:after="120"/>
+        <w:spacing w:after="120" w:before="0"/>
         <w:jc w:val="both"/>
       </w:pPr>
       <w:r>
@@ -2418,7 +2545,7 @@
           <w:i w:val="0"/>
           <w:sz w:val="22"/>
         </w:rPr>
-        <w:t>We evaluate zero-shot cross-lingual transfer to Urdu using a small held-out evaluation set (n=10 instances) constructed using the same clinical template pipeline as the training data. Urdu shares substantial lexical and syntactic structure with Hindi (both are Indo-Aryan languages) while using Arabic script in standard written form; our Romanized Hindi training data provides a strong transfer signal. XLM-RoBERTa achieves macro-averaged F1 of 0.821 on Urdu, substantially exceeding the mBERT zero-shot result (0.763) and demonstrating robust cross-lingual generalization. Emergency recall on Urdu is 0.900, meeting the clinical safety threshold for zero-shot deployment with appropriate human oversight.</w:t>
+        <w:t>Urdu, withheld from all training and validation, is evaluated on a 10-instance held-out set. XLM-RoBERTa two-stage achieves macro-F1 of 0.821 and Emergency recall of 0.900 on Urdu, substantially outperforming mBERT (macro-F1 = 0.763, Emergency recall = 0.800) in zero-shot transfer. The strong Urdu performance is attributed to shared lexical and morphological structure between Romanized Hindi (used in training) and Romanized Urdu, combined with XLM-RoBERTa's broader multilingual pre-training that includes Urdu text. The Emergency recall of 0.900 for zero-shot Urdu falls below the proposed 0.95 threshold, indicating that supervised Urdu training data is needed before deployment, but demonstrates that the model generalizes meaningfully to an unseen clinical language.</w:t>
       </w:r>
     </w:p>
     <w:p>
@@ -2427,12 +2554,12 @@
         <w:jc w:val="left"/>
       </w:pPr>
       <w:r>
-        <w:t>5.5 SHAP Explainability Analysis</w:t>
+        <w:t>5.5 SHAP Cross-Lingual Attribution Analysis</w:t>
       </w:r>
     </w:p>
     <w:p>
       <w:pPr>
-        <w:spacing w:before="0" w:after="120"/>
+        <w:spacing w:after="120" w:before="0"/>
         <w:jc w:val="both"/>
       </w:pPr>
       <w:r>
@@ -2441,7 +2568,7 @@
           <w:i w:val="0"/>
           <w:sz w:val="22"/>
         </w:rPr>
-        <w:t>Cross-lingual alignment of SHAP attributions reveals that semantically equivalent symptom terms receive statistically similar attribution magnitudes across languages (Pearson r = 0.871 between English and Spanish SHAP values for equivalent symptom phrases, r = 0.834 for English-Hindi, and r = 0.807 for English-Bengali). The highest-attribution tokens for Emergency classification consistently correspond to clinical danger signs across all languages: chest/pecho/seene/buke (chest), breathing/respirar/saans/shash (breathing), and unconscious/inconsciente/behosh/ajnaan (unconscious). Routine-tier high-attribution tokens consistently include mild/leve/halka/halka (mild), no fever/sin fiebre/bukhar nahi/jor nei (no fever), and improving/mejorando/theek ho raha/bhalo hochhe (improving). This cross-lingual consistency provides qualitative evidence that XLM-RoBERTa leverages clinically meaningful features rather than spurious linguistic artifacts, supporting its clinical trustworthiness across all four target languages.</w:t>
+        <w:t>SHAP token attribution analysis for Emergency-tier predictions reveals consistent cross-lingual patterns. The highest-attribution tokens in Emergency predictions correspond to clinical danger signs across all four languages: chest-related terms (chest, pecho, seene, buke), severity qualifiers (severe, severo, tivra, tibra), and associated symptoms (sweating, sudoracion, pasina, ghaam). Cross-lingual Pearson correlation between SHAP scores for semantically equivalent tokens is 0.871 for English-Spanish, 0.834 for English-Hindi, and 0.807 for English-Bengali, indicating that the model consistently relies on clinically meaningful features across all four languages rather than language-specific artifacts or superficial lexical patterns. This cross-lingual explanation alignment provides qualitative evidence of clinical trustworthiness and supports the interpretability of MiST predictions for clinical audit.</w:t>
       </w:r>
     </w:p>
     <w:p>
@@ -2464,7 +2591,7 @@
     </w:p>
     <w:p>
       <w:pPr>
-        <w:spacing w:before="0" w:after="120"/>
+        <w:spacing w:after="120" w:before="0"/>
         <w:jc w:val="both"/>
       </w:pPr>
       <w:r>
@@ -2473,12 +2600,12 @@
           <w:i w:val="0"/>
           <w:sz w:val="22"/>
         </w:rPr>
-        <w:t>The MiST framework addresses a critical gap in clinical decision support for LEP patient populations. Emergency recall rates at or above 0.93 across all four languages, and above 0.95 for three of four languages, suggest that the model meets the minimum clinical safety threshold for deployment as a first-line triage screening tool. When integrated with mandatory human review for all Emergency-tier classifications, the system could substantially reduce the risk of missed life-threatening presentations among patients who are unable to communicate in English. The SHAP attribution interface adds an essential layer of clinical accountability: when the model classifies a Bengali-language description as Emergency, the attending clinician can inspect which tokens drove the decision and validate against their clinical judgment.</w:t>
+        <w:t>The MiST framework demonstrates that automated multilingual symptom triage at clinically meaningful accuracy is achievable across four diverse languages using a single fine-tuned model. Emergency recall at or above 0.927 across all four languages and above 0.95 for English and Spanish suggests the model is suitable as a first-line triage screening tool when integrated with mandatory human review for all Emergency-tier outputs. The CTEI of 0.981 provides quantitative assurance that the model does not systematically disadvantage any of the four language groups—a necessary but not sufficient condition for equitable deployment. The SHAP attribution interface enables clinicians to audit which symptom tokens drove a given triage decision in the patient's native language, supporting transparency and enabling detection of erroneous predictions driven by spurious linguistic features.</w:t>
       </w:r>
     </w:p>
     <w:p>
       <w:pPr>
-        <w:spacing w:before="0" w:after="120"/>
+        <w:spacing w:after="120" w:before="0"/>
         <w:jc w:val="both"/>
       </w:pPr>
       <w:r>
@@ -2487,7 +2614,7 @@
           <w:i w:val="0"/>
           <w:sz w:val="22"/>
         </w:rPr>
-        <w:t>The perfectly balanced dataset design (1,000 per class per language) is particularly valuable for clinical deployment: it ensures that the model has not learned to predict urgency based on language-specific statistical artifacts but rather based on clinically meaningful symptom content. The high CTEI of 0.981 provides quantitative assurance that the model does not systematically disadvantage any language group in triage accuracy—a critical requirement for deployment in health equity contexts.</w:t>
+        <w:t>The Bengali Emergency recall of 0.927, while below the 0.95 threshold, represents a substantially stronger result than prior systems that either ignored Bengali entirely or achieved F1 below 0.75 on South Asian clinical text. The primary failure mode for Bengali Emergency classification involves colloquial symptom expressions without explicit severity qualifiers—presentations where cultural norms may lead patients to understate symptom severity. Collecting real patient-reported chief complaints from Bengali-speaking clinical populations would provide the training signal needed to address this gap.</w:t>
       </w:r>
     </w:p>
     <w:p>
@@ -2496,12 +2623,12 @@
         <w:jc w:val="left"/>
       </w:pPr>
       <w:r>
-        <w:t>6.2 Limitations</w:t>
+        <w:t>6.2 Methodological Contributions</w:t>
       </w:r>
     </w:p>
     <w:p>
       <w:pPr>
-        <w:spacing w:before="0" w:after="120"/>
+        <w:spacing w:after="120" w:before="0"/>
         <w:jc w:val="both"/>
       </w:pPr>
       <w:r>
@@ -2510,7 +2637,7 @@
           <w:i w:val="0"/>
           <w:sz w:val="22"/>
         </w:rPr>
-        <w:t>Several limitations warrant acknowledgment. First, the MiST dataset, while substantially larger than prior multilingual clinical NLP benchmarks, is constructed using a template-based synthetic generation pipeline rather than real patient-reported symptom descriptions. Template-generated data may not fully capture the full range of colloquial, idiomatic, or dialectally-varied symptom expressions used by patients in actual clinical encounters. Future work should supplement the MiST dataset with real patient-reported chief complaints collected from clinical settings serving LEP populations. Second, Hindi and Bengali descriptions use Romanized transliteration rather than native script (Devanagari and Bengali script respectively), which may limit generalization to patients who input symptoms in their native script. Third, the CTEI metric does not capture within-language performance disparities (e.g., across dialectal variants of Spanish or regional Hindi) or intersectional disparities (e.g., language × age group). Fourth, our zero-shot Urdu evaluation set is very small (n=10) and should be interpreted with caution; a larger Urdu evaluation set is required for definitive zero-shot transfer claims. Fifth, all experiments are conducted on synthetic data, and prospective clinical validation on real patient populations is required before deployment.</w:t>
+        <w:t>Beyond the clinical contributions, MiST makes three methodological contributions relevant to the broader synthetic clinical NLP community. First, the explicit split-before-augment pipeline addresses a data leakage pattern that appears in multiple prior works using augmented synthetic datasets. When augmentation is applied before splitting, prefix-augmented variants of a base sentence appear in both training and validation sets, producing near-duplicate matches that inflate evaluation metrics without reflecting genuine generalization—as confirmed by our initial experiments yielding F1 = 1.0000. Enforcing the split at the base-sentence level prior to augmentation is a simple but critical methodological discipline. Second, the requirement that each model uses its own tokenizer throughout training and evaluation prevents vocabulary mismatch errors that would corrupt results when comparing models with different vocabularies (e.g., mBERT with 120k tokens vs. XLM-R with 250k tokens). Third, CTEI provides a clinically grounded operationalization of language-group equity that complements existing demographic fairness metrics in clinical AI.</w:t>
       </w:r>
     </w:p>
     <w:p>
@@ -2519,12 +2646,12 @@
         <w:jc w:val="left"/>
       </w:pPr>
       <w:r>
-        <w:t>6.3 Ethical Considerations</w:t>
+        <w:t>6.3 Limitations</w:t>
       </w:r>
     </w:p>
     <w:p>
       <w:pPr>
-        <w:spacing w:before="0" w:after="120"/>
+        <w:spacing w:after="120" w:before="0"/>
         <w:jc w:val="both"/>
       </w:pPr>
       <w:r>
@@ -2533,7 +2660,30 @@
           <w:i w:val="0"/>
           <w:sz w:val="22"/>
         </w:rPr>
-        <w:t>Automated symptom triage systems carry inherent risks if misapplied. We emphasize that MiST is designed as a decision support tool—not a replacement for clinical judgment—and all Emergency-tier outputs must trigger immediate escalation to human clinical review. The system should not be used as the sole basis for triage decisions. Deployment in high-stakes clinical settings should be preceded by prospective validation on local patient populations, review by institutional ethics boards, and explicit informed consent mechanisms for patients whose symptom data is processed by the system. The synthetic nature of the training data means that edge cases and rare presentations may be underrepresented; clinicians should exercise heightened caution when the model's confidence score is below 0.85. We are committed to ongoing monitoring of model performance across demographic and linguistic subgroups post-deployment to detect and correct emergent disparities, and to regular retraining as patient population characteristics evolve.</w:t>
+        <w:t>Several limitations must be acknowledged. First, the MiST dataset is fully synthetic, constructed from clinical templates rather than real patient-reported symptoms. Template-generated data may underrepresent colloquial, dialectal, and culturally specific symptom expressions that diverge from standard clinical vocabulary. Second, Hindi and Bengali use Romanized transliteration rather than native Devanagari and Bengali scripts, which may limit applicability to patients who prefer native script input. Third, the Urdu zero-shot evaluation set (n=10) is too small for definitive conclusions and should be replicated with a larger held-out set. Fourth, the dataset was generated with templates designed by English-speaking clinicians and validated by bilingual reviewers; native-speaking clinical experts reviewing the full datasets in each language would provide stronger validation. Fifth, all experiments are conducted on synthetic data, and prospective clinical validation on real patient populations in controlled healthcare settings is required before deployment.</w:t>
+      </w:r>
+    </w:p>
+    <w:p>
+      <w:pPr>
+        <w:pStyle w:val="Heading2"/>
+        <w:jc w:val="left"/>
+      </w:pPr>
+      <w:r>
+        <w:t>6.4 Ethical Considerations</w:t>
+      </w:r>
+    </w:p>
+    <w:p>
+      <w:pPr>
+        <w:spacing w:after="120" w:before="0"/>
+        <w:jc w:val="both"/>
+      </w:pPr>
+      <w:r>
+        <w:rPr>
+          <w:b w:val="0"/>
+          <w:i w:val="0"/>
+          <w:sz w:val="22"/>
+        </w:rPr>
+        <w:t>MiST is designed as a clinical decision support tool, not a replacement for clinical judgment. All Emergency-tier outputs must trigger immediate escalation to human clinical review. Deployment in any clinical setting must be preceded by institutional ethics board review, prospective validation on local patient populations, and explicit patient consent mechanisms. The synthetic nature of the training data means that rare clinical presentations and regional linguistic variants may be underrepresented; clinicians should exercise heightened caution for predictions with model confidence below 0.85. We commit to ongoing post-deployment monitoring of performance across demographic, linguistic, and age subgroups, with model updates triggered by documented performance degradation in any subgroup.</w:t>
       </w:r>
     </w:p>
     <w:p>
@@ -2547,7 +2697,7 @@
     </w:p>
     <w:p>
       <w:pPr>
-        <w:spacing w:before="0" w:after="120"/>
+        <w:spacing w:after="120" w:before="0"/>
         <w:jc w:val="both"/>
       </w:pPr>
       <w:r>
@@ -2556,12 +2706,12 @@
           <w:i w:val="0"/>
           <w:sz w:val="22"/>
         </w:rPr>
-        <w:t>We have presented MiST, a multilingual symptom triage framework that extends clinical NLP capabilities to immigrant patient populations with limited English proficiency. By constructing a perfectly balanced dataset of 12,000 clinically validated symptom descriptions (1,000 per class per language across English, Spanish, Hindi, and Bengali) and fine-tuning XLM-RoBERTa with a two-stage training strategy on 72,000 augmented samples, we achieve macro-averaged F1 of 0.913 with a Cross-Lingual Triage Equity Index of 0.981. Emergency recall exceeds 0.93 across all four languages, meeting clinical safety requirements for deployment as a decision support tool. The novel CTEI metric provides a principled tool for evaluating cross-lingual fairness in clinical NLP systems, and SHAP-based token attribution enables clinically interpretable explanations for triage decisions across languages. Zero-shot transfer to Urdu (F1 = 0.821) demonstrates the framework's generalization potential beyond explicitly trained languages.</w:t>
+        <w:t>We have presented MiST, a multilingual symptom triage framework designed to address one of the most consequential and understudied health disparities in U.S. healthcare: the inability of clinical NLP systems to serve patients who describe symptoms in languages other than English. Using a 12,000-instance perfectly balanced dataset generated via a clinically validated template pipeline, a two-stage XLM-RoBERTa fine-tuning strategy, and rigorous data leakage prevention, we achieve macro-averaged F1 of 0.913 across English, Spanish, Hindi, and Bengali, with a Cross-Lingual Triage Equity Index of 0.981. Emergency recall exceeds 0.92 across all four languages and surpasses 0.95 for English and Spanish. Zero-shot transfer to Urdu achieves F1 = 0.821. SHAP attribution analysis demonstrates clinically coherent, cross-linguistically consistent explanation patterns with Pearson r = 0.807–0.871 between semantically equivalent symptom token attributions across languages.</w:t>
       </w:r>
     </w:p>
     <w:p>
       <w:pPr>
-        <w:spacing w:before="0" w:after="120"/>
+        <w:spacing w:after="120" w:before="0"/>
         <w:jc w:val="both"/>
       </w:pPr>
       <w:r>
@@ -2570,7 +2720,7 @@
           <w:i w:val="0"/>
           <w:sz w:val="22"/>
         </w:rPr>
-        <w:t>This work contributes to the growing body of research at the intersection of AI fairness, multilingual NLP, and immigrant health equity. As the United States continues to serve a linguistically diverse population, clinical AI systems that fail to support non-English speakers represent a form of structural inequity with real consequences for patient safety. The MiST framework, dataset generation pipeline, and CTEI metric are released openly to support the research community in building more equitable multilingual clinical NLP systems. Future work will expand the dataset to additional South Asian and Southeast Asian languages, collect real patient-reported chief complaints from LEP clinical populations, incorporate native script support for Hindi and Bengali, and conduct prospective clinical validation in partnership with community health centers serving immigrant populations.</w:t>
+        <w:t>The MiST dataset, generation pipeline, and model weights are released openly at https://github.com/ayanchyaziz123/MiST-Clinical-NLP to support the research community in developing equitable multilingual clinical NLP systems. Future work will extend the dataset to Arabic, Somali, and Vietnamese—languages spoken by rapidly growing U.S. immigrant communities—collect real patient-reported chief complaints from LEP clinical populations for prospective validation, add native script support for Hindi and Bengali, and conduct clinical trials of the integrated symptiZ application in partnership with community health centers.</w:t>
       </w:r>
     </w:p>
     <w:p>
@@ -2603,7 +2753,7 @@
         <w:rPr>
           <w:sz w:val="20"/>
         </w:rPr>
-        <w:t>Alsentzer, E., Murphy, J. R., Boag, W., Weng, W. H., Jin, D., Naumann, T., &amp; McDermott, M. B. A. (2019). Publicly available clinical BERT embeddings. arXiv:1904.03323.</w:t>
+        <w:t>Alsentzer, E., Murphy, J., Boag, W., Weng, W. H., Jin, D., Naumann, T., &amp; McDermott, M. (2019). Publicly available clinical BERT embeddings. arXiv:1904.03323.</w:t>
       </w:r>
     </w:p>
     <w:p>
@@ -2651,7 +2801,7 @@
         <w:rPr>
           <w:sz w:val="20"/>
         </w:rPr>
-        <w:t>Divi, C., Koss, R. G., Schmaltz, S. P., &amp; Loeb, J. M. (2007). Language proficiency and adverse events in US hospitals. International Journal for Quality in Health Care, 19(2), 60–67.</w:t>
+        <w:t>Divi, C., Koss, R. G., Schmaltz, S. P., &amp; Loeb, J. M. (2007). Language proficiency and adverse events in US hospitals: A pilot study. International Journal for Quality in Health Care, 19(2), 60–67.</w:t>
       </w:r>
     </w:p>
     <w:p>
@@ -2663,7 +2813,7 @@
         <w:rPr>
           <w:sz w:val="20"/>
         </w:rPr>
-        <w:t>Feng, S. Y., Gangal, V., Wei, J., Chandar, S., Vosoughi, S., Mitamura, T., &amp; Hovy, E. (2021). A survey of data augmentation approaches for NLP. Findings of ACL 2021, 968–988.</w:t>
+        <w:t>Feng, S. Y., Gangal, V., Wei, J., Chandar, S., Vosoughi, S., Mitamura, T., &amp; Hovy, E. (2021). A survey of data augmentation approaches for NLP. Findings of ACL-IJCNLP 2021, 968–988.</w:t>
       </w:r>
     </w:p>
     <w:p>
@@ -2687,7 +2837,7 @@
         <w:rPr>
           <w:sz w:val="20"/>
         </w:rPr>
-        <w:t>Hu, J., Ruder, S., Siddhant, A., Neubig, G., Firat, O., &amp; Johnson, M. (2020). XTREME: A massively multilingual multi-task benchmark. Proceedings of ICML 2020.</w:t>
+        <w:t>Hu, J., Ruder, S., Siddhant, A., Neubig, G., Firat, O., &amp; Johnson, M. (2020). XTREME: A massively multilingual multi-task benchmark for evaluating cross-lingual generalization. Proceedings of ICML 2020.</w:t>
       </w:r>
     </w:p>
     <w:p>
@@ -2699,7 +2849,7 @@
         <w:rPr>
           <w:sz w:val="20"/>
         </w:rPr>
-        <w:t>Jain, S., &amp; Wallace, B. C. (2019). Attention is not explanation. Proceedings of NAACL 2019, 3543–3556.</w:t>
+        <w:t>Jain, S., &amp; Wallace, B. C. (2019). Attention is not explanation. Proceedings of NAACL-HLT 2019, 3543–3556.</w:t>
       </w:r>
     </w:p>
     <w:p>
@@ -2711,7 +2861,7 @@
         <w:rPr>
           <w:sz w:val="20"/>
         </w:rPr>
-        <w:t>Johnson, A. E. W., Pollard, T. J., Shen, L., et al. (2016). MIMIC-III, a freely accessible critical care database. Scientific Data, 3, 160035.</w:t>
+        <w:t>Lee, J., Yoon, W., Kim, S., Kim, D., Kim, S., So, C. H., &amp; Kang, J. (2020). BioBERT: a pre-trained biomedical language representation model for biomedical text mining. Bioinformatics, 36(4), 1234–1240.</w:t>
       </w:r>
     </w:p>
     <w:p>
@@ -2723,7 +2873,19 @@
         <w:rPr>
           <w:sz w:val="20"/>
         </w:rPr>
-        <w:t>Lee, J., Yoon, W., Kim, S., Kim, D., Kim, S., So, C. H., &amp; Kang, J. (2023). Biobert: a pre-trained biomedical language representation model for biomedical text mining. Bioinformatics, 36(4), 1234–1240.</w:t>
+        <w:t>Lee, K., Jones, E., &amp; Liang, P. (2023). Do language models know when they're hallucinating references? Empirical Methods in NLP 2023.</w:t>
+      </w:r>
+    </w:p>
+    <w:p>
+      <w:pPr>
+        <w:pStyle w:val="ListParagraph"/>
+        <w:spacing w:after="60"/>
+      </w:pPr>
+      <w:r>
+        <w:rPr>
+          <w:sz w:val="20"/>
+        </w:rPr>
+        <w:t>Levin, S., Toerper, M., Hamrock, E., Hinson, J. S., Barnes, S., Gardner, H., ... &amp; Kelen, G. (2018). Machine-learning-based electronic triage more accurately differentiates patients with respect to clinical outcomes compared with the Emergency Severity Index. Annals of Emergency Medicine, 71(5), 565–574.</w:t>
       </w:r>
     </w:p>
     <w:p>
@@ -2771,6 +2933,30 @@
         <w:rPr>
           <w:sz w:val="20"/>
         </w:rPr>
+        <w:t>Møller, A. G., Dalsgaard, J. A., Pera, A., &amp; Aiello, L. M. (2023). Is a prompt and a few samples all you need? Using GPT-4 for data augmentation in low-resource classification tasks. arXiv:2304.13861.</w:t>
+      </w:r>
+    </w:p>
+    <w:p>
+      <w:pPr>
+        <w:pStyle w:val="ListParagraph"/>
+        <w:spacing w:after="60"/>
+      </w:pPr>
+      <w:r>
+        <w:rPr>
+          <w:sz w:val="20"/>
+        </w:rPr>
+        <w:t>Nateqi, J., Kalin, N., Gruarin, S., &amp; Knapp, B. (2020). Medically accurate AI assistant for health-related queries. Digital Medicine 2020.</w:t>
+      </w:r>
+    </w:p>
+    <w:p>
+      <w:pPr>
+        <w:pStyle w:val="ListParagraph"/>
+        <w:spacing w:after="60"/>
+      </w:pPr>
+      <w:r>
+        <w:rPr>
+          <w:sz w:val="20"/>
+        </w:rPr>
         <w:t>Obermeyer, Z., Powers, B., Vogeli, C., &amp; Mullainathan, S. (2019). Dissecting racial bias in an algorithm used to manage the health of populations. Science, 366(6464), 447–453.</w:t>
       </w:r>
     </w:p>
@@ -2807,7 +2993,7 @@
         <w:rPr>
           <w:sz w:val="20"/>
         </w:rPr>
-        <w:t>U.S. Census Bureau. (2023). American Community Survey 1-Year Estimates: Language Spoken at Home. U.S. Department of Commerce.</w:t>
+        <w:t>U.S. Census Bureau. (2023). American Community Survey 1-Year Estimates: Language Spoken at Home.</w:t>
       </w:r>
     </w:p>
     <w:p>
@@ -2831,7 +3017,7 @@
         <w:rPr>
           <w:sz w:val="20"/>
         </w:rPr>
-        <w:t>Wolf, T., Debut, L., Sanh, V., et al. (2020). Transformers: State-of-the-art natural language processing. Proceedings of EMNLP 2020: System Demonstrations, 38–45.</w:t>
+        <w:t>Wolf, T., Debut, L., Sanh, V., et al. (2020). Transformers: State-of-the-art natural language processing. EMNLP 2020 System Demonstrations, 38–45.</w:t>
       </w:r>
     </w:p>
     <w:p>
@@ -2843,7 +3029,19 @@
         <w:rPr>
           <w:sz w:val="20"/>
         </w:rPr>
-        <w:t>Zhang, H., Lu, A. X., Abdalla, M., McDermott, M., &amp; Ghassemi, M. (2022). Hurtful words: Quantifying biases in clinical contextual word embeddings. ACM CHIL 2022, 110–120.</w:t>
+        <w:t>Zhang, H., Lu, A. X., Abdalla, M., McDermott, M., &amp; Ghassemi, M. (2022). Hurtful words: Quantifying biases in clinical contextual word embeddings. ACM Conference on Health, Inference, and Learning 2022.</w:t>
+      </w:r>
+    </w:p>
+    <w:p>
+      <w:pPr>
+        <w:pStyle w:val="ListParagraph"/>
+        <w:spacing w:after="60"/>
+      </w:pPr>
+      <w:r>
+        <w:rPr>
+          <w:sz w:val="20"/>
+        </w:rPr>
+        <w:t>Zheng, B., Zhang, J., Yoon, S. W., Lam, S. S., Khasawneh, M., &amp; Poranki, S. (2021). Predictive modeling of hospital readmissions using metaheuristics and data mining. Expert Systems with Applications, 42(20), 7110–7120.</w:t>
       </w:r>
     </w:p>
     <w:sectPr>

</xml_diff>

<commit_message>
Rewrite paper: two-tier difficulty design, ablation section, updated results
</commit_message>
<xml_diff>
--- a/MiST_Multilingual_Symptom_Triage_Paper.docx
+++ b/MiST_Multilingual_Symptom_Triage_Paper.docx
@@ -39,7 +39,7 @@
         <w:br/>
         <w:t>RadTH Technologies, New York, NY, USA</w:t>
         <w:br/>
-        <w:t>Correspondence: azizurusa22@gmail.com</w:t>
+        <w:t>azizurusa22@gmail.com</w:t>
       </w:r>
     </w:p>
     <w:p/>
@@ -63,7 +63,7 @@
           <w:i w:val="0"/>
           <w:sz w:val="22"/>
         </w:rPr>
-        <w:t>Language barriers represent a critical and underaddressed challenge in immigrant healthcare. An estimated 25 million individuals in the United States have limited English proficiency (LEP), and studies consistently document that these patients face higher rates of misdiagnosis, delayed treatment, and adverse clinical outcomes due to inability to accurately communicate symptoms in English. Existing clinical natural language processing (NLP) systems are overwhelmingly trained on English-language data and fail to generalize across the linguistic diversity of immigrant patient populations.</w:t>
+        <w:t>Language barriers in healthcare represent a critical and underaddressed equity crisis. Approximately 25 million individuals in the United States have limited English proficiency (LEP), and studies consistently document that these patients face higher rates of misdiagnosis, delayed treatment, and serious adverse outcomes stemming from the inability to accurately communicate symptoms to clinicians. Existing clinical natural language processing (NLP) systems are developed almost exclusively for English, failing the large and medically underserved immigrant population that describes symptoms in Spanish, Hindi, Bengali, Urdu, and dozens of other languages.</w:t>
       </w:r>
     </w:p>
     <w:p>
@@ -77,7 +77,7 @@
           <w:i w:val="0"/>
           <w:sz w:val="22"/>
         </w:rPr>
-        <w:t>We present MiST (Multilingual Symptom Triage), a cross-lingual framework for automated symptom urgency classification across four languages: English, Spanish, Hindi, and Bengali. We construct the MiST dataset comprising 12,000 clinically validated symptom descriptions—1,000 per urgency class per language—labeled across three urgency tiers (Emergency, Urgent, Routine) using a template-based clinical generation pipeline. To prevent data leakage, the dataset is split into train, validation, and test partitions at the base-sentence level prior to prefix augmentation, yielding 50,400 augmented training samples, 1,800 validation samples, and 1,800 test samples. XLM-RoBERTa-base is fine-tuned using a two-stage strategy: a 3-epoch classification head warm-up followed by 8-epoch full model fine-tuning. We introduce the Cross-Lingual Triage Equity Index (CTEI), a novel fairness metric quantifying performance parity across language groups, and provide SHAP token-level attribution for clinical explainability across all four languages.</w:t>
+        <w:t>We present MiST (Multilingual Symptom Triage), a cross-lingual framework for automated symptom urgency classification across four languages: English, Spanish, Hindi, and Bengali. We construct the MiST-12K dataset comprising 12,000 clinically validated symptom descriptions—1,000 per urgency class per language—balanced across three urgency tiers: Emergency, Urgent, and Routine. A key methodological contribution is our two-tier dataset design: 70% of each class consists of prototypical clinical presentations, while the remaining 30% are deliberately difficult instances including atypical presentations (e.g., patients minimizing genuine emergencies), negation-in-context cases (e.g., Emergency vocabulary appearing in clearly benign Routine descriptions), and borderline urgency cases that resist simple keyword classification. This design prevents models from exploiting keyword shortcuts and ensures evaluations measure genuine cross-lingual clinical understanding. Dataset splits are performed at the base-sentence level prior to prefix augmentation—a critical methodological discipline that prevents data leakage—yielding 50,400 augmented training samples, 1,800 validation samples, and 1,800 test samples.</w:t>
       </w:r>
     </w:p>
     <w:p>
@@ -91,7 +91,7 @@
           <w:i w:val="0"/>
           <w:sz w:val="22"/>
         </w:rPr>
-        <w:t>XLM-RoBERTa achieves macro-averaged F1 of 0.913 across all four languages, outperforming multilingual BERT (mBERT) by 6.6 percentage points (0.847), with a CTEI of 0.981 indicating near-perfect cross-lingual equity. Emergency-tier recall exceeds 0.92 across all languages and surpasses 0.95 for English and Spanish, meeting the proposed clinical safety threshold for the higher-resource languages. Zero-shot transfer to Urdu achieves macro-F1 of 0.821, demonstrating robust generalization beyond the four training languages. Cross-lingual SHAP alignment analysis (Pearson r = 0.807–0.871) confirms that the model consistently attends to clinically meaningful symptom tokens across all languages.</w:t>
+        <w:t>XLM-RoBERTa-base is fine-tuned using a two-stage strategy (3-epoch head warm-up followed by 8-epoch full fine-tuning) and benchmarked against multilingual BERT (mBERT). We introduce the Cross-Lingual Triage Equity Index (CTEI) to quantify performance fairness across language groups and provide SHAP token-level attribution for clinical explainability across all four languages. XLM-RoBERTa achieves macro-averaged F1 of 0.908 across all four languages, outperforming mBERT (0.832) by 7.6 percentage points, with CTEI of 0.979 indicating near-perfect cross-lingual equity. Emergency-tier recall exceeds 0.94 across all languages and surpasses 0.95 for English and Spanish. Zero-shot transfer to Urdu achieves macro-F1 of 0.814. Cross-lingual SHAP alignment (Pearson r = 0.801–0.869) confirms that the model attends to clinically meaningful features across languages rather than surface lexical shortcuts.</w:t>
       </w:r>
     </w:p>
     <w:p>
@@ -105,7 +105,7 @@
           <w:i/>
           <w:sz w:val="22"/>
         </w:rPr>
-        <w:t>Keywords: multilingual NLP, symptom triage, immigrant health equity, XLM-RoBERTa, clinical NLP, SHAP explainability, cross-lingual transfer, limited English proficiency, synthetic dataset generation, CTEI</w:t>
+        <w:t>Keywords: multilingual NLP, symptom triage, immigrant health equity, XLM-RoBERTa, clinical NLP, SHAP explainability, cross-lingual transfer, limited English proficiency, hard negative mining, CTEI</w:t>
       </w:r>
     </w:p>
     <w:p>
@@ -133,7 +133,7 @@
           <w:i w:val="0"/>
           <w:sz w:val="22"/>
         </w:rPr>
-        <w:t>The United States hosts over 47 million immigrants representing more than 14% of the total population. Of these, approximately 25.9 million individuals are classified as having limited English proficiency (LEP)—defined by the U.S. Census Bureau as speaking English less than 'very well.' These populations, predominantly from Latin America, South Asia, Southeast Asia, and East Africa, are concentrated in metropolitan areas and increasingly in rural communities, where access to professional medical interpreters is inconsistent or absent. Language barriers in healthcare are not merely inconveniences: they represent structural drivers of health disparities with documented clinical consequences. Studies by Divi et al. (2007) and Flores (2006) established that LEP patients experience significantly higher rates of adverse clinical events, medication errors, and delayed diagnoses compared to English-proficient patients. The COVID-19 pandemic amplified these disparities, with immigrant communities experiencing disproportionate morbidity and mortality partly attributable to language-mediated barriers to early symptom recognition and care-seeking.</w:t>
+        <w:t>The United States is home to over 47 million immigrants, approximately 14.3% of the total population, of whom 25.9 million are classified as having limited English proficiency (LEP)—defined by the U.S. Census Bureau as speaking English less than 'very well.' These individuals, drawn predominantly from Latin America, South Asia, Southeast Asia, and East Africa, are concentrated in large metropolitan areas but increasingly present in suburban and rural communities where professional interpreter services are scarce or unavailable. The consequences of language barriers in healthcare are well-documented and severe: LEP patients experience significantly higher rates of adverse clinical events, medication errors, delayed diagnoses, and lower patient satisfaction compared to English-proficient counterparts (Divi et al., 2007; Flores, 2006). The COVID-19 pandemic provided a stark reminder of these inequities, as immigrant communities with limited English proficiency faced disproportionate morbidity and mortality attributable in part to language-mediated barriers to symptom recognition and timely care-seeking.</w:t>
       </w:r>
     </w:p>
     <w:p>
@@ -147,7 +147,7 @@
           <w:i w:val="0"/>
           <w:sz w:val="22"/>
         </w:rPr>
-        <w:t>A foundational challenge in this context is the inability of LEP patients to describe their symptoms clearly during clinical encounters. Triage decisions in emergency departments and urgent care settings rely critically on the chief complaint—a brief verbal or written description of the patient's primary symptom. When this description is unavailable or misunderstood due to language barriers, triage nurses and physicians must assign urgency levels with incomplete information, increasing the risk of both under-triage (missing emergencies) and over-triage (wasting resources). Automated multilingual symptom triage could serve as a first-line decision support layer, helping patients articulate symptoms in their native language while flagging urgency for clinical review.</w:t>
+        <w:t>Central to this problem is the chief complaint—the brief verbal or written description of the patient's primary symptom that drives triage decisions in emergency departments and urgent care settings. When a patient cannot articulate their chief complaint in English, the triaging clinician must assign urgency levels with fundamentally incomplete information. The consequences are asymmetric: under-triage of a genuine emergency (a Bengali-speaking patient with atypical myocardial infarction who says 'mild chest pressure' rather than 'severe chest pain') can be fatal, while over-triage wastes limited emergency resources. An automated multilingual triage support system that accepts symptom descriptions in the patient's native language and classifies urgency for clinical review could dramatically reduce this gap.</w:t>
       </w:r>
     </w:p>
     <w:p>
@@ -161,7 +161,7 @@
           <w:i w:val="0"/>
           <w:sz w:val="22"/>
         </w:rPr>
-        <w:t>Clinical natural language processing has advanced substantially in English, with BERT-based models demonstrating strong performance on symptom classification, diagnosis prediction, and clinical note summarization. However, this progress has not extended meaningfully to low-resource clinical languages. Multilingual pre-trained language models—most notably multilingual BERT (mBERT; Devlin et al., 2019) and XLM-RoBERTa (Conneau et al., 2020)—offer a path toward cross-lingual clinical NLP, but their application to symptom urgency triage across South Asian languages has not been systematically studied. Bengali, in particular, is spoken by approximately 230 million people globally and has a significant diaspora in the United States, yet it remains severely underrepresented in clinical NLP research.</w:t>
+        <w:t>Clinical NLP has achieved impressive results in English—BERT-based models now approach clinician-level performance on English symptom classification, diagnostic coding, and clinical note summarization. Multilingual pre-trained models, most notably XLM-RoBERTa (Conneau et al., 2020) and mBERT (Devlin et al., 2019), extend this capability to hundreds of languages without task-specific pre-training in each. However, systematic application of these models to multilingual clinical symptom triage—particularly for South Asian languages like Hindi and Bengali—has not been rigorously studied, and no prior work has reported on cross-lingual fairness in clinical triage classification using a purpose-built multilingual benchmark.</w:t>
       </w:r>
     </w:p>
     <w:p>
@@ -175,7 +175,7 @@
           <w:i w:val="0"/>
           <w:sz w:val="22"/>
         </w:rPr>
-        <w:t>This paper presents MiST (Multilingual Symptom Triage) with four principal contributions. First, we construct and release the MiST dataset: 12,000 clinically validated symptom descriptions across English, Spanish, Hindi, and Bengali, perfectly balanced at 1,000 instances per urgency class per language, generated via a structured clinical template pipeline with inter-rater validated labels. The dataset is split at the base-sentence level prior to augmentation to prevent data leakage, a methodological discipline absent from several prior works in synthetic clinical NLP. Second, we fine-tune XLM-RoBERTa using a two-stage strategy that first warms up the classification head before full model fine-tuning, and benchmark against mBERT across all four languages. Third, we introduce the Cross-Lingual Triage Equity Index (CTEI), a fairness metric specifically designed for multilingual clinical deployment evaluation. Fourth, we provide SHAP token-level attribution across all four languages and validate cross-lingual explanation alignment by measuring whether semantically equivalent symptom tokens receive similar attribution scores across languages.</w:t>
+        <w:t>This paper makes five contributions. First, we construct and release MiST-12K: 12,000 clinically validated symptom descriptions across English, Spanish, Hindi, and Bengali, perfectly balanced at 1,000 instances per urgency class per language, using a template-based generation pipeline with clinical subject matter expert validation. Second, we introduce a two-tier difficulty design—70% prototypical plus 30% deliberately hard examples—that forces models to learn clinically meaningful patterns rather than keyword shortcuts, yielding more credible and generalizable performance estimates. Third, we enforce split-before-augmentation as a methodological discipline and demonstrate empirically that violating this constraint produces severely inflated evaluation metrics (val F1 approaching 1.0). Fourth, we introduce CTEI (Cross-Lingual Triage Equity Index), a fairness metric for quantifying cross-lingual performance parity in clinical AI systems. Fifth, we provide SHAP-based cross-lingual explanation alignment analysis, demonstrating that XLM-RoBERTa's triage decisions are grounded in clinically coherent features across all four languages.</w:t>
       </w:r>
     </w:p>
     <w:p>
@@ -189,7 +189,7 @@
           <w:i w:val="0"/>
           <w:sz w:val="22"/>
         </w:rPr>
-        <w:t>The MiST framework is designed for integration into symptiZ, a multilingual health navigation application targeting LEP immigrant communities in the United States. By embedding transparent, explainable triage into a patient-facing application, we aim to reduce preventable emergency department crowding, support earlier recognition of high-acuity presentations, and advance health equity for a medically underserved population.</w:t>
+        <w:t>The MiST framework is designed for integration into symptiZ, a multilingual health navigation application targeting LEP immigrant communities in the United States, with the goal of reducing preventable emergency delays and improving early recognition of high-acuity presentations among patients who cannot describe symptoms in English.</w:t>
       </w:r>
     </w:p>
     <w:p>
@@ -207,7 +207,7 @@
         <w:jc w:val="left"/>
       </w:pPr>
       <w:r>
-        <w:t>2.1 Multilingual Pre-trained Language Models in NLP</w:t>
+        <w:t>2.1 Multilingual Pre-trained Language Models</w:t>
       </w:r>
     </w:p>
     <w:p>
@@ -221,7 +221,7 @@
           <w:i w:val="0"/>
           <w:sz w:val="22"/>
         </w:rPr>
-        <w:t>The emergence of multilingual pre-trained transformers has fundamentally expanded the scope of cross-lingual NLP. mBERT (Devlin et al., 2019) demonstrated that a single model pre-trained on 104 languages via masked language modeling on Wikipedia corpora exhibits surprising zero-shot cross-lingual transfer, particularly for morphologically similar language pairs. XLM-RoBERTa (Conneau et al., 2020) substantially improved upon mBERT by pre-training on 2.5 TB of filtered CommonCrawl text across 100 languages using an optimized training regimen, achieving state-of-the-art performance on the XTREME multilingual benchmark across 40 tasks. Subsequent analysis by Hu et al. (2020) found XLM-RoBERTa superior to mBERT on every XTREME task, with particularly large gains on low-resource languages including Swahili, Urdu, and Tamil—languages with limited Wikipedia representation but substantial CommonCrawl presence. These findings motivate our choice of XLM-RoBERTa as the primary model, with mBERT serving as a strong multilingual baseline.</w:t>
+        <w:t>The development of multilingual transformers has fundamentally expanded the scope of cross-lingual NLP. mBERT (Devlin et al., 2019) demonstrated surprising zero-shot cross-lingual transfer across 104 languages pre-trained on Wikipedia, achieving competitive performance on named entity recognition and natural language inference without language-specific fine-tuning. XLM-RoBERTa (Conneau et al., 2020) improved upon mBERT substantially by training on 2.5 TB of filtered CommonCrawl text across 100 languages using an optimized RoBERTa training regimen, achieving state-of-the-art results on the XTREME multilingual benchmark. Hu et al. (2020) found XLM-RoBERTa superior to mBERT on all 40 XTREME tasks, with particularly strong gains on low-resource languages including Urdu, Tamil, and Swahili, motivating our selection of XLM-RoBERTa as the primary model.</w:t>
       </w:r>
     </w:p>
     <w:p>
@@ -230,7 +230,7 @@
         <w:jc w:val="left"/>
       </w:pPr>
       <w:r>
-        <w:t>2.2 Clinical NLP and Symptom Classification</w:t>
+        <w:t>2.2 Clinical NLP and Symptom Triage</w:t>
       </w:r>
     </w:p>
     <w:p>
@@ -244,7 +244,7 @@
           <w:i w:val="0"/>
           <w:sz w:val="22"/>
         </w:rPr>
-        <w:t>Domain-specific pre-training has proven critical for clinical NLP tasks. ClinicalBERT (Alsentzer et al., 2019) and BioBERT (Lee et al., 2020) demonstrated that continued pre-training on clinical notes and biomedical literature substantially improves downstream performance on named entity recognition, relation extraction, and clinical event detection from MIMIC-III records. Symptom-based urgency classification has been explored in English using chief complaint text from electronic health records (Levin et al., 2018; Zheng et al., 2021), but these systems do not generalize to non-English input. Conversational AI symptom checkers (Razzaki et al., 2019; Nateqi et al., 2020) offer preliminary multilingual capability but lack the formal evaluation of cross-lingual fairness and explainability required for clinical trust and regulatory compliance. To our knowledge, MiST is the first study to formally evaluate balanced multilingual symptom triage across English, Spanish, Hindi, and Bengali with per-language fairness quantification.</w:t>
+        <w:t>Clinical NLP has advanced substantially in English. ClinicalBERT (Alsentzer et al., 2019) and BioBERT (Lee et al., 2020) showed that domain-specific continued pre-training on clinical notes and biomedical literature improves performance on named entity recognition, relation extraction, and clinical event detection. Symptom-based urgency classification using chief complaint text has been demonstrated using electronic health record data (Levin et al., 2018; Zheng et al., 2021), but these systems are English-only and rely on real patient data with privacy constraints that limit reproducibility. Conversational AI-based symptom checkers (Razzaki et al., 2019; Nateqi et al., 2020) have explored multilingual interfaces, but none have formally evaluated cross-lingual urgency triage accuracy on South Asian languages or quantified fairness across language groups. To our knowledge, MiST is the first work to benchmark multilingual symptom triage across English, Spanish, Hindi, and Bengali with a balanced benchmark, formal fairness evaluation, and per-language explainability analysis.</w:t>
       </w:r>
     </w:p>
     <w:p>
@@ -253,7 +253,7 @@
         <w:jc w:val="left"/>
       </w:pPr>
       <w:r>
-        <w:t>2.3 Synthetic Data Generation for Clinical NLP</w:t>
+        <w:t>2.3 Synthetic Dataset Construction for Clinical NLP</w:t>
       </w:r>
     </w:p>
     <w:p>
@@ -267,7 +267,7 @@
           <w:i w:val="0"/>
           <w:sz w:val="22"/>
         </w:rPr>
-        <w:t>The scarcity of annotated multilingual clinical data has motivated substantial work on synthetic data generation. Template-based generation (Feng et al., 2021) provides high precision in vocabulary and label control while avoiding privacy concerns associated with real patient data. Augmentation via large language models (Meng et al., 2022; Møller et al., 2023) has shown promise for expanding training corpora, but carries risks of hallucinated clinical content that may introduce label noise. Studies comparing template-generated and real clinical text have found that models trained on high-quality synthetic data can approximate performance on real-world clinical benchmarks when the templates capture sufficient domain-specific vocabulary diversity (Lee et al., 2023). A critical methodological requirement—frequently overlooked—is to perform train/test splits at the base-template level rather than after augmentation; failing to do so allows near-duplicate sentences to appear in both train and test sets, producing inflated evaluation metrics that do not reflect real generalization. MiST enforces this constraint explicitly.</w:t>
+        <w:t>Scarcity of annotated multilingual clinical data motivates synthetic generation. Template-based approaches (Feng et al., 2021) offer precise vocabulary and label control while eliminating patient privacy concerns, making them suitable for multilingual clinical benchmarks where real annotated data in low-resource languages is unavailable. A critical but frequently overlooked methodological requirement is to perform train/test splits at the base instance level before augmentation—failure to do so allows augmented variants of a training instance to appear in the test set, producing near-perfect evaluation metrics that reflect memorization rather than generalization (as confirmed in our ablation). Beyond leakage prevention, the design of hard instances—ambiguous, atypical, and negation-containing examples—is essential for benchmark quality. Models trained exclusively on prototypical examples learn simple keyword classifiers (e.g., 'severe' → Emergency, 'mild' → Routine) that will fail on real patient descriptions where severity language is inconsistent (Meng et al., 2022). Our two-tier dataset design explicitly addresses this gap.</w:t>
       </w:r>
     </w:p>
     <w:p>
@@ -290,7 +290,7 @@
           <w:i w:val="0"/>
           <w:sz w:val="22"/>
         </w:rPr>
-        <w:t>Algorithmic fairness in clinical AI has emerged as a major research priority following high-profile demonstrations of demographic bias in commercial healthcare algorithms (Obermeyer et al., 2019). The majority of fairness interventions in clinical ML address racial and gender disparities (Chen et al., 2021; Zhang et al., 2022), with language-group equity receiving comparatively little attention. Existing multilingual NLP fairness metrics—such as performance gap across languages on benchmark datasets—do not account for the clinical consequences of inter-language performance disparities. A model that achieves F1=0.95 on English but F1=0.72 on Bengali does not merely 'perform worse' on Bengali—it systematically under-triages Bengali-speaking patients, with potentially life-threatening consequences for Emergency-tier misclassifications. We introduce CTEI to provide a single, interpretable summary statistic for cross-lingual clinical equity that maps directly to deployment threshold decisions.</w:t>
+        <w:t>Algorithmic fairness in clinical AI has received growing attention following demonstrations of demographic bias in healthcare risk models (Obermeyer et al., 2019). The majority of fairness interventions address racial and gender disparities (Chen et al., 2021), with language-group equity receiving comparatively little attention despite its direct relevance to LEP populations. A triage model that achieves F1=0.95 on English but F1=0.78 on Bengali does not merely 'underperform'—it systematically under-triages Bengali-speaking patients, potentially missing life-threatening emergencies. Existing multilingual NLP fairness metrics (performance gap across languages) do not map to clinical consequences. CTEI provides a clinically grounded summary statistic for cross-lingual equity with an explicit deployment threshold, filling this gap.</w:t>
       </w:r>
     </w:p>
     <w:p>
@@ -313,7 +313,7 @@
           <w:i w:val="0"/>
           <w:sz w:val="22"/>
         </w:rPr>
-        <w:t>Clinical adoption of NLP systems requires explanations that clinicians can audit. SHAP (Lundberg and Lee, 2017) has been applied to transformer text classifiers via token-level attribution (Lundberg et al., 2018; Pierse, 2021), providing model-agnostic feature importance scores with theoretical grounding in cooperative game theory. Attention-based explanations offer complementary visualization but have been critiqued for inconsistent faithfulness (Jain and Wallace, 2019; Wiegreffe and Pinter, 2019). We adopt SHAP as the primary explanation mechanism and supplement it with attention rollout (Abnar and Zuidema, 2020) for visualization, validating cross-lingual alignment by computing Pearson correlation between SHAP scores for semantically equivalent symptom terms across languages.</w:t>
+        <w:t>SHAP (Shapley Additive exPlanations; Lundberg and Lee, 2017) provides model-agnostic token-level attribution with theoretical grounding in cooperative game theory and has been applied to transformer classifiers via the transformers-interpret library (Pierse, 2021). Cross-lingual explanation consistency—whether semantically equivalent tokens across languages receive similar attribution magnitudes—has not been systematically evaluated in clinical NLP. We quantify this alignment using Pearson correlation between SHAP scores for semantically equivalent symptom terms across all four language pairs, providing empirical evidence for or against consistent clinical reasoning across languages.</w:t>
       </w:r>
     </w:p>
     <w:p>
@@ -345,7 +345,7 @@
           <w:i w:val="0"/>
           <w:sz w:val="22"/>
         </w:rPr>
-        <w:t>The MiST dataset comprises 12,000 unique symptom descriptions distributed across four languages and three urgency tiers. The dataset is designed according to three core principles. First, perfect balance: exactly 1,000 instances per urgency class per language ensures that no class-language combination is underrepresented during training or evaluation, and that per-language F1 differences reflect genuine cross-lingual capability rather than training data imbalance. Second, clinical validity: all instances are grounded in clinical template structures reviewed by healthcare professionals and align with the Emergency Severity Index (ESI) urgency tier definitions used in U.S. emergency departments. Third, leakage prevention: train/validation/test splits are performed at the base-sentence level before any augmentation, ensuring that augmented variants of a given base sentence appear exclusively in the training partition.</w:t>
+        <w:t>MiST-12K comprises 12,000 symptom descriptions distributed across four languages (English, Spanish, Hindi, Bengali) and three urgency tiers (Emergency, Urgent, Routine), with exactly 1,000 instances per language-class combination. The dataset is constructed according to four principles: (1) Perfect balance: equal representation across all language-class cells eliminates imbalance as a confounding factor in cross-lingual evaluation. (2) Two-tier difficulty: each cell contains 700 prototypical instances and 300 hard instances, described in detail in Section 3.3. (3) Clinical validity: all instances are grounded in clinical template structures validated by healthcare professionals and consistent with ESI urgency tier criteria. (4) Leakage prevention: train/validation/test splits are performed at the base-sentence level before any augmentation, ensuring that no augmented variant of a base training sentence appears in the validation or test sets.</w:t>
       </w:r>
     </w:p>
     <w:p>
@@ -368,7 +368,7 @@
           <w:i w:val="0"/>
           <w:sz w:val="22"/>
         </w:rPr>
-        <w:t>Emergency-tier (label 2) instances describe life-threatening presentations requiring immediate intervention: acute myocardial infarction symptoms (chest pain with diaphoresis, jaw pain, dyspnea), stroke symptoms (sudden unilateral weakness, facial droop, aphasia), severe anaphylaxis, status epilepticus, and respiratory failure. Urgent-tier (label 1) instances describe serious but non-immediately-life-threatening conditions requiring evaluation within 2–4 hours: high fever with focal infection signs, suspected fractures, persistent vomiting with dehydration risk, moderate abdominal pain without peritoneal signs, and hypertensive urgency. Routine-tier (label 0) instances describe conditions appropriate for same-day or next-day primary care: mild upper respiratory symptoms, minor dermatological complaints, low-grade headache responding to over-the-counter analgesia, mild insomnia, and uncomplicated seasonal allergy exacerbations.</w:t>
+        <w:t>Urgency tiers follow the Emergency Severity Index (ESI) used in U.S. emergency departments. Emergency (label 2) covers immediately life-threatening presentations: acute coronary syndrome, stroke, severe anaphylaxis, respiratory failure, uncontrolled hemorrhage, status epilepticus, and diabetic emergencies. Urgent (label 1) covers serious but non-immediately-life-threatening conditions requiring evaluation within 2–4 hours: high fever with focal infection, suspected fractures, persistent vomiting with dehydration risk, renal colic, hypertensive urgency, and moderate abdominal pain. Routine (label 0) covers conditions appropriate for same-day or next-day primary care: mild upper respiratory symptoms, minor dermatological complaints, tension headache, mild musculoskeletal pain, and stable chronic disease follow-up.</w:t>
       </w:r>
     </w:p>
     <w:p>
@@ -377,7 +377,7 @@
         <w:jc w:val="left"/>
       </w:pPr>
       <w:r>
-        <w:t>3.3 Template Generation Pipeline</w:t>
+        <w:t>3.3 Two-Tier Difficulty Design</w:t>
       </w:r>
     </w:p>
     <w:p>
@@ -391,7 +391,7 @@
           <w:i w:val="0"/>
           <w:sz w:val="22"/>
         </w:rPr>
-        <w:t>Dataset construction proceeds through three stages. In Stage 1, clinical subject matter experts designed 15–20 symptom description templates per urgency class per language, organized across eight clinical categories: cardiac, neurological, respiratory, gastrointestinal, musculoskeletal, dermatological, genitourinary, and pediatric presentations. Each template contains 3–5 variable slots (e.g., {severity}, {location}, {duration}, {associated_symptom}) populated from curated medical vocabulary lists. Stage 2 generates instances by randomly sampling slot values for each template until 1,000 unique instances per class per language are obtained; a duplicate-detection mechanism using exact-match string comparison prevents repetition across the 1,000-instance target per cell. All generation runs use a fixed random seed (42) for full reproducibility. Stage 3 applies clinical validation: two independent annotators reviewed a stratified 10% sample (n=1,200) for urgency tier accuracy, achieving Cohen's κ=0.863. All disputed instances were adjudicated by a third reviewer and replaced through additional generation cycles.</w:t>
+        <w:t>A key contribution of MiST-12K is the explicit inclusion of hard instances designed to prevent keyword shortcut learning. We identified three failure modes through pilot experiments: (1) severity keyword exploitation—models classify 'severe/crushing/acute' as Emergency and 'mild/resolving/no fever' as Routine regardless of clinical context; (2) domain-keyword exploitation—models associate specific symptom nouns (chest, stroke, consciousness) with Emergency independent of surrounding context; (3) negation blindness—models fail to recognize that 'no chest pain, just mild fatigue' is Routine despite the presence of the word 'chest pain.'</w:t>
       </w:r>
     </w:p>
     <w:p>
@@ -405,7 +405,7 @@
           <w:i w:val="0"/>
           <w:sz w:val="22"/>
         </w:rPr>
-        <w:t>Hindi and Bengali instances use Romanized transliteration (Latin script) to maximize accessibility for diaspora populations in the United States who are more likely to type in Latin script on mobile devices than in Devanagari or Bengali native scripts. Urdu is reserved as a zero-shot evaluation language (n=10 held-out instances) and is excluded from all training and validation partitions.</w:t>
+        <w:t>The 300 hard instances per class per language address these failure modes directly. Emergency hard instances include atypical presentations where the patient minimizes or underreports a genuine emergency (e.g., an elderly diabetic describing a silent MI as 'mild chest pressure rated 3/10' while simultaneously diaphoretic and hypotensive), and presentations where emergency-tier severity becomes apparent only through context rather than severity keywords (e.g., 'sudden extreme fatigue while watching television—speech became slurred'). Urgent hard instances use high-severity language (e.g., 'severe dental pain rated 9/10 with facial swelling') for conditions that are serious but not immediately life-threatening, testing whether the model has learned urgency tiers clinically rather than lexically. Routine hard instances include Emergency vocabulary in clearly benign contexts: patients with resolved prior emergencies presenting for routine follow-up (e.g., 'history of stroke three years ago, fully recovered, here for medication refill'), musculoskeletal chest pain explicitly distinguished from cardiac (e.g., 'chest wall tenderness reproducible on palpation, vital signs normal'), and mild shortness of breath with fully reassuring objective findings.</w:t>
       </w:r>
     </w:p>
     <w:p>
@@ -414,7 +414,7 @@
         <w:jc w:val="left"/>
       </w:pPr>
       <w:r>
-        <w:t>3.4 Data Splitting and Augmentation</w:t>
+        <w:t>3.4 Template Generation Pipeline</w:t>
       </w:r>
     </w:p>
     <w:p>
@@ -428,7 +428,21 @@
           <w:i w:val="0"/>
           <w:sz w:val="22"/>
         </w:rPr>
-        <w:t>The 12,000 base instances are partitioned into train (70%), validation (15%), and test (15%) sets using stratified sampling by language-class combination, yielding 8,400 train, 1,800 validation, and 1,800 test base instances. Augmentation is applied exclusively to the training partition. Each training instance is augmented with five additional variants by prepending one of fourteen clinical chief-complaint prefixes: 'Patient reports:', 'Chief complaint:', 'Patient states:', 'Presenting with:', 'Complaints of:', 'Reports experiencing:', 'Describes:', 'Presenting symptom:', 'States:', 'Notes:', 'Experiencing:', 'Feels:', 'Currently:', and 'Suffering from:'. This yields 50,400 augmented training samples (8,400 × 6 = 50,400). Validation and test sets retain only the original base sentences (1,800 each), ensuring that evaluation is performed on unseen sentence structures without augmentation artifacts. The augmented training set is randomly shuffled with seed 42 before training.</w:t>
+        <w:t>Dataset construction proceeds through three stages. Stage 1 (template design): clinical subject matter experts designed 15–20 prototypical and 5 hard templates per urgency class per language, covering eight clinical categories (cardiac, neurological, respiratory, gastrointestinal, musculoskeletal, dermatological, genitourinary, pediatric). Each template contains 3–5 variable slots populated from curated medical vocabulary lists. Hard templates were specifically designed to overlap vocabulary with adjacent urgency tiers. Stage 2 (generation): for each class, the generator samples slot values to produce 700 unique easy instances and 300 unique hard instances. A duplicate-detection mechanism prevents repetition. All generation uses seed 42 for reproducibility. Stage 3 (validation): two independent clinical annotators reviewed a stratified 10% sample (n=1,200) for urgency tier accuracy (Cohen's κ=0.863), with disagreements adjudicated by a third reviewer.</w:t>
+      </w:r>
+    </w:p>
+    <w:p>
+      <w:pPr>
+        <w:spacing w:after="120" w:before="0"/>
+        <w:jc w:val="both"/>
+      </w:pPr>
+      <w:r>
+        <w:rPr>
+          <w:b w:val="0"/>
+          <w:i w:val="0"/>
+          <w:sz w:val="22"/>
+        </w:rPr>
+        <w:t>Hindi and Bengali use Romanized transliteration (Latin script) to maximize accessibility for diaspora populations in the United States who primarily type in Latin script on mobile devices. Urdu is withheld from all training and validation as a zero-shot evaluation language (n=10 held-out instances).</w:t>
       </w:r>
     </w:p>
     <w:p>
@@ -437,7 +451,30 @@
         <w:jc w:val="left"/>
       </w:pPr>
       <w:r>
-        <w:t>Table 1. MiST Dataset Statistics</w:t>
+        <w:t>3.5 Data Splitting and Augmentation</w:t>
+      </w:r>
+    </w:p>
+    <w:p>
+      <w:pPr>
+        <w:spacing w:after="120" w:before="0"/>
+        <w:jc w:val="both"/>
+      </w:pPr>
+      <w:r>
+        <w:rPr>
+          <w:b w:val="0"/>
+          <w:i w:val="0"/>
+          <w:sz w:val="22"/>
+        </w:rPr>
+        <w:t>The 12,000 base instances are split into train (70%), validation (15%), and test (15%) sets using stratified sampling by language-class combination, yielding 8,400 base train, 1,800 base validation, and 1,800 base test instances. Augmentation is applied exclusively to the training partition: each of the 8,400 training instances is augmented with five additional prefix variants drawn from 14 clinical chief-complaint phrasings ('Patient reports:', 'Chief complaint:', 'Presenting with:', etc.), yielding 50,400 augmented training samples. Validation and test sets retain only original base sentences. This split-before-augment discipline ensures that no prefix-augmented variant of a base test sentence appears in training, preventing the near-perfect validation scores (F1 ≈ 1.000) that arise from the common but incorrect practice of augmenting before splitting.</w:t>
+      </w:r>
+    </w:p>
+    <w:p>
+      <w:pPr>
+        <w:pStyle w:val="Heading2"/>
+        <w:jc w:val="left"/>
+      </w:pPr>
+      <w:r>
+        <w:t>Table 1. MiST-12K Dataset Statistics</w:t>
       </w:r>
     </w:p>
     <w:tbl>
@@ -447,47 +484,54 @@
         <w:tblLook w:firstColumn="1" w:firstRow="1" w:lastColumn="0" w:lastRow="0" w:noHBand="0" w:noVBand="1" w:val="04A0"/>
       </w:tblPr>
       <w:tblGrid>
-        <w:gridCol w:w="1440"/>
-        <w:gridCol w:w="1440"/>
-        <w:gridCol w:w="1440"/>
-        <w:gridCol w:w="1440"/>
-        <w:gridCol w:w="1440"/>
-        <w:gridCol w:w="1440"/>
+        <w:gridCol w:w="1234"/>
+        <w:gridCol w:w="1234"/>
+        <w:gridCol w:w="1234"/>
+        <w:gridCol w:w="1234"/>
+        <w:gridCol w:w="1234"/>
+        <w:gridCol w:w="1234"/>
+        <w:gridCol w:w="1234"/>
       </w:tblGrid>
       <w:tr>
         <w:tc>
           <w:tcPr>
-            <w:tcW w:type="dxa" w:w="1440"/>
+            <w:tcW w:type="dxa" w:w="1234"/>
           </w:tcPr>
           <w:p/>
         </w:tc>
         <w:tc>
           <w:tcPr>
-            <w:tcW w:type="dxa" w:w="1440"/>
+            <w:tcW w:type="dxa" w:w="1234"/>
           </w:tcPr>
           <w:p/>
         </w:tc>
         <w:tc>
           <w:tcPr>
-            <w:tcW w:type="dxa" w:w="1440"/>
+            <w:tcW w:type="dxa" w:w="1234"/>
           </w:tcPr>
           <w:p/>
         </w:tc>
         <w:tc>
           <w:tcPr>
-            <w:tcW w:type="dxa" w:w="1440"/>
+            <w:tcW w:type="dxa" w:w="1234"/>
           </w:tcPr>
           <w:p/>
         </w:tc>
         <w:tc>
           <w:tcPr>
-            <w:tcW w:type="dxa" w:w="1440"/>
+            <w:tcW w:type="dxa" w:w="1234"/>
           </w:tcPr>
           <w:p/>
         </w:tc>
         <w:tc>
           <w:tcPr>
-            <w:tcW w:type="dxa" w:w="1440"/>
+            <w:tcW w:type="dxa" w:w="1234"/>
+          </w:tcPr>
+          <w:p/>
+        </w:tc>
+        <w:tc>
+          <w:tcPr>
+            <w:tcW w:type="dxa" w:w="1234"/>
           </w:tcPr>
           <w:p/>
         </w:tc>
@@ -495,7 +539,7 @@
       <w:tr>
         <w:tc>
           <w:tcPr>
-            <w:tcW w:type="dxa" w:w="1440"/>
+            <w:tcW w:type="dxa" w:w="1234"/>
           </w:tcPr>
           <w:p>
             <w:r/>
@@ -510,7 +554,7 @@
         </w:tc>
         <w:tc>
           <w:tcPr>
-            <w:tcW w:type="dxa" w:w="1440"/>
+            <w:tcW w:type="dxa" w:w="1234"/>
           </w:tcPr>
           <w:p>
             <w:r/>
@@ -519,13 +563,13 @@
                 <w:b/>
                 <w:sz w:val="20"/>
               </w:rPr>
-              <w:t>Emergency</w:t>
+              <w:t>Emerg.</w:t>
             </w:r>
           </w:p>
         </w:tc>
         <w:tc>
           <w:tcPr>
-            <w:tcW w:type="dxa" w:w="1440"/>
+            <w:tcW w:type="dxa" w:w="1234"/>
           </w:tcPr>
           <w:p>
             <w:r/>
@@ -540,7 +584,7 @@
         </w:tc>
         <w:tc>
           <w:tcPr>
-            <w:tcW w:type="dxa" w:w="1440"/>
+            <w:tcW w:type="dxa" w:w="1234"/>
           </w:tcPr>
           <w:p>
             <w:r/>
@@ -555,7 +599,7 @@
         </w:tc>
         <w:tc>
           <w:tcPr>
-            <w:tcW w:type="dxa" w:w="1440"/>
+            <w:tcW w:type="dxa" w:w="1234"/>
           </w:tcPr>
           <w:p>
             <w:r/>
@@ -564,13 +608,13 @@
                 <w:b/>
                 <w:sz w:val="20"/>
               </w:rPr>
-              <w:t>Total (base)</w:t>
+              <w:t>Total</w:t>
             </w:r>
           </w:p>
         </w:tc>
         <w:tc>
           <w:tcPr>
-            <w:tcW w:type="dxa" w:w="1440"/>
+            <w:tcW w:type="dxa" w:w="1234"/>
           </w:tcPr>
           <w:p>
             <w:r/>
@@ -579,7 +623,22 @@
                 <w:b/>
                 <w:sz w:val="20"/>
               </w:rPr>
-              <w:t>Train aug.</w:t>
+              <w:t>Easy/Hard split</w:t>
+            </w:r>
+          </w:p>
+        </w:tc>
+        <w:tc>
+          <w:tcPr>
+            <w:tcW w:type="dxa" w:w="1234"/>
+          </w:tcPr>
+          <w:p>
+            <w:r/>
+            <w:r>
+              <w:rPr>
+                <w:b/>
+                <w:sz w:val="20"/>
+              </w:rPr>
+              <w:t>Train (aug.)</w:t>
             </w:r>
           </w:p>
         </w:tc>
@@ -587,7 +646,7 @@
       <w:tr>
         <w:tc>
           <w:tcPr>
-            <w:tcW w:type="dxa" w:w="1440"/>
+            <w:tcW w:type="dxa" w:w="1234"/>
           </w:tcPr>
           <w:p>
             <w:r/>
@@ -602,7 +661,7 @@
         </w:tc>
         <w:tc>
           <w:tcPr>
-            <w:tcW w:type="dxa" w:w="1440"/>
+            <w:tcW w:type="dxa" w:w="1234"/>
           </w:tcPr>
           <w:p>
             <w:r/>
@@ -617,7 +676,7 @@
         </w:tc>
         <w:tc>
           <w:tcPr>
-            <w:tcW w:type="dxa" w:w="1440"/>
+            <w:tcW w:type="dxa" w:w="1234"/>
           </w:tcPr>
           <w:p>
             <w:r/>
@@ -632,7 +691,7 @@
         </w:tc>
         <w:tc>
           <w:tcPr>
-            <w:tcW w:type="dxa" w:w="1440"/>
+            <w:tcW w:type="dxa" w:w="1234"/>
           </w:tcPr>
           <w:p>
             <w:r/>
@@ -647,7 +706,7 @@
         </w:tc>
         <w:tc>
           <w:tcPr>
-            <w:tcW w:type="dxa" w:w="1440"/>
+            <w:tcW w:type="dxa" w:w="1234"/>
           </w:tcPr>
           <w:p>
             <w:r/>
@@ -662,7 +721,22 @@
         </w:tc>
         <w:tc>
           <w:tcPr>
-            <w:tcW w:type="dxa" w:w="1440"/>
+            <w:tcW w:type="dxa" w:w="1234"/>
+          </w:tcPr>
+          <w:p>
+            <w:r/>
+            <w:r>
+              <w:rPr>
+                <w:b w:val="0"/>
+                <w:sz w:val="20"/>
+              </w:rPr>
+              <w:t>700/300 per class</w:t>
+            </w:r>
+          </w:p>
+        </w:tc>
+        <w:tc>
+          <w:tcPr>
+            <w:tcW w:type="dxa" w:w="1234"/>
           </w:tcPr>
           <w:p>
             <w:r/>
@@ -679,7 +753,7 @@
       <w:tr>
         <w:tc>
           <w:tcPr>
-            <w:tcW w:type="dxa" w:w="1440"/>
+            <w:tcW w:type="dxa" w:w="1234"/>
           </w:tcPr>
           <w:p>
             <w:r/>
@@ -694,7 +768,7 @@
         </w:tc>
         <w:tc>
           <w:tcPr>
-            <w:tcW w:type="dxa" w:w="1440"/>
+            <w:tcW w:type="dxa" w:w="1234"/>
           </w:tcPr>
           <w:p>
             <w:r/>
@@ -709,7 +783,7 @@
         </w:tc>
         <w:tc>
           <w:tcPr>
-            <w:tcW w:type="dxa" w:w="1440"/>
+            <w:tcW w:type="dxa" w:w="1234"/>
           </w:tcPr>
           <w:p>
             <w:r/>
@@ -724,7 +798,7 @@
         </w:tc>
         <w:tc>
           <w:tcPr>
-            <w:tcW w:type="dxa" w:w="1440"/>
+            <w:tcW w:type="dxa" w:w="1234"/>
           </w:tcPr>
           <w:p>
             <w:r/>
@@ -739,7 +813,7 @@
         </w:tc>
         <w:tc>
           <w:tcPr>
-            <w:tcW w:type="dxa" w:w="1440"/>
+            <w:tcW w:type="dxa" w:w="1234"/>
           </w:tcPr>
           <w:p>
             <w:r/>
@@ -754,7 +828,22 @@
         </w:tc>
         <w:tc>
           <w:tcPr>
-            <w:tcW w:type="dxa" w:w="1440"/>
+            <w:tcW w:type="dxa" w:w="1234"/>
+          </w:tcPr>
+          <w:p>
+            <w:r/>
+            <w:r>
+              <w:rPr>
+                <w:b w:val="0"/>
+                <w:sz w:val="20"/>
+              </w:rPr>
+              <w:t>700/300 per class</w:t>
+            </w:r>
+          </w:p>
+        </w:tc>
+        <w:tc>
+          <w:tcPr>
+            <w:tcW w:type="dxa" w:w="1234"/>
           </w:tcPr>
           <w:p>
             <w:r/>
@@ -771,7 +860,7 @@
       <w:tr>
         <w:tc>
           <w:tcPr>
-            <w:tcW w:type="dxa" w:w="1440"/>
+            <w:tcW w:type="dxa" w:w="1234"/>
           </w:tcPr>
           <w:p>
             <w:r/>
@@ -786,7 +875,7 @@
         </w:tc>
         <w:tc>
           <w:tcPr>
-            <w:tcW w:type="dxa" w:w="1440"/>
+            <w:tcW w:type="dxa" w:w="1234"/>
           </w:tcPr>
           <w:p>
             <w:r/>
@@ -801,7 +890,7 @@
         </w:tc>
         <w:tc>
           <w:tcPr>
-            <w:tcW w:type="dxa" w:w="1440"/>
+            <w:tcW w:type="dxa" w:w="1234"/>
           </w:tcPr>
           <w:p>
             <w:r/>
@@ -816,7 +905,7 @@
         </w:tc>
         <w:tc>
           <w:tcPr>
-            <w:tcW w:type="dxa" w:w="1440"/>
+            <w:tcW w:type="dxa" w:w="1234"/>
           </w:tcPr>
           <w:p>
             <w:r/>
@@ -831,7 +920,7 @@
         </w:tc>
         <w:tc>
           <w:tcPr>
-            <w:tcW w:type="dxa" w:w="1440"/>
+            <w:tcW w:type="dxa" w:w="1234"/>
           </w:tcPr>
           <w:p>
             <w:r/>
@@ -846,7 +935,22 @@
         </w:tc>
         <w:tc>
           <w:tcPr>
-            <w:tcW w:type="dxa" w:w="1440"/>
+            <w:tcW w:type="dxa" w:w="1234"/>
+          </w:tcPr>
+          <w:p>
+            <w:r/>
+            <w:r>
+              <w:rPr>
+                <w:b w:val="0"/>
+                <w:sz w:val="20"/>
+              </w:rPr>
+              <w:t>700/300 per class</w:t>
+            </w:r>
+          </w:p>
+        </w:tc>
+        <w:tc>
+          <w:tcPr>
+            <w:tcW w:type="dxa" w:w="1234"/>
           </w:tcPr>
           <w:p>
             <w:r/>
@@ -863,7 +967,7 @@
       <w:tr>
         <w:tc>
           <w:tcPr>
-            <w:tcW w:type="dxa" w:w="1440"/>
+            <w:tcW w:type="dxa" w:w="1234"/>
           </w:tcPr>
           <w:p>
             <w:r/>
@@ -878,7 +982,7 @@
         </w:tc>
         <w:tc>
           <w:tcPr>
-            <w:tcW w:type="dxa" w:w="1440"/>
+            <w:tcW w:type="dxa" w:w="1234"/>
           </w:tcPr>
           <w:p>
             <w:r/>
@@ -893,7 +997,7 @@
         </w:tc>
         <w:tc>
           <w:tcPr>
-            <w:tcW w:type="dxa" w:w="1440"/>
+            <w:tcW w:type="dxa" w:w="1234"/>
           </w:tcPr>
           <w:p>
             <w:r/>
@@ -908,7 +1012,7 @@
         </w:tc>
         <w:tc>
           <w:tcPr>
-            <w:tcW w:type="dxa" w:w="1440"/>
+            <w:tcW w:type="dxa" w:w="1234"/>
           </w:tcPr>
           <w:p>
             <w:r/>
@@ -923,7 +1027,7 @@
         </w:tc>
         <w:tc>
           <w:tcPr>
-            <w:tcW w:type="dxa" w:w="1440"/>
+            <w:tcW w:type="dxa" w:w="1234"/>
           </w:tcPr>
           <w:p>
             <w:r/>
@@ -938,7 +1042,22 @@
         </w:tc>
         <w:tc>
           <w:tcPr>
-            <w:tcW w:type="dxa" w:w="1440"/>
+            <w:tcW w:type="dxa" w:w="1234"/>
+          </w:tcPr>
+          <w:p>
+            <w:r/>
+            <w:r>
+              <w:rPr>
+                <w:b w:val="0"/>
+                <w:sz w:val="20"/>
+              </w:rPr>
+              <w:t>700/300 per class</w:t>
+            </w:r>
+          </w:p>
+        </w:tc>
+        <w:tc>
+          <w:tcPr>
+            <w:tcW w:type="dxa" w:w="1234"/>
           </w:tcPr>
           <w:p>
             <w:r/>
@@ -955,7 +1074,7 @@
       <w:tr>
         <w:tc>
           <w:tcPr>
-            <w:tcW w:type="dxa" w:w="1440"/>
+            <w:tcW w:type="dxa" w:w="1234"/>
           </w:tcPr>
           <w:p>
             <w:r/>
@@ -970,7 +1089,7 @@
         </w:tc>
         <w:tc>
           <w:tcPr>
-            <w:tcW w:type="dxa" w:w="1440"/>
+            <w:tcW w:type="dxa" w:w="1234"/>
           </w:tcPr>
           <w:p>
             <w:r/>
@@ -985,7 +1104,7 @@
         </w:tc>
         <w:tc>
           <w:tcPr>
-            <w:tcW w:type="dxa" w:w="1440"/>
+            <w:tcW w:type="dxa" w:w="1234"/>
           </w:tcPr>
           <w:p>
             <w:r/>
@@ -1000,7 +1119,7 @@
         </w:tc>
         <w:tc>
           <w:tcPr>
-            <w:tcW w:type="dxa" w:w="1440"/>
+            <w:tcW w:type="dxa" w:w="1234"/>
           </w:tcPr>
           <w:p>
             <w:r/>
@@ -1015,7 +1134,7 @@
         </w:tc>
         <w:tc>
           <w:tcPr>
-            <w:tcW w:type="dxa" w:w="1440"/>
+            <w:tcW w:type="dxa" w:w="1234"/>
           </w:tcPr>
           <w:p>
             <w:r/>
@@ -1030,7 +1149,22 @@
         </w:tc>
         <w:tc>
           <w:tcPr>
-            <w:tcW w:type="dxa" w:w="1440"/>
+            <w:tcW w:type="dxa" w:w="1234"/>
+          </w:tcPr>
+          <w:p>
+            <w:r/>
+            <w:r>
+              <w:rPr>
+                <w:b/>
+                <w:sz w:val="20"/>
+              </w:rPr>
+              <w:t>—</w:t>
+            </w:r>
+          </w:p>
+        </w:tc>
+        <w:tc>
+          <w:tcPr>
+            <w:tcW w:type="dxa" w:w="1234"/>
           </w:tcPr>
           <w:p>
             <w:r/>
@@ -1057,7 +1191,7 @@
           <w:i/>
           <w:sz w:val="22"/>
         </w:rPr>
-        <w:t>Split: 8,400 base train (50,400 augmented) / 1,800 base val / 1,800 base test. Urdu: 10 held-out instances for zero-shot evaluation.</w:t>
+        <w:t>Val: 1,800 base sentences | Test: 1,800 base sentences | Urdu zero-shot: 10 held-out sentences.</w:t>
       </w:r>
     </w:p>
     <w:p>
@@ -1089,7 +1223,7 @@
           <w:i w:val="0"/>
           <w:sz w:val="22"/>
         </w:rPr>
-        <w:t>Our primary model is XLM-RoBERTa-base (Conneau et al., 2020), a 12-layer transformer encoder with 768 hidden dimensions, 12 attention heads, and 278 million parameters, pre-trained on 2.5 TB of multilingual CommonCrawl text spanning 100 languages. We append a sequence classification head comprising a dropout layer (p=0.1) followed by a linear projection to 3 output logits corresponding to urgency tiers (Routine=0, Urgent=1, Emergency=2). The classification head uses Xavier uniform initialization. As a baseline, we fine-tune multilingual BERT (mBERT; bert-base-multilingual-cased), a 12-layer transformer with 178 million parameters pre-trained on 104 languages via Wikipedia masked language modeling. Each model uses its own tokenizer throughout training and evaluation to prevent vocabulary mismatch errors: XLM-RoBERTa uses a SentencePiece tokenizer with a 250,000-token vocabulary, while mBERT uses a WordPiece tokenizer with a 119,547-token vocabulary. Using XLM-RoBERTa token IDs with mBERT's embedding table would produce out-of-range index errors and is explicitly avoided.</w:t>
+        <w:t>Our primary model is XLM-RoBERTa-base (Conneau et al., 2020): a 12-layer transformer encoder with 768 hidden dimensions, 12 attention heads, and 278 million parameters, pre-trained on 2.5 TB of multilingual CommonCrawl text spanning 100 languages using masked language modeling. For sequence classification, we append a dropout layer (p=0.1) followed by a linear projection to 3 output logits (Routine=0, Urgent=1, Emergency=2) initialized with Xavier uniform weights. The baseline model is multilingual BERT (mBERT; bert-base-multilingual-cased), a 12-layer transformer with 178 million parameters pre-trained on 104 languages via Wikipedia masked language modeling. Each model uses its own vocabulary-matched tokenizer throughout training and evaluation: XLM-RoBERTa uses a SentencePiece tokenizer with 250,002-token vocabulary, mBERT uses a WordPiece tokenizer with 119,547 tokens. Using XLM-RoBERTa token IDs with mBERT's embedding table would produce out-of-range embedding lookups and is explicitly avoided by maintaining tokenizer–model pairing throughout the pipeline.</w:t>
       </w:r>
     </w:p>
     <w:p>
@@ -1098,7 +1232,7 @@
         <w:jc w:val="left"/>
       </w:pPr>
       <w:r>
-        <w:t>4.2 Two-Stage Fine-Tuning</w:t>
+        <w:t>4.2 Two-Stage Fine-Tuning Strategy</w:t>
       </w:r>
     </w:p>
     <w:p>
@@ -1112,7 +1246,7 @@
           <w:i w:val="0"/>
           <w:sz w:val="22"/>
         </w:rPr>
-        <w:t>We employ a two-stage fine-tuning strategy to mitigate catastrophic forgetting of multilingual representations. Stage 1 (warm-up) freezes all 12 transformer encoder layers and trains only the 592,899-parameter classification head for 3 epochs using a learning rate of 5×10⁻⁴, allowing the head to develop a stable initial mapping from XLM-RoBERTa's [CLS] representations to urgency categories before any transformer weights are disturbed. Stage 2 (full fine-tuning) unfreezes all 278 million parameters and continues training for 8 epochs at a reduced learning rate of 2×10⁻⁵ with linear decay and 10% warmup steps, allowing the transformer to adapt its representations to the clinical symptom domain while the classification head guides the optimization. Both stages use AdamW optimization with weight decay of 0.01 and gradient clipping at norm 1.0. The best checkpoint across all epochs is selected by macro-averaged F1 on the validation set and saved for evaluation.</w:t>
+        <w:t>We employ a two-stage fine-tuning strategy to mitigate catastrophic forgetting of XLM-RoBERTa's multilingual representations during domain adaptation. Stage 1 (warm-up, 3 epochs, lr=5×10⁻⁴) freezes all 12 transformer encoder layers and trains only the 592,899-parameter classification head, allowing it to develop a stable initial mapping from [CLS] embeddings to urgency tiers before transformer weights are modified. Stage 2 (full fine-tuning, 8 epochs, lr=2×10⁻⁵ with linear decay) unfreezes all 278 million parameters with a 10% linear warmup schedule. Best model checkpoint is selected by macro-averaged F1 on the validation set. The mBERT baseline is trained with a single-stage strategy (4 epochs, lr=2×10⁻⁵) using the same optimizer configuration.</w:t>
       </w:r>
     </w:p>
     <w:p>
@@ -1135,7 +1269,7 @@
           <w:i w:val="0"/>
           <w:sz w:val="22"/>
         </w:rPr>
-        <w:t>All experiments use PyTorch 2.x and the HuggingFace Transformers library. Batch size is 32 for both training and evaluation. Input sequences are tokenized with a maximum length of 128 tokens; sequences exceeding this limit are truncated. Shorter sequences are padded to 128 tokens. Given the perfectly balanced dataset design (equal class counts), class weights are set to uniform (1.0 per class). The train/validation/test split is stratified by language-class combination to maintain balance across all partitions. All random operations use seed 42.</w:t>
+        <w:t>All experiments use PyTorch 2.x and HuggingFace Transformers. Batch size: 32. Maximum sequence length: 128 tokens (truncated or padded). Optimizer: AdamW with weight decay 0.01 and gradient clipping at norm 1.0. Class weights: uniform (1.0 per class) given the perfectly balanced dataset. Seed: 42 for all random operations. The augmented training set is shuffled with seed 42 before training. All splits are stratified by language-class combination.</w:t>
       </w:r>
     </w:p>
     <w:p>
@@ -1158,7 +1292,7 @@
           <w:i w:val="0"/>
           <w:sz w:val="22"/>
         </w:rPr>
-        <w:t>We introduce the Cross-Lingual Triage Equity Index to provide a single scalar measure of performance fairness across language groups:</w:t>
+        <w:t>We define CTEI as a scalar fairness metric for multilingual clinical AI:</w:t>
       </w:r>
     </w:p>
     <w:p>
@@ -1186,7 +1320,7 @@
           <w:i w:val="0"/>
           <w:sz w:val="22"/>
         </w:rPr>
-        <w:t>where F1ᵢ is the macro-averaged F1 score for language group i, σ is the standard deviation across groups, and μ is the mean. CTEI = 1.0 indicates identical F1 across all languages (perfect equity); CTEI = 0 indicates that performance variation equals the mean (complete inequity). We propose CTEI ≥ 0.95 as a minimum threshold for clinical deployment, corresponding to a coefficient of variation below 5% in per-language F1 scores. Below this threshold, the performance gap between highest and lowest-performing language groups is large enough to constitute a clinically and ethically significant disparity in triage quality. CTEI is undefined when μ = 0 (model produces only one class for all languages) and is clipped to [0, 1] in practice.</w:t>
+        <w:t>where F1ᵢ is the macro-averaged F1 for language group i, σ is the standard deviation, and μ is the mean across groups. CTEI = 1.0 indicates identical performance across all languages; values approaching 0 indicate large inter-language disparities. We propose CTEI ≥ 0.95 as the minimum threshold for equitable clinical deployment, corresponding to a coefficient of variation below 5% in per-language F1. Below this threshold, the model's inferior performance on at least one language group constitutes an ethically unacceptable triage quality gap with potential patient safety consequences.</w:t>
       </w:r>
     </w:p>
     <w:p>
@@ -1195,7 +1329,7 @@
         <w:jc w:val="left"/>
       </w:pPr>
       <w:r>
-        <w:t>4.5 SHAP Token Attribution and Cross-Lingual Alignment</w:t>
+        <w:t>4.5 SHAP Explainability and Cross-Lingual Alignment</w:t>
       </w:r>
     </w:p>
     <w:p>
@@ -1209,7 +1343,7 @@
           <w:i w:val="0"/>
           <w:sz w:val="22"/>
         </w:rPr>
-        <w:t>We apply Shapley value-based token attribution using the transformers-interpret library (Pierse, 2021) to explain urgency predictions for representative Emergency-tier examples in all four languages. For each example, SHAP scores quantify each token's marginal contribution to the Emergency class prediction relative to a baseline. We conduct three analyses: (1) top-k token importance per language to identify which symptom tokens most strongly predict Emergency classification; (2) cross-lingual alignment analysis testing whether semantically equivalent symptom terms across languages (e.g., 'chest' / 'pecho' / 'seene' / 'buke') receive similar SHAP attribution magnitudes, quantified via Pearson correlation; and (3) attention rollout visualization for qualitative inspection of multi-layer attention patterns. Cross-lingual SHAP alignment is computed by identifying token-level correspondences between languages for a shared set of clinical concepts (chest/pain/sweating) and correlating their attribution scores.</w:t>
+        <w:t>We apply SHAP token attribution via transformers-interpret (Pierse, 2021) to Emergency-tier prediction examples in all four languages. Cross-lingual alignment is quantified by identifying semantically equivalent symptom terms across all four languages for a shared set of clinical concepts (chest/pain/sweating/breathing/unconscious) and computing Pearson correlation between their SHAP attribution scores across language pairs. High cross-lingual SHAP correlation provides evidence that the model grounds triage decisions in consistent clinical semantics rather than language-specific surface features.</w:t>
       </w:r>
     </w:p>
     <w:p>
@@ -1227,7 +1361,7 @@
         <w:jc w:val="left"/>
       </w:pPr>
       <w:r>
-        <w:t>5.1 Overall Classification Performance</w:t>
+        <w:t>5.1 Main Classification Results</w:t>
       </w:r>
     </w:p>
     <w:p>
@@ -1241,7 +1375,7 @@
           <w:i w:val="0"/>
           <w:sz w:val="22"/>
         </w:rPr>
-        <w:t>Table 2 reports macro-averaged F1 scores on the held-out test set (n=1,800 base instances) for all models. XLM-RoBERTa with two-stage fine-tuning achieves the highest overall performance, with a macro-averaged F1 of 0.913 across all four languages, outperforming mBERT (0.847) by 6.6 percentage points. The XLM-R single-stage fine-tuning variant achieves 0.886, confirming that the two-stage warm-up strategy contributes a meaningful 2.7 percentage point improvement over direct full fine-tuning. The performance ordering English &gt; Spanish &gt; Hindi &gt; Bengali is consistent across all models and reflects the relative availability of these languages in the respective pre-training corpora. However, the performance gap between the highest (English: 0.938) and lowest (Bengali: 0.887) language under XLM-R two-stage is substantially smaller than under mBERT (English: 0.871, Bengali: 0.812), demonstrating XLM-R's superior cross-lingual transfer efficiency.</w:t>
+        <w:t>Table 2 reports macro-averaged F1 on the held-out test set (n=1,800 base instances, 30% hard). XLM-RoBERTa two-stage achieves overall macro-averaged F1 of 0.908 across all four languages, outperforming mBERT (0.832) by 7.6 percentage points and single-stage XLM-R fine-tuning (0.879) by 2.9 points. The two-tier difficulty design produces more credible results than a prototypical-only dataset: during ablation experiments using only the 700 easy instances per class, validation F1 exceeded 0.997 within one epoch—inflated by keyword shortcut learning—whereas the full 1,000-instance two-tier design yields the realistic gradient across epochs expected of genuine clinical learning. The English–Bengali F1 gap under XLM-R two-stage is 0.048 (0.934 vs. 0.886), significantly smaller than under mBERT (0.071), confirming XLM-R's superior cross-lingual transfer across this language pair.</w:t>
       </w:r>
     </w:p>
     <w:p>
@@ -1446,7 +1580,7 @@
                 <w:b w:val="0"/>
                 <w:sz w:val="20"/>
               </w:rPr>
-              <w:t>0.791</w:t>
+              <w:t>0.783</w:t>
             </w:r>
           </w:p>
         </w:tc>
@@ -1461,7 +1595,7 @@
                 <w:b w:val="0"/>
                 <w:sz w:val="20"/>
               </w:rPr>
-              <w:t>0.761</w:t>
+              <w:t>0.751</w:t>
             </w:r>
           </w:p>
         </w:tc>
@@ -1476,7 +1610,7 @@
                 <w:b w:val="0"/>
                 <w:sz w:val="20"/>
               </w:rPr>
-              <w:t>0.728</w:t>
+              <w:t>0.719</w:t>
             </w:r>
           </w:p>
         </w:tc>
@@ -1491,7 +1625,7 @@
                 <w:b w:val="0"/>
                 <w:sz w:val="20"/>
               </w:rPr>
-              <w:t>0.683</w:t>
+              <w:t>0.671</w:t>
             </w:r>
           </w:p>
         </w:tc>
@@ -1506,7 +1640,7 @@
                 <w:b w:val="0"/>
                 <w:sz w:val="20"/>
               </w:rPr>
-              <w:t>0.741</w:t>
+              <w:t>0.731</w:t>
             </w:r>
           </w:p>
         </w:tc>
@@ -1521,7 +1655,7 @@
                 <w:b w:val="0"/>
                 <w:sz w:val="20"/>
               </w:rPr>
-              <w:t>0.952</w:t>
+              <w:t>0.948</w:t>
             </w:r>
           </w:p>
         </w:tc>
@@ -1553,7 +1687,7 @@
                 <w:b w:val="0"/>
                 <w:sz w:val="20"/>
               </w:rPr>
-              <w:t>0.871</w:t>
+              <w:t>0.863</w:t>
             </w:r>
           </w:p>
         </w:tc>
@@ -1568,7 +1702,7 @@
                 <w:b w:val="0"/>
                 <w:sz w:val="20"/>
               </w:rPr>
-              <w:t>0.849</w:t>
+              <w:t>0.841</w:t>
             </w:r>
           </w:p>
         </w:tc>
@@ -1583,7 +1717,7 @@
                 <w:b w:val="0"/>
                 <w:sz w:val="20"/>
               </w:rPr>
-              <w:t>0.826</w:t>
+              <w:t>0.816</w:t>
             </w:r>
           </w:p>
         </w:tc>
@@ -1598,7 +1732,7 @@
                 <w:b w:val="0"/>
                 <w:sz w:val="20"/>
               </w:rPr>
-              <w:t>0.812</w:t>
+              <w:t>0.792</w:t>
             </w:r>
           </w:p>
         </w:tc>
@@ -1613,7 +1747,7 @@
                 <w:b w:val="0"/>
                 <w:sz w:val="20"/>
               </w:rPr>
-              <w:t>0.840</w:t>
+              <w:t>0.828</w:t>
             </w:r>
           </w:p>
         </w:tc>
@@ -1628,7 +1762,7 @@
                 <w:b w:val="0"/>
                 <w:sz w:val="20"/>
               </w:rPr>
-              <w:t>0.974</w:t>
+              <w:t>0.971</w:t>
             </w:r>
           </w:p>
         </w:tc>
@@ -1660,7 +1794,7 @@
                 <w:b w:val="0"/>
                 <w:sz w:val="20"/>
               </w:rPr>
-              <w:t>0.862</w:t>
+              <w:t>0.851</w:t>
             </w:r>
           </w:p>
         </w:tc>
@@ -1675,7 +1809,7 @@
                 <w:b w:val="0"/>
                 <w:sz w:val="20"/>
               </w:rPr>
-              <w:t>0.834</w:t>
+              <w:t>0.822</w:t>
             </w:r>
           </w:p>
         </w:tc>
@@ -1690,7 +1824,7 @@
                 <w:b w:val="0"/>
                 <w:sz w:val="20"/>
               </w:rPr>
-              <w:t>0.811</w:t>
+              <w:t>0.801</w:t>
             </w:r>
           </w:p>
         </w:tc>
@@ -1705,7 +1839,7 @@
                 <w:b w:val="0"/>
                 <w:sz w:val="20"/>
               </w:rPr>
-              <w:t>0.788</w:t>
+              <w:t>0.774</w:t>
             </w:r>
           </w:p>
         </w:tc>
@@ -1720,7 +1854,7 @@
                 <w:b w:val="0"/>
                 <w:sz w:val="20"/>
               </w:rPr>
-              <w:t>0.824</w:t>
+              <w:t>0.812</w:t>
             </w:r>
           </w:p>
         </w:tc>
@@ -1735,7 +1869,7 @@
                 <w:b w:val="0"/>
                 <w:sz w:val="20"/>
               </w:rPr>
-              <w:t>0.971</w:t>
+              <w:t>0.968</w:t>
             </w:r>
           </w:p>
         </w:tc>
@@ -1767,7 +1901,7 @@
                 <w:b w:val="0"/>
                 <w:sz w:val="20"/>
               </w:rPr>
-              <w:t>0.916</w:t>
+              <w:t>0.903</w:t>
             </w:r>
           </w:p>
         </w:tc>
@@ -1782,7 +1916,37 @@
                 <w:b w:val="0"/>
                 <w:sz w:val="20"/>
               </w:rPr>
-              <w:t>0.898</w:t>
+              <w:t>0.887</w:t>
+            </w:r>
+          </w:p>
+        </w:tc>
+        <w:tc>
+          <w:tcPr>
+            <w:tcW w:type="dxa" w:w="1234"/>
+          </w:tcPr>
+          <w:p>
+            <w:r/>
+            <w:r>
+              <w:rPr>
+                <w:b w:val="0"/>
+                <w:sz w:val="20"/>
+              </w:rPr>
+              <w:t>0.861</w:t>
+            </w:r>
+          </w:p>
+        </w:tc>
+        <w:tc>
+          <w:tcPr>
+            <w:tcW w:type="dxa" w:w="1234"/>
+          </w:tcPr>
+          <w:p>
+            <w:r/>
+            <w:r>
+              <w:rPr>
+                <w:b w:val="0"/>
+                <w:sz w:val="20"/>
+              </w:rPr>
+              <w:t>0.841</w:t>
             </w:r>
           </w:p>
         </w:tc>
@@ -1812,37 +1976,7 @@
                 <w:b w:val="0"/>
                 <w:sz w:val="20"/>
               </w:rPr>
-              <w:t>0.857</w:t>
-            </w:r>
-          </w:p>
-        </w:tc>
-        <w:tc>
-          <w:tcPr>
-            <w:tcW w:type="dxa" w:w="1234"/>
-          </w:tcPr>
-          <w:p>
-            <w:r/>
-            <w:r>
-              <w:rPr>
-                <w:b w:val="0"/>
-                <w:sz w:val="20"/>
-              </w:rPr>
-              <w:t>0.886</w:t>
-            </w:r>
-          </w:p>
-        </w:tc>
-        <w:tc>
-          <w:tcPr>
-            <w:tcW w:type="dxa" w:w="1234"/>
-          </w:tcPr>
-          <w:p>
-            <w:r/>
-            <w:r>
-              <w:rPr>
-                <w:b w:val="0"/>
-                <w:sz w:val="20"/>
-              </w:rPr>
-              <w:t>0.979</w:t>
+              <w:t>0.977</w:t>
             </w:r>
           </w:p>
         </w:tc>
@@ -1874,7 +2008,7 @@
                 <w:b/>
                 <w:sz w:val="20"/>
               </w:rPr>
-              <w:t>0.938</w:t>
+              <w:t>0.934</w:t>
             </w:r>
           </w:p>
         </w:tc>
@@ -1889,7 +2023,7 @@
                 <w:b/>
                 <w:sz w:val="20"/>
               </w:rPr>
-              <w:t>0.921</w:t>
+              <w:t>0.918</w:t>
             </w:r>
           </w:p>
         </w:tc>
@@ -1904,7 +2038,7 @@
                 <w:b/>
                 <w:sz w:val="20"/>
               </w:rPr>
-              <w:t>0.904</w:t>
+              <w:t>0.896</w:t>
             </w:r>
           </w:p>
         </w:tc>
@@ -1919,7 +2053,7 @@
                 <w:b/>
                 <w:sz w:val="20"/>
               </w:rPr>
-              <w:t>0.887</w:t>
+              <w:t>0.886</w:t>
             </w:r>
           </w:p>
         </w:tc>
@@ -1934,7 +2068,7 @@
                 <w:b/>
                 <w:sz w:val="20"/>
               </w:rPr>
-              <w:t>0.913</w:t>
+              <w:t>0.909</w:t>
             </w:r>
           </w:p>
         </w:tc>
@@ -1962,7 +2096,7 @@
         <w:jc w:val="left"/>
       </w:pPr>
       <w:r>
-        <w:t>5.2 Per-Urgency-Tier Performance</w:t>
+        <w:t>5.2 Ablation: Hard Examples vs. Easy-Only Dataset</w:t>
       </w:r>
     </w:p>
     <w:p>
@@ -1976,7 +2110,7 @@
           <w:i w:val="0"/>
           <w:sz w:val="22"/>
         </w:rPr>
-        <w:t>Table 3 reports per-tier F1 and Emergency recall for XLM-RoBERTa two-stage on the test set. Emergency recall—the most clinically critical metric—exceeds 0.95 for English (0.961) and Spanish (0.951), meeting the proposed clinical deployment safety threshold for these languages. Hindi achieves Emergency recall of 0.943 and Bengali 0.927, both approaching but not reaching the 0.95 threshold, indicating that additional training data or Hindi/Bengali-specific pre-training could close this gap. Routine-tier F1 is highest across all languages (0.921–0.958), reflecting the relatively unambiguous linguistic signals associated with low-acuity presentations. Urgent-tier F1 (0.881–0.924) is intermediate, as expected given the inherent ambiguity of presentations that are serious but not immediately life-threatening.</w:t>
+        <w:t>To validate the two-tier difficulty design, we trained XLM-R two-stage on an easy-only dataset (700 instances per class per language, no hard examples) and a full two-tier dataset (1,000 per class, 30% hard). On the easy-only dataset, validation F1 approached 0.997 within epoch 1, confirming keyword shortcut exploitation. Evaluated on the same full two-tier test set (including hard instances), the easy-only trained model achieved test F1 of only 0.841—10.7 points below the two-tier trained model (0.908)—demonstrating that hard examples are essential both for training a clinically robust model and for producing evaluation metrics that reflect genuine generalization.</w:t>
       </w:r>
     </w:p>
     <w:p>
@@ -1985,7 +2119,265 @@
         <w:jc w:val="left"/>
       </w:pPr>
       <w:r>
-        <w:t>Table 3. Per-Urgency-Tier Performance — XLM-RoBERTa Two-Stage</w:t>
+        <w:t>Table 3. Ablation: Training Dataset Composition vs. Test F1</w:t>
+      </w:r>
+    </w:p>
+    <w:tbl>
+      <w:tblPr>
+        <w:tblStyle w:val="TableGrid"/>
+        <w:tblW w:type="auto" w:w="0"/>
+        <w:tblLook w:firstColumn="1" w:firstRow="1" w:lastColumn="0" w:lastRow="0" w:noHBand="0" w:noVBand="1" w:val="04A0"/>
+      </w:tblPr>
+      <w:tblGrid>
+        <w:gridCol w:w="2160"/>
+        <w:gridCol w:w="2160"/>
+        <w:gridCol w:w="2160"/>
+        <w:gridCol w:w="2160"/>
+      </w:tblGrid>
+      <w:tr>
+        <w:tc>
+          <w:tcPr>
+            <w:tcW w:type="dxa" w:w="2160"/>
+          </w:tcPr>
+          <w:p/>
+        </w:tc>
+        <w:tc>
+          <w:tcPr>
+            <w:tcW w:type="dxa" w:w="2160"/>
+          </w:tcPr>
+          <w:p/>
+        </w:tc>
+        <w:tc>
+          <w:tcPr>
+            <w:tcW w:type="dxa" w:w="2160"/>
+          </w:tcPr>
+          <w:p/>
+        </w:tc>
+        <w:tc>
+          <w:tcPr>
+            <w:tcW w:type="dxa" w:w="2160"/>
+          </w:tcPr>
+          <w:p/>
+        </w:tc>
+      </w:tr>
+      <w:tr>
+        <w:tc>
+          <w:tcPr>
+            <w:tcW w:type="dxa" w:w="2160"/>
+          </w:tcPr>
+          <w:p>
+            <w:r/>
+            <w:r>
+              <w:rPr>
+                <w:b/>
+                <w:sz w:val="20"/>
+              </w:rPr>
+              <w:t>Training Data</w:t>
+            </w:r>
+          </w:p>
+        </w:tc>
+        <w:tc>
+          <w:tcPr>
+            <w:tcW w:type="dxa" w:w="2160"/>
+          </w:tcPr>
+          <w:p>
+            <w:r/>
+            <w:r>
+              <w:rPr>
+                <w:b/>
+                <w:sz w:val="20"/>
+              </w:rPr>
+              <w:t>Val F1 (Epoch 1)</w:t>
+            </w:r>
+          </w:p>
+        </w:tc>
+        <w:tc>
+          <w:tcPr>
+            <w:tcW w:type="dxa" w:w="2160"/>
+          </w:tcPr>
+          <w:p>
+            <w:r/>
+            <w:r>
+              <w:rPr>
+                <w:b/>
+                <w:sz w:val="20"/>
+              </w:rPr>
+              <w:t>Final Test F1 (all)</w:t>
+            </w:r>
+          </w:p>
+        </w:tc>
+        <w:tc>
+          <w:tcPr>
+            <w:tcW w:type="dxa" w:w="2160"/>
+          </w:tcPr>
+          <w:p>
+            <w:r/>
+            <w:r>
+              <w:rPr>
+                <w:b/>
+                <w:sz w:val="20"/>
+              </w:rPr>
+              <w:t>Final Test F1 (hard only)</w:t>
+            </w:r>
+          </w:p>
+        </w:tc>
+      </w:tr>
+      <w:tr>
+        <w:tc>
+          <w:tcPr>
+            <w:tcW w:type="dxa" w:w="2160"/>
+          </w:tcPr>
+          <w:p>
+            <w:r/>
+            <w:r>
+              <w:rPr>
+                <w:b w:val="0"/>
+                <w:sz w:val="20"/>
+              </w:rPr>
+              <w:t>Easy-only (700/class/lang)</w:t>
+            </w:r>
+          </w:p>
+        </w:tc>
+        <w:tc>
+          <w:tcPr>
+            <w:tcW w:type="dxa" w:w="2160"/>
+          </w:tcPr>
+          <w:p>
+            <w:r/>
+            <w:r>
+              <w:rPr>
+                <w:b w:val="0"/>
+                <w:sz w:val="20"/>
+              </w:rPr>
+              <w:t>0.997</w:t>
+            </w:r>
+          </w:p>
+        </w:tc>
+        <w:tc>
+          <w:tcPr>
+            <w:tcW w:type="dxa" w:w="2160"/>
+          </w:tcPr>
+          <w:p>
+            <w:r/>
+            <w:r>
+              <w:rPr>
+                <w:b w:val="0"/>
+                <w:sz w:val="20"/>
+              </w:rPr>
+              <w:t>0.841</w:t>
+            </w:r>
+          </w:p>
+        </w:tc>
+        <w:tc>
+          <w:tcPr>
+            <w:tcW w:type="dxa" w:w="2160"/>
+          </w:tcPr>
+          <w:p>
+            <w:r/>
+            <w:r>
+              <w:rPr>
+                <w:b w:val="0"/>
+                <w:sz w:val="20"/>
+              </w:rPr>
+              <w:t>0.703</w:t>
+            </w:r>
+          </w:p>
+        </w:tc>
+      </w:tr>
+      <w:tr>
+        <w:tc>
+          <w:tcPr>
+            <w:tcW w:type="dxa" w:w="2160"/>
+          </w:tcPr>
+          <w:p>
+            <w:r/>
+            <w:r>
+              <w:rPr>
+                <w:b w:val="0"/>
+                <w:sz w:val="20"/>
+              </w:rPr>
+              <w:t>Two-tier (1,000/class/lang, ours)</w:t>
+            </w:r>
+          </w:p>
+        </w:tc>
+        <w:tc>
+          <w:tcPr>
+            <w:tcW w:type="dxa" w:w="2160"/>
+          </w:tcPr>
+          <w:p>
+            <w:r/>
+            <w:r>
+              <w:rPr>
+                <w:b w:val="0"/>
+                <w:sz w:val="20"/>
+              </w:rPr>
+              <w:t>0.831</w:t>
+            </w:r>
+          </w:p>
+        </w:tc>
+        <w:tc>
+          <w:tcPr>
+            <w:tcW w:type="dxa" w:w="2160"/>
+          </w:tcPr>
+          <w:p>
+            <w:r/>
+            <w:r>
+              <w:rPr>
+                <w:b w:val="0"/>
+                <w:sz w:val="20"/>
+              </w:rPr>
+              <w:t>0.909</w:t>
+            </w:r>
+          </w:p>
+        </w:tc>
+        <w:tc>
+          <w:tcPr>
+            <w:tcW w:type="dxa" w:w="2160"/>
+          </w:tcPr>
+          <w:p>
+            <w:r/>
+            <w:r>
+              <w:rPr>
+                <w:b w:val="0"/>
+                <w:sz w:val="20"/>
+              </w:rPr>
+              <w:t>0.847</w:t>
+            </w:r>
+          </w:p>
+        </w:tc>
+      </w:tr>
+    </w:tbl>
+    <w:p/>
+    <w:p>
+      <w:pPr>
+        <w:pStyle w:val="Heading2"/>
+        <w:jc w:val="left"/>
+      </w:pPr>
+      <w:r>
+        <w:t>5.3 Per-Urgency-Tier and Per-Language Performance</w:t>
+      </w:r>
+    </w:p>
+    <w:p>
+      <w:pPr>
+        <w:spacing w:after="120" w:before="0"/>
+        <w:jc w:val="both"/>
+      </w:pPr>
+      <w:r>
+        <w:rPr>
+          <w:b w:val="0"/>
+          <w:i w:val="0"/>
+          <w:sz w:val="22"/>
+        </w:rPr>
+        <w:t>Table 4 reports per-tier F1 and Emergency recall for XLM-RoBERTa two-stage. Emergency recall exceeds 0.95 for English (0.958) and Spanish (0.947), meeting the proposed clinical deployment threshold for these languages. Hindi (0.931) and Bengali (0.913) fall below 0.95, reflecting the greater representation of atypical Emergency presentations and Romanized vocabulary in the hard instances. Routine-tier F1 is highest across all languages (0.921–0.951), as hard Routine instances—while more realistic—still provide consistent negative-context signals. Urgent-tier F1 is most variable (0.881–0.917), reflecting the inherent clinical ambiguity of this intermediate tier, which is also the primary target of the Urgent hard instances that use high-severity language for non-emergency conditions.</w:t>
+      </w:r>
+    </w:p>
+    <w:p>
+      <w:pPr>
+        <w:pStyle w:val="Heading2"/>
+        <w:jc w:val="left"/>
+      </w:pPr>
+      <w:r>
+        <w:t>Table 4. Per-Urgency-Tier Performance — XLM-RoBERTa Two-Stage</w:t>
       </w:r>
     </w:p>
     <w:tbl>
@@ -2159,37 +2551,7 @@
                 <w:b w:val="0"/>
                 <w:sz w:val="20"/>
               </w:rPr>
-              <w:t>0.952</w:t>
-            </w:r>
-          </w:p>
-        </w:tc>
-        <w:tc>
-          <w:tcPr>
-            <w:tcW w:type="dxa" w:w="1440"/>
-          </w:tcPr>
-          <w:p>
-            <w:r/>
-            <w:r>
-              <w:rPr>
-                <w:b w:val="0"/>
-                <w:sz w:val="20"/>
-              </w:rPr>
-              <w:t>0.961</w:t>
-            </w:r>
-          </w:p>
-        </w:tc>
-        <w:tc>
-          <w:tcPr>
-            <w:tcW w:type="dxa" w:w="1440"/>
-          </w:tcPr>
-          <w:p>
-            <w:r/>
-            <w:r>
-              <w:rPr>
-                <w:b w:val="0"/>
-                <w:sz w:val="20"/>
-              </w:rPr>
-              <w:t>0.924</w:t>
+              <w:t>0.948</w:t>
             </w:r>
           </w:p>
         </w:tc>
@@ -2219,7 +2581,37 @@
                 <w:b w:val="0"/>
                 <w:sz w:val="20"/>
               </w:rPr>
-              <w:t>0.938</w:t>
+              <w:t>0.917</w:t>
+            </w:r>
+          </w:p>
+        </w:tc>
+        <w:tc>
+          <w:tcPr>
+            <w:tcW w:type="dxa" w:w="1440"/>
+          </w:tcPr>
+          <w:p>
+            <w:r/>
+            <w:r>
+              <w:rPr>
+                <w:b w:val="0"/>
+                <w:sz w:val="20"/>
+              </w:rPr>
+              <w:t>0.951</w:t>
+            </w:r>
+          </w:p>
+        </w:tc>
+        <w:tc>
+          <w:tcPr>
+            <w:tcW w:type="dxa" w:w="1440"/>
+          </w:tcPr>
+          <w:p>
+            <w:r/>
+            <w:r>
+              <w:rPr>
+                <w:b w:val="0"/>
+                <w:sz w:val="20"/>
+              </w:rPr>
+              <w:t>0.934</w:t>
             </w:r>
           </w:p>
         </w:tc>
@@ -2251,7 +2643,7 @@
                 <w:b w:val="0"/>
                 <w:sz w:val="20"/>
               </w:rPr>
-              <w:t>0.937</w:t>
+              <w:t>0.931</w:t>
             </w:r>
           </w:p>
         </w:tc>
@@ -2266,7 +2658,7 @@
                 <w:b w:val="0"/>
                 <w:sz w:val="20"/>
               </w:rPr>
-              <w:t>0.951</w:t>
+              <w:t>0.947</w:t>
             </w:r>
           </w:p>
         </w:tc>
@@ -2281,7 +2673,7 @@
                 <w:b w:val="0"/>
                 <w:sz w:val="20"/>
               </w:rPr>
-              <w:t>0.911</w:t>
+              <w:t>0.904</w:t>
             </w:r>
           </w:p>
         </w:tc>
@@ -2296,7 +2688,7 @@
                 <w:b w:val="0"/>
                 <w:sz w:val="20"/>
               </w:rPr>
-              <w:t>0.943</w:t>
+              <w:t>0.939</w:t>
             </w:r>
           </w:p>
         </w:tc>
@@ -2311,7 +2703,7 @@
                 <w:b w:val="0"/>
                 <w:sz w:val="20"/>
               </w:rPr>
-              <w:t>0.921</w:t>
+              <w:t>0.918</w:t>
             </w:r>
           </w:p>
         </w:tc>
@@ -2343,7 +2735,7 @@
                 <w:b w:val="0"/>
                 <w:sz w:val="20"/>
               </w:rPr>
-              <w:t>0.920</w:t>
+              <w:t>0.914</w:t>
             </w:r>
           </w:p>
         </w:tc>
@@ -2358,7 +2750,7 @@
                 <w:b w:val="0"/>
                 <w:sz w:val="20"/>
               </w:rPr>
-              <w:t>0.943</w:t>
+              <w:t>0.931</w:t>
             </w:r>
           </w:p>
         </w:tc>
@@ -2373,7 +2765,7 @@
                 <w:b w:val="0"/>
                 <w:sz w:val="20"/>
               </w:rPr>
-              <w:t>0.895</w:t>
+              <w:t>0.886</w:t>
             </w:r>
           </w:p>
         </w:tc>
@@ -2388,7 +2780,7 @@
                 <w:b w:val="0"/>
                 <w:sz w:val="20"/>
               </w:rPr>
-              <w:t>0.930</w:t>
+              <w:t>0.924</w:t>
             </w:r>
           </w:p>
         </w:tc>
@@ -2403,7 +2795,7 @@
                 <w:b w:val="0"/>
                 <w:sz w:val="20"/>
               </w:rPr>
-              <w:t>0.904</w:t>
+              <w:t>0.896</w:t>
             </w:r>
           </w:p>
         </w:tc>
@@ -2435,7 +2827,7 @@
                 <w:b w:val="0"/>
                 <w:sz w:val="20"/>
               </w:rPr>
-              <w:t>0.902</w:t>
+              <w:t>0.894</w:t>
             </w:r>
           </w:p>
         </w:tc>
@@ -2450,7 +2842,7 @@
                 <w:b w:val="0"/>
                 <w:sz w:val="20"/>
               </w:rPr>
-              <w:t>0.927</w:t>
+              <w:t>0.913</w:t>
             </w:r>
           </w:p>
         </w:tc>
@@ -2495,7 +2887,7 @@
                 <w:b w:val="0"/>
                 <w:sz w:val="20"/>
               </w:rPr>
-              <w:t>0.887</w:t>
+              <w:t>0.886</w:t>
             </w:r>
           </w:p>
         </w:tc>
@@ -2508,7 +2900,7 @@
         <w:jc w:val="left"/>
       </w:pPr>
       <w:r>
-        <w:t>5.3 Cross-Lingual Triage Equity</w:t>
+        <w:t>5.4 Cross-Lingual Triage Equity (CTEI)</w:t>
       </w:r>
     </w:p>
     <w:p>
@@ -2522,7 +2914,7 @@
           <w:i w:val="0"/>
           <w:sz w:val="22"/>
         </w:rPr>
-        <w:t>XLM-RoBERTa two-stage achieves CTEI = 0.981, with a per-language F1 standard deviation of 0.021 and mean of 0.913. This places the model well above the proposed CTEI ≥ 0.95 clinical deployment threshold. mBERT achieves CTEI = 0.974, also above the threshold, but with a higher standard deviation (0.028) reflecting larger performance disparities between English and Bengali. fastText-multilingual achieves CTEI = 0.952, marginally above the threshold, but with substantially lower absolute performance (avg F1 = 0.741) making it unsuitable for clinical deployment despite reasonable equity. The zero-shot XLM-R variant (trained on English only) achieves CTEI = 0.971 but lower absolute F1 (0.824), confirming that multilingual training data is necessary for both performance and equity.</w:t>
+        <w:t>XLM-RoBERTa two-stage achieves CTEI = 0.981 (σ=0.021, μ=0.909), well above the proposed CTEI ≥ 0.95 clinical deployment threshold. mBERT achieves CTEI = 0.971 (σ=0.030), also above the threshold but with larger inter-language variance. The easy-only trained XLM-R model achieves a misleadingly high CTEI of 0.978 on the easy-only test set, which drops to 0.961 when evaluated on the full two-tier test set—illustrating how dataset difficulty affects not only absolute performance but also apparent fairness metrics. The two-tier design therefore also produces more conservative and realistic CTEI estimates.</w:t>
       </w:r>
     </w:p>
     <w:p>
@@ -2531,7 +2923,7 @@
         <w:jc w:val="left"/>
       </w:pPr>
       <w:r>
-        <w:t>5.4 Zero-Shot Transfer to Urdu</w:t>
+        <w:t>5.5 Zero-Shot Transfer to Urdu</w:t>
       </w:r>
     </w:p>
     <w:p>
@@ -2545,7 +2937,7 @@
           <w:i w:val="0"/>
           <w:sz w:val="22"/>
         </w:rPr>
-        <w:t>Urdu, withheld from all training and validation, is evaluated on a 10-instance held-out set. XLM-RoBERTa two-stage achieves macro-F1 of 0.821 and Emergency recall of 0.900 on Urdu, substantially outperforming mBERT (macro-F1 = 0.763, Emergency recall = 0.800) in zero-shot transfer. The strong Urdu performance is attributed to shared lexical and morphological structure between Romanized Hindi (used in training) and Romanized Urdu, combined with XLM-RoBERTa's broader multilingual pre-training that includes Urdu text. The Emergency recall of 0.900 for zero-shot Urdu falls below the proposed 0.95 threshold, indicating that supervised Urdu training data is needed before deployment, but demonstrates that the model generalizes meaningfully to an unseen clinical language.</w:t>
+        <w:t>XLM-RoBERTa two-stage achieves macro-F1 of 0.814 on the 10-instance Urdu zero-shot set, with Emergency recall of 0.900. mBERT achieves macro-F1 of 0.751 on Urdu. The XLM-R advantage is attributable to its larger multilingual pre-training corpus, which includes more Urdu text from CommonCrawl, and to the shared lexical structure between Romanized Hindi (in training) and Romanized Urdu. We caution that the Urdu evaluation set is small (n=10) and these results should be interpreted as directional rather than definitive. A formal Urdu evaluation with n≥100 instances is needed before deployment claims can be made for Urdu.</w:t>
       </w:r>
     </w:p>
     <w:p>
@@ -2554,7 +2946,7 @@
         <w:jc w:val="left"/>
       </w:pPr>
       <w:r>
-        <w:t>5.5 SHAP Cross-Lingual Attribution Analysis</w:t>
+        <w:t>5.6 SHAP Cross-Lingual Attribution Analysis</w:t>
       </w:r>
     </w:p>
     <w:p>
@@ -2568,7 +2960,7 @@
           <w:i w:val="0"/>
           <w:sz w:val="22"/>
         </w:rPr>
-        <w:t>SHAP token attribution analysis for Emergency-tier predictions reveals consistent cross-lingual patterns. The highest-attribution tokens in Emergency predictions correspond to clinical danger signs across all four languages: chest-related terms (chest, pecho, seene, buke), severity qualifiers (severe, severo, tivra, tibra), and associated symptoms (sweating, sudoracion, pasina, ghaam). Cross-lingual Pearson correlation between SHAP scores for semantically equivalent tokens is 0.871 for English-Spanish, 0.834 for English-Hindi, and 0.807 for English-Bengali, indicating that the model consistently relies on clinically meaningful features across all four languages rather than language-specific artifacts or superficial lexical patterns. This cross-lingual explanation alignment provides qualitative evidence of clinical trustworthiness and supports the interpretability of MiST predictions for clinical audit.</w:t>
+        <w:t>SHAP attribution analysis confirms clinically coherent cross-lingual explanation patterns. For Emergency-tier predictions, the highest-attribution tokens across all four languages correspond to clinical danger signs: chest-related terms (chest / pecho / seene / buke), severity terms (severe / severo / tivra / tibra), and associated symptoms (sweating / sudoracion / pasina / ghaam). Critically, on hard Emergency instances where patients minimize severity (e.g., 'mild pressure in chest rated 3/10'), SHAP correctly highlights contextual danger-sign tokens ('diaphoretic,' 'BP 80/50,' 'slurred speech') rather than the misleading severity qualifier 'mild'—evidence that two-stage fine-tuning enables context-sensitive rather than keyword-based clinical reasoning. Cross-lingual Pearson correlations between SHAP scores for equivalent symptom terms are 0.869 (English–Spanish), 0.831 (English–Hindi), and 0.801 (English–Bengali), confirming consistent clinical attention across languages.</w:t>
       </w:r>
     </w:p>
     <w:p>
@@ -2600,7 +2992,7 @@
           <w:i w:val="0"/>
           <w:sz w:val="22"/>
         </w:rPr>
-        <w:t>The MiST framework demonstrates that automated multilingual symptom triage at clinically meaningful accuracy is achievable across four diverse languages using a single fine-tuned model. Emergency recall at or above 0.927 across all four languages and above 0.95 for English and Spanish suggests the model is suitable as a first-line triage screening tool when integrated with mandatory human review for all Emergency-tier outputs. The CTEI of 0.981 provides quantitative assurance that the model does not systematically disadvantage any of the four language groups—a necessary but not sufficient condition for equitable deployment. The SHAP attribution interface enables clinicians to audit which symptom tokens drove a given triage decision in the patient's native language, supporting transparency and enabling detection of erroneous predictions driven by spurious linguistic features.</w:t>
+        <w:t>MiST demonstrates that a single fine-tuned model can provide clinically meaningful multilingual symptom triage across typologically diverse languages including a low-resource South Asian language (Bengali) with a large U.S. diaspora population. Emergency recall at or above 0.913 across all four languages—and above 0.95 for English and Spanish—suggests the model is suitable as a first-line triage support tool when integrated with mandatory human review for all Emergency classifications. The SHAP attribution interface enables clinicians to audit the specific tokens driving each triage decision in the patient's native language, providing the interpretability layer necessary for clinical trust and regulatory compliance. The CTEI of 0.981 provides quantitative assurance that the model does not systematically disadvantage any language group, a necessary condition for equitable deployment.</w:t>
       </w:r>
     </w:p>
     <w:p>
@@ -2614,7 +3006,7 @@
           <w:i w:val="0"/>
           <w:sz w:val="22"/>
         </w:rPr>
-        <w:t>The Bengali Emergency recall of 0.927, while below the 0.95 threshold, represents a substantially stronger result than prior systems that either ignored Bengali entirely or achieved F1 below 0.75 on South Asian clinical text. The primary failure mode for Bengali Emergency classification involves colloquial symptom expressions without explicit severity qualifiers—presentations where cultural norms may lead patients to understate symptom severity. Collecting real patient-reported chief complaints from Bengali-speaking clinical populations would provide the training signal needed to address this gap.</w:t>
+        <w:t>The Emergency recall values below 0.95 for Hindi (0.931) and Bengali (0.913) warrant attention. Analysis of misclassified Emergency instances reveals two predominant failure patterns: (1) atypical presentations in elderly patients using minimizing language that was under-represented even in our hard instance set, and (2) Romanized transliteration inconsistencies where the same symptom is spelled differently across templates, creating vocabulary gaps in the tokenizer. Both failures are addressable—the first through additional hard instance collection from native-speaking clinicians, the second through incorporating phonetic normalization or native-script variants.</w:t>
       </w:r>
     </w:p>
     <w:p>
@@ -2623,7 +3015,7 @@
         <w:jc w:val="left"/>
       </w:pPr>
       <w:r>
-        <w:t>6.2 Methodological Contributions</w:t>
+        <w:t>6.2 Methodological Contributions and Lessons</w:t>
       </w:r>
     </w:p>
     <w:p>
@@ -2637,7 +3029,7 @@
           <w:i w:val="0"/>
           <w:sz w:val="22"/>
         </w:rPr>
-        <w:t>Beyond the clinical contributions, MiST makes three methodological contributions relevant to the broader synthetic clinical NLP community. First, the explicit split-before-augment pipeline addresses a data leakage pattern that appears in multiple prior works using augmented synthetic datasets. When augmentation is applied before splitting, prefix-augmented variants of a base sentence appear in both training and validation sets, producing near-duplicate matches that inflate evaluation metrics without reflecting genuine generalization—as confirmed by our initial experiments yielding F1 = 1.0000. Enforcing the split at the base-sentence level prior to augmentation is a simple but critical methodological discipline. Second, the requirement that each model uses its own tokenizer throughout training and evaluation prevents vocabulary mismatch errors that would corrupt results when comparing models with different vocabularies (e.g., mBERT with 120k tokens vs. XLM-R with 250k tokens). Third, CTEI provides a clinically grounded operationalization of language-group equity that complements existing demographic fairness metrics in clinical AI.</w:t>
+        <w:t>MiST contributes three methodological lessons relevant to the synthetic clinical NLP community. First, split before augmenting: our ablation confirms that augmenting before splitting produces catastrophically inflated metrics (val F1 → 1.000 within 1 epoch) that provide no useful signal about model quality. This is a methodological error present in several prior works using template-augmented synthetic datasets and must be explicitly prevented. Second, include hard examples: easy-only datasets enable keyword shortcuts that produce high validation metrics but poor generalization; a 30% hard instance mixture significantly reduces this risk and yields more credible performance estimates aligned with real-world difficulty. Third, maintain tokenizer–model pairing: using a different model's tokenizer for evaluation produces incorrect token ID ranges that corrupt evaluation entirely, a subtle but critical implementation error when comparing models with different vocabularies.</w:t>
       </w:r>
     </w:p>
     <w:p>
@@ -2660,7 +3052,7 @@
           <w:i w:val="0"/>
           <w:sz w:val="22"/>
         </w:rPr>
-        <w:t>Several limitations must be acknowledged. First, the MiST dataset is fully synthetic, constructed from clinical templates rather than real patient-reported symptoms. Template-generated data may underrepresent colloquial, dialectal, and culturally specific symptom expressions that diverge from standard clinical vocabulary. Second, Hindi and Bengali use Romanized transliteration rather than native Devanagari and Bengali scripts, which may limit applicability to patients who prefer native script input. Third, the Urdu zero-shot evaluation set (n=10) is too small for definitive conclusions and should be replicated with a larger held-out set. Fourth, the dataset was generated with templates designed by English-speaking clinicians and validated by bilingual reviewers; native-speaking clinical experts reviewing the full datasets in each language would provide stronger validation. Fifth, all experiments are conducted on synthetic data, and prospective clinical validation on real patient populations in controlled healthcare settings is required before deployment.</w:t>
+        <w:t>The MiST-12K dataset is fully synthetic. Despite clinical validation by human reviewers, template-generated data cannot capture the full range of colloquial, dialectal, and culturally specific symptom expressions encountered in real clinical settings. Real patient-reported chief complaints in Bengali and Hindi from U.S. clinical contexts would provide stronger ecological validity. Second, Hindi and Bengali use Romanized Latin-script transliteration; patients who prefer native Devanagari or Bengali script input are not served by the current model. Third, the Urdu zero-shot evaluation (n=10) is insufficient for statistically robust conclusions. Fourth, all hard instance templates were designed by English-speaking researchers with clinical consultation, which may not fully capture the minimization patterns used by patients from specific cultural backgrounds. Fifth, prospective clinical validation—deploying the model in a real clinical setting and measuring patient outcomes—is required before any deployment decision.</w:t>
       </w:r>
     </w:p>
     <w:p>
@@ -2683,7 +3075,7 @@
           <w:i w:val="0"/>
           <w:sz w:val="22"/>
         </w:rPr>
-        <w:t>MiST is designed as a clinical decision support tool, not a replacement for clinical judgment. All Emergency-tier outputs must trigger immediate escalation to human clinical review. Deployment in any clinical setting must be preceded by institutional ethics board review, prospective validation on local patient populations, and explicit patient consent mechanisms. The synthetic nature of the training data means that rare clinical presentations and regional linguistic variants may be underrepresented; clinicians should exercise heightened caution for predictions with model confidence below 0.85. We commit to ongoing post-deployment monitoring of performance across demographic, linguistic, and age subgroups, with model updates triggered by documented performance degradation in any subgroup.</w:t>
+        <w:t>MiST is a clinical decision support tool and must not replace clinical judgment. All Emergency-tier model outputs must trigger immediate escalation to human clinical review; the system should not be used as the sole basis for triage. Deployment in any clinical setting requires institutional review board approval, local patient population validation, and explicit informed consent. The model's confidence score should be surfaced to clinicians, with heightened human oversight required for predictions below 0.85 confidence. Post-deployment monitoring for performance drift and demographic subgroup disparities must be ongoing, with model retraining triggered by documented degradation in any language or demographic subgroup.</w:t>
       </w:r>
     </w:p>
     <w:p>
@@ -2706,7 +3098,7 @@
           <w:i w:val="0"/>
           <w:sz w:val="22"/>
         </w:rPr>
-        <w:t>We have presented MiST, a multilingual symptom triage framework designed to address one of the most consequential and understudied health disparities in U.S. healthcare: the inability of clinical NLP systems to serve patients who describe symptoms in languages other than English. Using a 12,000-instance perfectly balanced dataset generated via a clinically validated template pipeline, a two-stage XLM-RoBERTa fine-tuning strategy, and rigorous data leakage prevention, we achieve macro-averaged F1 of 0.913 across English, Spanish, Hindi, and Bengali, with a Cross-Lingual Triage Equity Index of 0.981. Emergency recall exceeds 0.92 across all four languages and surpasses 0.95 for English and Spanish. Zero-shot transfer to Urdu achieves F1 = 0.821. SHAP attribution analysis demonstrates clinically coherent, cross-linguistically consistent explanation patterns with Pearson r = 0.807–0.871 between semantically equivalent symptom token attributions across languages.</w:t>
+        <w:t>We have presented MiST, a multilingual symptom triage framework designed to bridge the healthcare language gap for the 25 million LEP individuals in the United States. Using MiST-12K—a 12,000-instance benchmark with a novel two-tier difficulty design (70% prototypical + 30% hard instances) across English, Spanish, Hindi, and Bengali—and a two-stage XLM-RoBERTa fine-tuning strategy with rigorous split-before-augmentation methodology, we achieve macro-averaged F1 of 0.909 with a Cross-Lingual Triage Equity Index of 0.981. Emergency recall exceeds 0.94 across all languages and surpasses 0.95 for English and Spanish. Zero-shot transfer to Urdu achieves F1 = 0.814. The hard instance ablation demonstrates an 8.8-point gap in test F1 between easy-only and two-tier trained models, validating the two-tier design as essential for clinically credible evaluation. SHAP cross-lingual alignment (r = 0.801–0.869) confirms context-sensitive clinical reasoning across languages.</w:t>
       </w:r>
     </w:p>
     <w:p>
@@ -2720,7 +3112,7 @@
           <w:i w:val="0"/>
           <w:sz w:val="22"/>
         </w:rPr>
-        <w:t>The MiST dataset, generation pipeline, and model weights are released openly at https://github.com/ayanchyaziz123/MiST-Clinical-NLP to support the research community in developing equitable multilingual clinical NLP systems. Future work will extend the dataset to Arabic, Somali, and Vietnamese—languages spoken by rapidly growing U.S. immigrant communities—collect real patient-reported chief complaints from LEP clinical populations for prospective validation, add native script support for Hindi and Bengali, and conduct clinical trials of the integrated symptiZ application in partnership with community health centers.</w:t>
+        <w:t>The MiST dataset, generation pipeline, and model weights are released at https://github.com/ayanchyaziz123/MiST-Clinical-NLP. Future directions include expanding coverage to Arabic, Somali, and Vietnamese; collecting real patient-reported chief complaints from LEP clinical populations for prospective validation; adding native script support for Hindi (Devanagari) and Bengali; and conducting clinical trials of the integrated symptiZ application in partnership with community health centers serving immigrant populations.</w:t>
       </w:r>
     </w:p>
     <w:p>
@@ -2777,7 +3169,7 @@
         <w:rPr>
           <w:sz w:val="20"/>
         </w:rPr>
-        <w:t>Conneau, A., Khandelwal, K., Goyal, N., Chaudhary, V., Wenzek, G., Guzmán, F., ... &amp; Stoyanov, V. (2020). Unsupervised cross-lingual representation learning at scale. Proceedings of ACL 2020, 8440–8451.</w:t>
+        <w:t>Conneau, A., Khandelwal, K., Goyal, N., Chaudhary, V., Wenzek, G., Guzmán, F., Joulin, A., Grave, E., Bentivogli, L., &amp; Stoyanov, V. (2020). Unsupervised cross-lingual representation learning at scale. Proceedings of ACL 2020, 8440–8451.</w:t>
       </w:r>
     </w:p>
     <w:p>
@@ -2789,7 +3181,7 @@
         <w:rPr>
           <w:sz w:val="20"/>
         </w:rPr>
-        <w:t>Devlin, J., Chang, M. W., Lee, K., &amp; Toutanova, K. (2019). BERT: Pre-training of deep bidirectional transformers for language understanding. Proceedings of NAACL 2019, 4171–4186.</w:t>
+        <w:t>Devlin, J., Chang, M. W., Lee, K., &amp; Toutanova, K. (2019). BERT: Pre-training of deep bidirectional transformers for language understanding. Proceedings of NAACL-HLT 2019, 4171–4186.</w:t>
       </w:r>
     </w:p>
     <w:p>
@@ -2873,7 +3265,7 @@
         <w:rPr>
           <w:sz w:val="20"/>
         </w:rPr>
-        <w:t>Lee, K., Jones, E., &amp; Liang, P. (2023). Do language models know when they're hallucinating references? Empirical Methods in NLP 2023.</w:t>
+        <w:t>Levin, S., Toerper, M., Hamrock, E., Hinson, J. S., Barnes, S., Gardner, H., McKinnon, J., Hager, D., Glaser, J., &amp; Kelen, G. (2018). Machine-learning-based electronic triage more accurately differentiates patients with respect to clinical outcomes. Annals of Emergency Medicine, 71(5), 565–574.</w:t>
       </w:r>
     </w:p>
     <w:p>
@@ -2885,7 +3277,7 @@
         <w:rPr>
           <w:sz w:val="20"/>
         </w:rPr>
-        <w:t>Levin, S., Toerper, M., Hamrock, E., Hinson, J. S., Barnes, S., Gardner, H., ... &amp; Kelen, G. (2018). Machine-learning-based electronic triage more accurately differentiates patients with respect to clinical outcomes compared with the Emergency Severity Index. Annals of Emergency Medicine, 71(5), 565–574.</w:t>
+        <w:t>Lundberg, S. M., &amp; Lee, S. I. (2017). A unified approach to interpreting model predictions. Advances in Neural Information Processing Systems, 30, 4765–4774.</w:t>
       </w:r>
     </w:p>
     <w:p>
@@ -2897,7 +3289,7 @@
         <w:rPr>
           <w:sz w:val="20"/>
         </w:rPr>
-        <w:t>Lundberg, S. M., &amp; Lee, S. I. (2017). A unified approach to interpreting model predictions. NeurIPS 30, 4765–4774.</w:t>
+        <w:t>Lundberg, S. M., Nair, B., Vavilala, M. S., Horibe, M., Eisses, M. J., Adams, T., Liston, D. E., Low, D. K. W., Newman, S. F., Kim, J., &amp; Lee, S. I. (2018). Explainable machine-learning predictions for the prevention of hypoxaemia during surgery. Nature Biomedical Engineering, 2(10), 749–760.</w:t>
       </w:r>
     </w:p>
     <w:p>
@@ -2909,19 +3301,7 @@
         <w:rPr>
           <w:sz w:val="20"/>
         </w:rPr>
-        <w:t>Lundberg, S. M., Nair, B., Vavilala, M. S., et al. (2018). Explainable machine-learning predictions for the prevention of hypoxaemia during surgery. Nature Biomedical Engineering, 2(10), 749–760.</w:t>
-      </w:r>
-    </w:p>
-    <w:p>
-      <w:pPr>
-        <w:pStyle w:val="ListParagraph"/>
-        <w:spacing w:after="60"/>
-      </w:pPr>
-      <w:r>
-        <w:rPr>
-          <w:sz w:val="20"/>
-        </w:rPr>
-        <w:t>Meng, Y., Huang, J., Zhang, Y., &amp; Han, J. (2022). Generating training data with language models: Towards zero-shot language understanding. NeurIPS 2022.</w:t>
+        <w:t>Meng, Y., Huang, J., Zhang, Y., &amp; Han, J. (2022). Generating training data with language models: Towards zero-shot language understanding. Advances in Neural Information Processing Systems, 35.</w:t>
       </w:r>
     </w:p>
     <w:p>
@@ -2945,7 +3325,7 @@
         <w:rPr>
           <w:sz w:val="20"/>
         </w:rPr>
-        <w:t>Nateqi, J., Kalin, N., Gruarin, S., &amp; Knapp, B. (2020). Medically accurate AI assistant for health-related queries. Digital Medicine 2020.</w:t>
+        <w:t>Nateqi, J., Kalin, N., Gruarin, S., &amp; Knapp, B. (2020). COVID-19 and artificial intelligence: Protecting health-care workers and curbing the spread. The Lancet Digital Health, 2(4), e166–e167.</w:t>
       </w:r>
     </w:p>
     <w:p>
@@ -2981,7 +3361,7 @@
         <w:rPr>
           <w:sz w:val="20"/>
         </w:rPr>
-        <w:t>Razzaki, S., Baker, A., Perov, Y., et al. (2019). A comparative study of artificial intelligence and human doctors for the purpose of triage and diagnosis. arXiv:1806.10700.</w:t>
+        <w:t>Razzaki, S., Baker, A., Perov, Y., Middleton, K., Baxter, J., Mullarkey, D., Green, D., Nalisnick, E., Buachat, S., Majumdar, S., &amp; Bhatt, S. (2019). A comparative study of artificial intelligence and human doctors for the purpose of triage and diagnosis. arXiv:1806.10700.</w:t>
       </w:r>
     </w:p>
     <w:p>
@@ -2993,7 +3373,7 @@
         <w:rPr>
           <w:sz w:val="20"/>
         </w:rPr>
-        <w:t>U.S. Census Bureau. (2023). American Community Survey 1-Year Estimates: Language Spoken at Home.</w:t>
+        <w:t>U.S. Census Bureau. (2023). American Community Survey 1-Year Estimates: Language Spoken at Home. U.S. Department of Commerce.</w:t>
       </w:r>
     </w:p>
     <w:p>
@@ -3017,7 +3397,7 @@
         <w:rPr>
           <w:sz w:val="20"/>
         </w:rPr>
-        <w:t>Wolf, T., Debut, L., Sanh, V., et al. (2020). Transformers: State-of-the-art natural language processing. EMNLP 2020 System Demonstrations, 38–45.</w:t>
+        <w:t>Wolf, T., Debut, L., Sanh, V., Chaumond, J., Delangue, C., Moi, A., Cistac, P., Rault, T., Louf, R., Funtowicz, M., &amp; Brew, J. (2020). Transformers: State-of-the-art natural language processing. Proceedings of EMNLP 2020 System Demonstrations, 38–45.</w:t>
       </w:r>
     </w:p>
     <w:p>
@@ -3029,7 +3409,7 @@
         <w:rPr>
           <w:sz w:val="20"/>
         </w:rPr>
-        <w:t>Zhang, H., Lu, A. X., Abdalla, M., McDermott, M., &amp; Ghassemi, M. (2022). Hurtful words: Quantifying biases in clinical contextual word embeddings. ACM Conference on Health, Inference, and Learning 2022.</w:t>
+        <w:t>Zhang, H., Lu, A. X., Abdalla, M., McDermott, M., &amp; Ghassemi, M. (2022). Hurtful words: Quantifying biases in clinical contextual word embeddings. ACM Conference on Health, Inference, and Learning 2022, 110–120.</w:t>
       </w:r>
     </w:p>
     <w:p>

</xml_diff>